<commit_message>
Make clean migration doc client-ready (title, doc control, exec summary)
Add a title block, document-control table and an executive summary to the
program-by-program migration document, and regenerate the Word file with a
table of contents and widened margins for a client-facing deliverable.

Co-Authored-By: Claude Opus 4.8 <noreply@anthropic.com>
Claude-Session: https://claude.ai/code/session_01Q4LHaHQmBW12fv5735PcEf
</commit_message>
<xml_diff>
--- a/interface/ASRS_TrackWise_Migration_CLEAN.docx
+++ b/interface/ASRS_TrackWise_Migration_CLEAN.docx
@@ -63,25 +63,39 @@
         <w:t xml:space="preserve"> </w:t>
       </w:r>
       <w:r>
-        <w:t xml:space="preserve">for</w:t>
-      </w:r>
-      <w:r>
-        <w:t xml:space="preserve"> </w:t>
-      </w:r>
-      <w:r>
-        <w:t xml:space="preserve">the</w:t>
-      </w:r>
-      <w:r>
-        <w:t xml:space="preserve"> </w:t>
-      </w:r>
-      <w:r>
-        <w:t xml:space="preserve">CPI</w:t>
-      </w:r>
-      <w:r>
-        <w:t xml:space="preserve"> </w:t>
-      </w:r>
-      <w:r>
-        <w:t xml:space="preserve">team</w:t>
+        <w:t xml:space="preserve">(SAP</w:t>
+      </w:r>
+      <w:r>
+        <w:t xml:space="preserve"> </w:t>
+      </w:r>
+      <w:r>
+        <w:t xml:space="preserve">→</w:t>
+      </w:r>
+      <w:r>
+        <w:t xml:space="preserve"> </w:t>
+      </w:r>
+      <w:r>
+        <w:t xml:space="preserve">CPI)</w:t>
+      </w:r>
+    </w:p>
+    <w:p>
+      <w:pPr>
+        <w:pStyle w:val="Date"/>
+      </w:pPr>
+      <w:r>
+        <w:t xml:space="preserve">14</w:t>
+      </w:r>
+      <w:r>
+        <w:t xml:space="preserve"> </w:t>
+      </w:r>
+      <w:r>
+        <w:t xml:space="preserve">July</w:t>
+      </w:r>
+      <w:r>
+        <w:t xml:space="preserve"> </w:t>
+      </w:r>
+      <w:r>
+        <w:t xml:space="preserve">2026</w:t>
       </w:r>
     </w:p>
     <w:sdt>
@@ -110,7 +124,438 @@
         </w:p>
       </w:sdtContent>
     </w:sdt>
-    <w:bookmarkStart w:id="20" w:name="overview"/>
+    <w:bookmarkStart w:id="20" w:name="document-control"/>
+    <w:p>
+      <w:pPr>
+        <w:pStyle w:val="Heading1"/>
+      </w:pPr>
+      <w:r>
+        <w:t xml:space="preserve">Document control</w:t>
+      </w:r>
+    </w:p>
+    <w:tbl>
+      <w:tblPr>
+        <w:tblStyle w:val="Table"/>
+        <w:tblW w:type="pct" w:w="5000"/>
+        <w:tblLook w:firstRow="0" w:lastRow="0" w:firstColumn="0" w:lastColumn="0" w:noHBand="0" w:noVBand="0" w:val="0000"/>
+        <w:jc w:val="start"/>
+      </w:tblPr>
+      <w:tblGrid>
+        <w:gridCol w:w="3960"/>
+        <w:gridCol w:w="3960"/>
+      </w:tblGrid>
+      <w:tr>
+        <w:tc>
+          <w:tcPr/>
+          <w:p>
+            <w:pPr>
+              <w:pStyle w:val="Compact"/>
+              <w:jc w:val="left"/>
+            </w:pPr>
+            <w:r>
+              <w:rPr>
+                <w:bCs/>
+                <w:b/>
+              </w:rPr>
+              <w:t xml:space="preserve">Title</w:t>
+            </w:r>
+          </w:p>
+        </w:tc>
+        <w:tc>
+          <w:tcPr/>
+          <w:p>
+            <w:pPr>
+              <w:pStyle w:val="Compact"/>
+              <w:jc w:val="left"/>
+            </w:pPr>
+            <w:r>
+              <w:t xml:space="preserve">ASRS &amp; TrackWise Interfaces — SQL-to-API Migration</w:t>
+            </w:r>
+          </w:p>
+        </w:tc>
+      </w:tr>
+      <w:tr>
+        <w:tc>
+          <w:tcPr/>
+          <w:p>
+            <w:pPr>
+              <w:pStyle w:val="Compact"/>
+              <w:jc w:val="left"/>
+            </w:pPr>
+            <w:r>
+              <w:rPr>
+                <w:bCs/>
+                <w:b/>
+              </w:rPr>
+              <w:t xml:space="preserve">Purpose</w:t>
+            </w:r>
+          </w:p>
+        </w:tc>
+        <w:tc>
+          <w:tcPr/>
+          <w:p>
+            <w:pPr>
+              <w:pStyle w:val="Compact"/>
+              <w:jc w:val="left"/>
+            </w:pPr>
+            <w:r>
+              <w:t xml:space="preserve">Program-by-program analysis of the existing SAP↔ASRS/TrackWise interfaces and the plan to replace direct database (</w:t>
+            </w:r>
+            <w:r>
+              <w:rPr>
+                <w:rStyle w:val="VerbatimChar"/>
+              </w:rPr>
+              <w:t xml:space="preserve">EXEC SQL</w:t>
+            </w:r>
+            <w:r>
+              <w:t xml:space="preserve">) access with API calls via SAP CPI</w:t>
+            </w:r>
+          </w:p>
+        </w:tc>
+      </w:tr>
+      <w:tr>
+        <w:tc>
+          <w:tcPr/>
+          <w:p>
+            <w:pPr>
+              <w:pStyle w:val="Compact"/>
+              <w:jc w:val="left"/>
+            </w:pPr>
+            <w:r>
+              <w:rPr>
+                <w:bCs/>
+                <w:b/>
+              </w:rPr>
+              <w:t xml:space="preserve">Audience</w:t>
+            </w:r>
+          </w:p>
+        </w:tc>
+        <w:tc>
+          <w:tcPr/>
+          <w:p>
+            <w:pPr>
+              <w:pStyle w:val="Compact"/>
+              <w:jc w:val="left"/>
+            </w:pPr>
+            <w:r>
+              <w:t xml:space="preserve">Client IT / SAP team and CPI (SAP Integration Suite) consultant</w:t>
+            </w:r>
+          </w:p>
+        </w:tc>
+      </w:tr>
+      <w:tr>
+        <w:tc>
+          <w:tcPr/>
+          <w:p>
+            <w:pPr>
+              <w:pStyle w:val="Compact"/>
+              <w:jc w:val="left"/>
+            </w:pPr>
+            <w:r>
+              <w:rPr>
+                <w:bCs/>
+                <w:b/>
+              </w:rPr>
+              <w:t xml:space="preserve">Scope</w:t>
+            </w:r>
+          </w:p>
+        </w:tc>
+        <w:tc>
+          <w:tcPr/>
+          <w:p>
+            <w:pPr>
+              <w:pStyle w:val="Compact"/>
+              <w:jc w:val="left"/>
+            </w:pPr>
+            <w:r>
+              <w:t xml:space="preserve">10 ABAP programs, 3 connection tables, 7 target interfaces</w:t>
+            </w:r>
+          </w:p>
+        </w:tc>
+      </w:tr>
+      <w:tr>
+        <w:tc>
+          <w:tcPr/>
+          <w:p>
+            <w:pPr>
+              <w:pStyle w:val="Compact"/>
+              <w:jc w:val="left"/>
+            </w:pPr>
+            <w:r>
+              <w:rPr>
+                <w:bCs/>
+                <w:b/>
+              </w:rPr>
+              <w:t xml:space="preserve">Status</w:t>
+            </w:r>
+          </w:p>
+        </w:tc>
+        <w:tc>
+          <w:tcPr/>
+          <w:p>
+            <w:pPr>
+              <w:pStyle w:val="Compact"/>
+              <w:jc w:val="left"/>
+            </w:pPr>
+            <w:r>
+              <w:t xml:space="preserve">For review</w:t>
+            </w:r>
+          </w:p>
+        </w:tc>
+      </w:tr>
+      <w:tr>
+        <w:tc>
+          <w:tcPr/>
+          <w:p>
+            <w:pPr>
+              <w:pStyle w:val="Compact"/>
+              <w:jc w:val="left"/>
+            </w:pPr>
+            <w:r>
+              <w:rPr>
+                <w:bCs/>
+                <w:b/>
+              </w:rPr>
+              <w:t xml:space="preserve">Date</w:t>
+            </w:r>
+          </w:p>
+        </w:tc>
+        <w:tc>
+          <w:tcPr/>
+          <w:p>
+            <w:pPr>
+              <w:pStyle w:val="Compact"/>
+              <w:jc w:val="left"/>
+            </w:pPr>
+            <w:r>
+              <w:t xml:space="preserve">14 July 2026</w:t>
+            </w:r>
+          </w:p>
+        </w:tc>
+      </w:tr>
+    </w:tbl>
+    <w:bookmarkEnd w:id="20"/>
+    <w:bookmarkStart w:id="21" w:name="executive-summary"/>
+    <w:p>
+      <w:pPr>
+        <w:pStyle w:val="Heading1"/>
+      </w:pPr>
+      <w:r>
+        <w:t xml:space="preserve">Executive summary</w:t>
+      </w:r>
+    </w:p>
+    <w:p>
+      <w:pPr>
+        <w:pStyle w:val="FirstParagraph"/>
+      </w:pPr>
+      <w:r>
+        <w:t xml:space="preserve">Ten SAP interface programs currently exchange data with two external systems — the</w:t>
+      </w:r>
+      <w:r>
+        <w:t xml:space="preserve"> </w:t>
+      </w:r>
+      <w:r>
+        <w:rPr>
+          <w:bCs/>
+          <w:b/>
+        </w:rPr>
+        <w:t xml:space="preserve">ASRS</w:t>
+      </w:r>
+      <w:r>
+        <w:t xml:space="preserve"> </w:t>
+      </w:r>
+      <w:r>
+        <w:t xml:space="preserve">automated</w:t>
+      </w:r>
+      <w:r>
+        <w:t xml:space="preserve"> </w:t>
+      </w:r>
+      <w:r>
+        <w:t xml:space="preserve">warehouse and the</w:t>
+      </w:r>
+      <w:r>
+        <w:t xml:space="preserve"> </w:t>
+      </w:r>
+      <w:r>
+        <w:rPr>
+          <w:bCs/>
+          <w:b/>
+        </w:rPr>
+        <w:t xml:space="preserve">TrackWise</w:t>
+      </w:r>
+      <w:r>
+        <w:t xml:space="preserve"> </w:t>
+      </w:r>
+      <w:r>
+        <w:t xml:space="preserve">quality system — by opening a</w:t>
+      </w:r>
+      <w:r>
+        <w:t xml:space="preserve"> </w:t>
+      </w:r>
+      <w:r>
+        <w:rPr>
+          <w:bCs/>
+          <w:b/>
+        </w:rPr>
+        <w:t xml:space="preserve">direct connection to those systems’</w:t>
+      </w:r>
+      <w:r>
+        <w:rPr>
+          <w:bCs/>
+          <w:b/>
+        </w:rPr>
+        <w:t xml:space="preserve"> </w:t>
+      </w:r>
+      <w:r>
+        <w:rPr>
+          <w:bCs/>
+          <w:b/>
+        </w:rPr>
+        <w:t xml:space="preserve">Microsoft SQL Server databases</w:t>
+      </w:r>
+      <w:r>
+        <w:t xml:space="preserve"> </w:t>
+      </w:r>
+      <w:r>
+        <w:t xml:space="preserve">and running SQL against them (</w:t>
+      </w:r>
+      <w:r>
+        <w:rPr>
+          <w:rStyle w:val="VerbatimChar"/>
+        </w:rPr>
+        <w:t xml:space="preserve">EXEC SQL</w:t>
+      </w:r>
+      <w:r>
+        <w:t xml:space="preserve">). No API or web service is</w:t>
+      </w:r>
+      <w:r>
+        <w:t xml:space="preserve"> </w:t>
+      </w:r>
+      <w:r>
+        <w:t xml:space="preserve">involved today.</w:t>
+      </w:r>
+    </w:p>
+    <w:p>
+      <w:pPr>
+        <w:pStyle w:val="BodyText"/>
+      </w:pPr>
+      <w:r>
+        <w:t xml:space="preserve">On</w:t>
+      </w:r>
+      <w:r>
+        <w:t xml:space="preserve"> </w:t>
+      </w:r>
+      <w:r>
+        <w:rPr>
+          <w:bCs/>
+          <w:b/>
+        </w:rPr>
+        <w:t xml:space="preserve">S/4HANA this direct-database approach is not permitted</w:t>
+      </w:r>
+      <w:r>
+        <w:t xml:space="preserve">, so each of these database calls must be</w:t>
+      </w:r>
+      <w:r>
+        <w:t xml:space="preserve"> </w:t>
+      </w:r>
+      <w:r>
+        <w:t xml:space="preserve">replaced. The recommended and agreed approach (</w:t>
+      </w:r>
+      <w:r>
+        <w:rPr>
+          <w:bCs/>
+          <w:b/>
+        </w:rPr>
+        <w:t xml:space="preserve">Option A</w:t>
+      </w:r>
+      <w:r>
+        <w:t xml:space="preserve">) is to route them through</w:t>
+      </w:r>
+      <w:r>
+        <w:t xml:space="preserve"> </w:t>
+      </w:r>
+      <w:r>
+        <w:rPr>
+          <w:bCs/>
+          <w:b/>
+        </w:rPr>
+        <w:t xml:space="preserve">SAP CPI (Integration</w:t>
+      </w:r>
+      <w:r>
+        <w:rPr>
+          <w:bCs/>
+          <w:b/>
+        </w:rPr>
+        <w:t xml:space="preserve"> </w:t>
+      </w:r>
+      <w:r>
+        <w:rPr>
+          <w:bCs/>
+          <w:b/>
+        </w:rPr>
+        <w:t xml:space="preserve">Suite)</w:t>
+      </w:r>
+      <w:r>
+        <w:t xml:space="preserve">: SAP calls a CPI interface over HTTPS, and CPI writes to / reads from the</w:t>
+      </w:r>
+      <w:r>
+        <w:t xml:space="preserve"> </w:t>
+      </w:r>
+      <w:r>
+        <w:rPr>
+          <w:bCs/>
+          <w:b/>
+        </w:rPr>
+        <w:t xml:space="preserve">same SQL Server tables</w:t>
+      </w:r>
+      <w:r>
+        <w:t xml:space="preserve"> </w:t>
+      </w:r>
+      <w:r>
+        <w:t xml:space="preserve">using its database (JDBC) adapter. This makes SAP compliant with no change required on the ASRS/TrackWise</w:t>
+      </w:r>
+      <w:r>
+        <w:t xml:space="preserve"> </w:t>
+      </w:r>
+      <w:r>
+        <w:t xml:space="preserve">side.</w:t>
+      </w:r>
+    </w:p>
+    <w:p>
+      <w:pPr>
+        <w:pStyle w:val="BodyText"/>
+      </w:pPr>
+      <w:r>
+        <w:t xml:space="preserve">This document lists,</w:t>
+      </w:r>
+      <w:r>
+        <w:t xml:space="preserve"> </w:t>
+      </w:r>
+      <w:r>
+        <w:rPr>
+          <w:bCs/>
+          <w:b/>
+        </w:rPr>
+        <w:t xml:space="preserve">for each program</w:t>
+      </w:r>
+      <w:r>
+        <w:t xml:space="preserve">: what it does, the SQL it uses (what stays vs. what must be</w:t>
+      </w:r>
+      <w:r>
+        <w:t xml:space="preserve"> </w:t>
+      </w:r>
+      <w:r>
+        <w:t xml:space="preserve">replaced), the SAP tables it reads (with sample data where available), and the structure of each table sent</w:t>
+      </w:r>
+      <w:r>
+        <w:t xml:space="preserve"> </w:t>
+      </w:r>
+      <w:r>
+        <w:t xml:space="preserve">to the external systems — everything the CPI team needs to build the interfaces.</w:t>
+      </w:r>
+    </w:p>
+    <w:bookmarkEnd w:id="21"/>
+    <w:bookmarkStart w:id="22" w:name="overview"/>
     <w:p>
       <w:pPr>
         <w:pStyle w:val="Heading1"/>
@@ -682,8 +1127,8 @@
         </w:pict>
       </w:r>
     </w:p>
-    <w:bookmarkEnd w:id="20"/>
-    <w:bookmarkStart w:id="21" w:name="connection-tables-used-by-all-programs"/>
+    <w:bookmarkEnd w:id="22"/>
+    <w:bookmarkStart w:id="23" w:name="connection-tables-used-by-all-programs"/>
     <w:p>
       <w:pPr>
         <w:pStyle w:val="Heading1"/>
@@ -1984,8 +2429,8 @@
         </w:pict>
       </w:r>
     </w:p>
-    <w:bookmarkEnd w:id="21"/>
-    <w:bookmarkStart w:id="26" w:name="X7b4d22a62be1f71d8003c6191d83d9c9165a765"/>
+    <w:bookmarkEnd w:id="23"/>
+    <w:bookmarkStart w:id="28" w:name="X7b4d22a62be1f71d8003c6191d83d9c9165a765"/>
     <w:p>
       <w:pPr>
         <w:pStyle w:val="Heading1"/>
@@ -2147,7 +2592,7 @@
         <w:t xml:space="preserve">API.</w:t>
       </w:r>
     </w:p>
-    <w:bookmarkStart w:id="22" w:name="what-it-does"/>
+    <w:bookmarkStart w:id="24" w:name="what-it-does"/>
     <w:p>
       <w:pPr>
         <w:pStyle w:val="Heading3"/>
@@ -2307,8 +2752,8 @@
         <w:t xml:space="preserve">.</w:t>
       </w:r>
     </w:p>
-    <w:bookmarkEnd w:id="22"/>
-    <w:bookmarkStart w:id="23" w:name="sql-statements"/>
+    <w:bookmarkEnd w:id="24"/>
+    <w:bookmarkStart w:id="25" w:name="sql-statements"/>
     <w:p>
       <w:pPr>
         <w:pStyle w:val="Heading3"/>
@@ -2453,8 +2898,8 @@
         <w:t xml:space="preserve">EXEC SQL. DISCONNECT :con               ENDEXEC.   "→ removed</w:t>
       </w:r>
     </w:p>
-    <w:bookmarkEnd w:id="23"/>
-    <w:bookmarkStart w:id="24" w:name="tables-the-data-comes-from-sap"/>
+    <w:bookmarkEnd w:id="25"/>
+    <w:bookmarkStart w:id="26" w:name="tables-the-data-comes-from-sap"/>
     <w:p>
       <w:pPr>
         <w:pStyle w:val="Heading3"/>
@@ -2517,8 +2962,8 @@
         <w:t xml:space="preserve">(No sample data provided.)</w:t>
       </w:r>
     </w:p>
-    <w:bookmarkEnd w:id="24"/>
-    <w:bookmarkStart w:id="25" w:name="X4229ba5952021ea8036c403850b8c3a89063969"/>
+    <w:bookmarkEnd w:id="26"/>
+    <w:bookmarkStart w:id="27" w:name="X4229ba5952021ea8036c403850b8c3a89063969"/>
     <w:p>
       <w:pPr>
         <w:pStyle w:val="Heading3"/>
@@ -4494,9 +4939,9 @@
         </w:pict>
       </w:r>
     </w:p>
-    <w:bookmarkEnd w:id="25"/>
-    <w:bookmarkEnd w:id="26"/>
-    <w:bookmarkStart w:id="31" w:name="program-zmm_asrs_sap_interface"/>
+    <w:bookmarkEnd w:id="27"/>
+    <w:bookmarkEnd w:id="28"/>
+    <w:bookmarkStart w:id="33" w:name="program-zmm_asrs_sap_interface"/>
     <w:p>
       <w:pPr>
         <w:pStyle w:val="Heading1"/>
@@ -4505,7 +4950,7 @@
         <w:t xml:space="preserve">4. Program — ZMM_ASRS_SAP_INTERFACE</w:t>
       </w:r>
     </w:p>
-    <w:bookmarkStart w:id="27" w:name="what-it-does-1"/>
+    <w:bookmarkStart w:id="29" w:name="what-it-does-1"/>
     <w:p>
       <w:pPr>
         <w:pStyle w:val="Heading3"/>
@@ -4552,8 +4997,8 @@
         <w:t xml:space="preserve">from the warehouse, then shows an ALV grid (sent / received / processed icons).</w:t>
       </w:r>
     </w:p>
-    <w:bookmarkEnd w:id="27"/>
-    <w:bookmarkStart w:id="28" w:name="sql-statements-1"/>
+    <w:bookmarkEnd w:id="29"/>
+    <w:bookmarkStart w:id="30" w:name="sql-statements-1"/>
     <w:p>
       <w:pPr>
         <w:pStyle w:val="Heading3"/>
@@ -4698,8 +5143,8 @@
         <w:t xml:space="preserve">EXEC SQL. DISCONNECT :con   ENDEXEC.                           "→ removed</w:t>
       </w:r>
     </w:p>
-    <w:bookmarkEnd w:id="28"/>
-    <w:bookmarkStart w:id="29" w:name="tables-the-data-comes-from-sap-1"/>
+    <w:bookmarkEnd w:id="30"/>
+    <w:bookmarkStart w:id="31" w:name="tables-the-data-comes-from-sap-1"/>
     <w:p>
       <w:pPr>
         <w:pStyle w:val="Heading3"/>
@@ -4746,8 +5191,8 @@
         <w:t xml:space="preserve">(§2.1).</w:t>
       </w:r>
     </w:p>
-    <w:bookmarkEnd w:id="29"/>
-    <w:bookmarkStart w:id="30" w:name="X0ab4b6c1b4386e71f88296ea0013737102e12f1"/>
+    <w:bookmarkEnd w:id="31"/>
+    <w:bookmarkStart w:id="32" w:name="X0ab4b6c1b4386e71f88296ea0013737102e12f1"/>
     <w:p>
       <w:pPr>
         <w:pStyle w:val="Heading3"/>
@@ -5025,9 +5470,9 @@
         </w:pict>
       </w:r>
     </w:p>
-    <w:bookmarkEnd w:id="30"/>
-    <w:bookmarkEnd w:id="31"/>
-    <w:bookmarkStart w:id="36" w:name="program-zmdm_ra_trackwise"/>
+    <w:bookmarkEnd w:id="32"/>
+    <w:bookmarkEnd w:id="33"/>
+    <w:bookmarkStart w:id="38" w:name="program-zmdm_ra_trackwise"/>
     <w:p>
       <w:pPr>
         <w:pStyle w:val="Heading1"/>
@@ -5036,7 +5481,7 @@
         <w:t xml:space="preserve">5. Program — ZMDM_RA_TRACKWISE</w:t>
       </w:r>
     </w:p>
-    <w:bookmarkStart w:id="32" w:name="what-it-does-2"/>
+    <w:bookmarkStart w:id="34" w:name="what-it-does-2"/>
     <w:p>
       <w:pPr>
         <w:pStyle w:val="Heading3"/>
@@ -5196,8 +5641,8 @@
         <w:t xml:space="preserve">.</w:t>
       </w:r>
     </w:p>
-    <w:bookmarkEnd w:id="32"/>
-    <w:bookmarkStart w:id="33" w:name="sql-statements-2"/>
+    <w:bookmarkEnd w:id="34"/>
+    <w:bookmarkStart w:id="35" w:name="sql-statements-2"/>
     <w:p>
       <w:pPr>
         <w:pStyle w:val="Heading3"/>
@@ -5306,8 +5751,8 @@
         <w:t xml:space="preserve">EXEC SQL. DISCONNECT :con ENDEXEC.                                  "→ removed</w:t>
       </w:r>
     </w:p>
-    <w:bookmarkEnd w:id="33"/>
-    <w:bookmarkStart w:id="34" w:name="tables-the-data-comes-from-sap-2"/>
+    <w:bookmarkEnd w:id="35"/>
+    <w:bookmarkStart w:id="36" w:name="tables-the-data-comes-from-sap-2"/>
     <w:p>
       <w:pPr>
         <w:pStyle w:val="Heading3"/>
@@ -6182,8 +6627,8 @@
         </w:tc>
       </w:tr>
     </w:tbl>
-    <w:bookmarkEnd w:id="34"/>
-    <w:bookmarkStart w:id="35" w:name="table-being-sent-out-trackwise-mara"/>
+    <w:bookmarkEnd w:id="36"/>
+    <w:bookmarkStart w:id="37" w:name="table-being-sent-out-trackwise-mara"/>
     <w:p>
       <w:pPr>
         <w:pStyle w:val="Heading3"/>
@@ -6333,9 +6778,9 @@
         </w:pict>
       </w:r>
     </w:p>
-    <w:bookmarkEnd w:id="35"/>
-    <w:bookmarkEnd w:id="36"/>
-    <w:bookmarkStart w:id="41" w:name="program-zqm_trackwise-largest"/>
+    <w:bookmarkEnd w:id="37"/>
+    <w:bookmarkEnd w:id="38"/>
+    <w:bookmarkStart w:id="43" w:name="program-zqm_trackwise-largest"/>
     <w:p>
       <w:pPr>
         <w:pStyle w:val="Heading1"/>
@@ -6354,7 +6799,7 @@
         <w:t xml:space="preserve">(largest)</w:t>
       </w:r>
     </w:p>
-    <w:bookmarkStart w:id="37" w:name="what-it-does-3"/>
+    <w:bookmarkStart w:id="39" w:name="what-it-does-3"/>
     <w:p>
       <w:pPr>
         <w:pStyle w:val="Heading3"/>
@@ -6582,8 +7027,8 @@
         <w:t xml:space="preserve">.</w:t>
       </w:r>
     </w:p>
-    <w:bookmarkEnd w:id="37"/>
-    <w:bookmarkStart w:id="38" w:name="sql-statements-3"/>
+    <w:bookmarkEnd w:id="39"/>
+    <w:bookmarkStart w:id="40" w:name="sql-statements-3"/>
     <w:p>
       <w:pPr>
         <w:pStyle w:val="Heading3"/>
@@ -6722,8 +7167,8 @@
         <w:t xml:space="preserve">(The product-detail INSERT appears 8 times for different date combinations — all one API.)</w:t>
       </w:r>
     </w:p>
-    <w:bookmarkEnd w:id="38"/>
-    <w:bookmarkStart w:id="39" w:name="tables-the-data-comes-from-sap-3"/>
+    <w:bookmarkEnd w:id="40"/>
+    <w:bookmarkStart w:id="41" w:name="tables-the-data-comes-from-sap-3"/>
     <w:p>
       <w:pPr>
         <w:pStyle w:val="Heading3"/>
@@ -6813,8 +7258,8 @@
         <w:t xml:space="preserve">— SAP mirror tables; also the payload structure (below).</w:t>
       </w:r>
     </w:p>
-    <w:bookmarkEnd w:id="39"/>
-    <w:bookmarkStart w:id="40" w:name="X671a08e357c043de35ee1019adb46edbc71e348"/>
+    <w:bookmarkEnd w:id="41"/>
+    <w:bookmarkStart w:id="42" w:name="X671a08e357c043de35ee1019adb46edbc71e348"/>
     <w:p>
       <w:pPr>
         <w:pStyle w:val="Heading3"/>
@@ -9029,9 +9474,9 @@
         </w:pict>
       </w:r>
     </w:p>
-    <w:bookmarkEnd w:id="40"/>
-    <w:bookmarkEnd w:id="41"/>
-    <w:bookmarkStart w:id="42" w:name="api-list-for-cpi-summary"/>
+    <w:bookmarkEnd w:id="42"/>
+    <w:bookmarkEnd w:id="43"/>
+    <w:bookmarkStart w:id="44" w:name="api-list-for-cpi-summary"/>
     <w:p>
       <w:pPr>
         <w:pStyle w:val="Heading1"/>
@@ -9624,7 +10069,7 @@
         <w:t xml:space="preserve">client used to call CPI. Everything else in this document is final.</w:t>
       </w:r>
     </w:p>
-    <w:bookmarkEnd w:id="42"/>
+    <w:bookmarkEnd w:id="44"/>
     <w:sectPr/>
     <w:pgMar w:top="1008" w:right="864" w:bottom="1008" w:left="864" w:header="504" w:footer="504" w:gutter="0"/>
   </w:body>

</xml_diff>

<commit_message>
Update migration doc for SAP RISE S/4HANA Private Cloud Edition
Reflect that the target is SAP S/4HANA Private Cloud Edition (RISE with SAP):
- rationale refined to the managed/clean-core PCE context (native-SQL DBCON to
  external DBs not supported there); CPI remains the mandated path.
- add connectivity notes: SAP->CPI via destination/Communication Arrangement
  with if_web_http_client (standard managed ABAP); CPI->SQL Server via Cloud
  Connector / on-premise JDBC.
- close the on-prem-vs-Cloud open point (now confirmed PCE) and regenerate the
  client Word document.

Co-Authored-By: Claude Opus 4.8 <noreply@anthropic.com>
Claude-Session: https://claude.ai/code/session_01Q4LHaHQmBW12fv5735PcEf
</commit_message>
<xml_diff>
--- a/interface/ASRS_TrackWise_Migration_CLEAN.docx
+++ b/interface/ASRS_TrackWise_Migration_CLEAN.docx
@@ -256,6 +256,46 @@
                 <w:bCs/>
                 <w:b/>
               </w:rPr>
+              <w:t xml:space="preserve">Target system</w:t>
+            </w:r>
+          </w:p>
+        </w:tc>
+        <w:tc>
+          <w:tcPr/>
+          <w:p>
+            <w:pPr>
+              <w:pStyle w:val="Compact"/>
+              <w:jc w:val="left"/>
+            </w:pPr>
+            <w:r>
+              <w:t xml:space="preserve">SAP S/4HANA</w:t>
+            </w:r>
+            <w:r>
+              <w:t xml:space="preserve"> </w:t>
+            </w:r>
+            <w:r>
+              <w:rPr>
+                <w:bCs/>
+                <w:b/>
+              </w:rPr>
+              <w:t xml:space="preserve">Private Cloud Edition (RISE with SAP)</w:t>
+            </w:r>
+          </w:p>
+        </w:tc>
+      </w:tr>
+      <w:tr>
+        <w:tc>
+          <w:tcPr/>
+          <w:p>
+            <w:pPr>
+              <w:pStyle w:val="Compact"/>
+              <w:jc w:val="left"/>
+            </w:pPr>
+            <w:r>
+              <w:rPr>
+                <w:bCs/>
+                <w:b/>
+              </w:rPr>
               <w:t xml:space="preserve">Scope</w:t>
             </w:r>
           </w:p>
@@ -440,7 +480,7 @@
         <w:pStyle w:val="BodyText"/>
       </w:pPr>
       <w:r>
-        <w:t xml:space="preserve">On</w:t>
+        <w:t xml:space="preserve">The target landscape is</w:t>
       </w:r>
       <w:r>
         <w:t xml:space="preserve"> </w:t>
@@ -450,26 +490,35 @@
           <w:bCs/>
           <w:b/>
         </w:rPr>
-        <w:t xml:space="preserve">S/4HANA this direct-database approach is not permitted</w:t>
-      </w:r>
-      <w:r>
-        <w:t xml:space="preserve">, so each of these database calls must be</w:t>
-      </w:r>
-      <w:r>
-        <w:t xml:space="preserve"> </w:t>
-      </w:r>
-      <w:r>
-        <w:t xml:space="preserve">replaced. The recommended and agreed approach (</w:t>
+        <w:t xml:space="preserve">SAP S/4HANA Private Cloud Edition (PCE) under RISE with SAP</w:t>
+      </w:r>
+      <w:r>
+        <w:t xml:space="preserve"> </w:t>
+      </w:r>
+      <w:r>
+        <w:t xml:space="preserve">— an SAP-managed</w:t>
+      </w:r>
+      <w:r>
+        <w:t xml:space="preserve"> </w:t>
+      </w:r>
+      <w:r>
+        <w:t xml:space="preserve">system that follows the</w:t>
+      </w:r>
+      <w:r>
+        <w:t xml:space="preserve"> </w:t>
       </w:r>
       <w:r>
         <w:rPr>
           <w:bCs/>
           <w:b/>
         </w:rPr>
-        <w:t xml:space="preserve">Option A</w:t>
-      </w:r>
-      <w:r>
-        <w:t xml:space="preserve">) is to route them through</w:t>
+        <w:t xml:space="preserve">clean-core</w:t>
+      </w:r>
+      <w:r>
+        <w:t xml:space="preserve"> </w:t>
+      </w:r>
+      <w:r>
+        <w:t xml:space="preserve">model. In this managed environment,</w:t>
       </w:r>
       <w:r>
         <w:t xml:space="preserve"> </w:t>
@@ -479,7 +528,7 @@
           <w:bCs/>
           <w:b/>
         </w:rPr>
-        <w:t xml:space="preserve">SAP CPI (Integration</w:t>
+        <w:t xml:space="preserve">native-SQL secondary</w:t>
       </w:r>
       <w:r>
         <w:rPr>
@@ -493,32 +542,168 @@
           <w:bCs/>
           <w:b/>
         </w:rPr>
-        <w:t xml:space="preserve">Suite)</w:t>
-      </w:r>
-      <w:r>
-        <w:t xml:space="preserve">: SAP calls a CPI interface over HTTPS, and CPI writes to / reads from the</w:t>
-      </w:r>
-      <w:r>
-        <w:t xml:space="preserve"> </w:t>
-      </w:r>
-      <w:r>
-        <w:rPr>
+        <w:t xml:space="preserve">connections (</w:t>
+      </w:r>
+      <w:r>
+        <w:rPr>
+          <w:rStyle w:val="VerbatimChar"/>
           <w:bCs/>
           <w:b/>
         </w:rPr>
+        <w:t xml:space="preserve">DBCON</w:t>
+      </w:r>
+      <w:r>
+        <w:rPr>
+          <w:bCs/>
+          <w:b/>
+        </w:rPr>
+        <w:t xml:space="preserve">/</w:t>
+      </w:r>
+      <w:r>
+        <w:rPr>
+          <w:rStyle w:val="VerbatimChar"/>
+          <w:bCs/>
+          <w:b/>
+        </w:rPr>
+        <w:t xml:space="preserve">EXEC SQL</w:t>
+      </w:r>
+      <w:r>
+        <w:rPr>
+          <w:bCs/>
+          <w:b/>
+        </w:rPr>
+        <w:t xml:space="preserve">) to external third-party databases are not part of the supported setup and</w:t>
+      </w:r>
+      <w:r>
+        <w:rPr>
+          <w:bCs/>
+          <w:b/>
+        </w:rPr>
+        <w:t xml:space="preserve"> </w:t>
+      </w:r>
+      <w:r>
+        <w:rPr>
+          <w:bCs/>
+          <w:b/>
+        </w:rPr>
+        <w:t xml:space="preserve">conflict with clean core</w:t>
+      </w:r>
+      <w:r>
+        <w:t xml:space="preserve">, so each of these database calls must be replaced. The recommended and agreed</w:t>
+      </w:r>
+      <w:r>
+        <w:t xml:space="preserve"> </w:t>
+      </w:r>
+      <w:r>
+        <w:t xml:space="preserve">approach (</w:t>
+      </w:r>
+      <w:r>
+        <w:rPr>
+          <w:bCs/>
+          <w:b/>
+        </w:rPr>
+        <w:t xml:space="preserve">Option A</w:t>
+      </w:r>
+      <w:r>
+        <w:t xml:space="preserve">) is to route them through</w:t>
+      </w:r>
+      <w:r>
+        <w:t xml:space="preserve"> </w:t>
+      </w:r>
+      <w:r>
+        <w:rPr>
+          <w:bCs/>
+          <w:b/>
+        </w:rPr>
+        <w:t xml:space="preserve">SAP Integration Suite (CPI)</w:t>
+      </w:r>
+      <w:r>
+        <w:t xml:space="preserve">: SAP calls a CPI interface</w:t>
+      </w:r>
+      <w:r>
+        <w:t xml:space="preserve"> </w:t>
+      </w:r>
+      <w:r>
+        <w:t xml:space="preserve">over HTTPS, and CPI writes to / reads from the</w:t>
+      </w:r>
+      <w:r>
+        <w:t xml:space="preserve"> </w:t>
+      </w:r>
+      <w:r>
+        <w:rPr>
+          <w:bCs/>
+          <w:b/>
+        </w:rPr>
         <w:t xml:space="preserve">same SQL Server tables</w:t>
       </w:r>
       <w:r>
         <w:t xml:space="preserve"> </w:t>
       </w:r>
       <w:r>
-        <w:t xml:space="preserve">using its database (JDBC) adapter. This makes SAP compliant with no change required on the ASRS/TrackWise</w:t>
-      </w:r>
-      <w:r>
-        <w:t xml:space="preserve"> </w:t>
-      </w:r>
-      <w:r>
-        <w:t xml:space="preserve">side.</w:t>
+        <w:t xml:space="preserve">using its database (JDBC) adapter.</w:t>
+      </w:r>
+      <w:r>
+        <w:t xml:space="preserve"> </w:t>
+      </w:r>
+      <w:r>
+        <w:t xml:space="preserve">This makes SAP compliant with</w:t>
+      </w:r>
+      <w:r>
+        <w:t xml:space="preserve"> </w:t>
+      </w:r>
+      <w:r>
+        <w:rPr>
+          <w:bCs/>
+          <w:b/>
+        </w:rPr>
+        <w:t xml:space="preserve">no change required on the ASRS/TrackWise side</w:t>
+      </w:r>
+      <w:r>
+        <w:t xml:space="preserve">.</w:t>
+      </w:r>
+    </w:p>
+    <w:p>
+      <w:pPr>
+        <w:pStyle w:val="BodyText"/>
+      </w:pPr>
+      <w:r>
+        <w:t xml:space="preserve">Because PCE is the S/4HANA on-premise stack (delivered as a managed private cloud), the</w:t>
+      </w:r>
+      <w:r>
+        <w:t xml:space="preserve"> </w:t>
+      </w:r>
+      <w:r>
+        <w:rPr>
+          <w:bCs/>
+          <w:b/>
+        </w:rPr>
+        <w:t xml:space="preserve">SAP-side outbound</w:t>
+      </w:r>
+      <w:r>
+        <w:rPr>
+          <w:bCs/>
+          <w:b/>
+        </w:rPr>
+        <w:t xml:space="preserve"> </w:t>
+      </w:r>
+      <w:r>
+        <w:rPr>
+          <w:bCs/>
+          <w:b/>
+        </w:rPr>
+        <w:t xml:space="preserve">call is standard, supported ABAP</w:t>
+      </w:r>
+      <w:r>
+        <w:t xml:space="preserve"> </w:t>
+      </w:r>
+      <w:r>
+        <w:t xml:space="preserve">— an HTTP(S) call through a configured destination — so no Public-Cloud</w:t>
+      </w:r>
+      <w:r>
+        <w:t xml:space="preserve"> </w:t>
+      </w:r>
+      <w:r>
+        <w:t xml:space="preserve">development restrictions apply to building the consumer programs.</w:t>
       </w:r>
     </w:p>
     <w:p>
@@ -718,13 +903,53 @@
         <w:t xml:space="preserve"> </w:t>
       </w:r>
       <w:r>
-        <w:t xml:space="preserve">on S/4HANA a program may not open a direct connection to a foreign database and run SQL against</w:t>
-      </w:r>
-      <w:r>
-        <w:t xml:space="preserve"> </w:t>
-      </w:r>
-      <w:r>
-        <w:t xml:space="preserve">it. So</w:t>
+        <w:t xml:space="preserve">the target system is</w:t>
+      </w:r>
+      <w:r>
+        <w:t xml:space="preserve"> </w:t>
+      </w:r>
+      <w:r>
+        <w:rPr>
+          <w:bCs/>
+          <w:b/>
+        </w:rPr>
+        <w:t xml:space="preserve">SAP S/4HANA Private Cloud Edition (RISE with SAP)</w:t>
+      </w:r>
+      <w:r>
+        <w:t xml:space="preserve"> </w:t>
+      </w:r>
+      <w:r>
+        <w:t xml:space="preserve">— SAP-managed and</w:t>
+      </w:r>
+      <w:r>
+        <w:t xml:space="preserve"> </w:t>
+      </w:r>
+      <w:r>
+        <w:t xml:space="preserve">clean-core. Native-SQL secondary connections (</w:t>
+      </w:r>
+      <w:r>
+        <w:rPr>
+          <w:rStyle w:val="VerbatimChar"/>
+        </w:rPr>
+        <w:t xml:space="preserve">DBCON</w:t>
+      </w:r>
+      <w:r>
+        <w:t xml:space="preserve">/</w:t>
+      </w:r>
+      <w:r>
+        <w:rPr>
+          <w:rStyle w:val="VerbatimChar"/>
+        </w:rPr>
+        <w:t xml:space="preserve">EXEC SQL</w:t>
+      </w:r>
+      <w:r>
+        <w:t xml:space="preserve">) to external third-party databases are not</w:t>
+      </w:r>
+      <w:r>
+        <w:t xml:space="preserve"> </w:t>
+      </w:r>
+      <w:r>
+        <w:t xml:space="preserve">supported in this managed landscape and are contrary to clean core. So</w:t>
       </w:r>
       <w:r>
         <w:t xml:space="preserve"> </w:t>
@@ -763,7 +988,21 @@
           <w:bCs/>
           <w:b/>
         </w:rPr>
-        <w:t xml:space="preserve">block must be removed</w:t>
+        <w:t xml:space="preserve">block must be</w:t>
+      </w:r>
+      <w:r>
+        <w:rPr>
+          <w:bCs/>
+          <w:b/>
+        </w:rPr>
+        <w:t xml:space="preserve"> </w:t>
+      </w:r>
+      <w:r>
+        <w:rPr>
+          <w:bCs/>
+          <w:b/>
+        </w:rPr>
+        <w:t xml:space="preserve">removed</w:t>
       </w:r>
       <w:r>
         <w:t xml:space="preserve"> </w:t>
@@ -892,6 +1131,153 @@
     <w:p>
       <w:pPr>
         <w:pStyle w:val="BodyText"/>
+      </w:pPr>
+      <w:r>
+        <w:rPr>
+          <w:bCs/>
+          <w:b/>
+        </w:rPr>
+        <w:t xml:space="preserve">Connectivity notes (RISE PCE):</w:t>
+      </w:r>
+    </w:p>
+    <w:p>
+      <w:pPr>
+        <w:numPr>
+          <w:ilvl w:val="0"/>
+          <w:numId w:val="1002"/>
+        </w:numPr>
+        <w:pStyle w:val="Compact"/>
+      </w:pPr>
+      <w:r>
+        <w:rPr>
+          <w:bCs/>
+          <w:b/>
+        </w:rPr>
+        <w:t xml:space="preserve">SAP → CPI:</w:t>
+      </w:r>
+      <w:r>
+        <w:t xml:space="preserve"> </w:t>
+      </w:r>
+      <w:r>
+        <w:t xml:space="preserve">the ABAP programs call CPI over HTTPS through a configured</w:t>
+      </w:r>
+      <w:r>
+        <w:t xml:space="preserve"> </w:t>
+      </w:r>
+      <w:r>
+        <w:rPr>
+          <w:bCs/>
+          <w:b/>
+        </w:rPr>
+        <w:t xml:space="preserve">destination / Communication</w:t>
+      </w:r>
+      <w:r>
+        <w:rPr>
+          <w:bCs/>
+          <w:b/>
+        </w:rPr>
+        <w:t xml:space="preserve"> </w:t>
+      </w:r>
+      <w:r>
+        <w:rPr>
+          <w:bCs/>
+          <w:b/>
+        </w:rPr>
+        <w:t xml:space="preserve">Arrangement</w:t>
+      </w:r>
+      <w:r>
+        <w:t xml:space="preserve">. On PCE this uses the standard ABAP HTTP client (recommended:</w:t>
+      </w:r>
+      <w:r>
+        <w:t xml:space="preserve"> </w:t>
+      </w:r>
+      <w:r>
+        <w:rPr>
+          <w:rStyle w:val="VerbatimChar"/>
+        </w:rPr>
+        <w:t xml:space="preserve">if_web_http_client</w:t>
+      </w:r>
+      <w:r>
+        <w:t xml:space="preserve"> </w:t>
+      </w:r>
+      <w:r>
+        <w:t xml:space="preserve">with a</w:t>
+      </w:r>
+      <w:r>
+        <w:t xml:space="preserve"> </w:t>
+      </w:r>
+      <w:r>
+        <w:t xml:space="preserve">destination) — fully supported managed ABAP.</w:t>
+      </w:r>
+    </w:p>
+    <w:p>
+      <w:pPr>
+        <w:numPr>
+          <w:ilvl w:val="0"/>
+          <w:numId w:val="1002"/>
+        </w:numPr>
+        <w:pStyle w:val="Compact"/>
+      </w:pPr>
+      <w:r>
+        <w:rPr>
+          <w:bCs/>
+          <w:b/>
+        </w:rPr>
+        <w:t xml:space="preserve">CPI → SQL Server:</w:t>
+      </w:r>
+      <w:r>
+        <w:t xml:space="preserve"> </w:t>
+      </w:r>
+      <w:r>
+        <w:t xml:space="preserve">the ASRS/TrackWise SQL Servers sit on plant/on-premise networks</w:t>
+      </w:r>
+      <w:r>
+        <w:t xml:space="preserve"> </w:t>
+      </w:r>
+      <w:r>
+        <w:t xml:space="preserve">(e.g. </w:t>
+      </w:r>
+      <w:r>
+        <w:rPr>
+          <w:rStyle w:val="VerbatimChar"/>
+        </w:rPr>
+        <w:t xml:space="preserve">172.18.11.120</w:t>
+      </w:r>
+      <w:r>
+        <w:t xml:space="preserve">,</w:t>
+      </w:r>
+      <w:r>
+        <w:t xml:space="preserve"> </w:t>
+      </w:r>
+      <w:r>
+        <w:rPr>
+          <w:rStyle w:val="VerbatimChar"/>
+        </w:rPr>
+        <w:t xml:space="preserve">10.27.1.27</w:t>
+      </w:r>
+      <w:r>
+        <w:t xml:space="preserve">), so CPI reaches them via the</w:t>
+      </w:r>
+      <w:r>
+        <w:t xml:space="preserve"> </w:t>
+      </w:r>
+      <w:r>
+        <w:rPr>
+          <w:bCs/>
+          <w:b/>
+        </w:rPr>
+        <w:t xml:space="preserve">SAP Cloud Connector / on-premise JDBC</w:t>
+      </w:r>
+      <w:r>
+        <w:t xml:space="preserve"> </w:t>
+      </w:r>
+      <w:r>
+        <w:t xml:space="preserve">connectivity. This is CPI-side configuration and needs no SAP application change.</w:t>
+      </w:r>
+    </w:p>
+    <w:p>
+      <w:pPr>
+        <w:pStyle w:val="FirstParagraph"/>
       </w:pPr>
       <w:r>
         <w:rPr>
@@ -2605,7 +2991,7 @@
       <w:pPr>
         <w:numPr>
           <w:ilvl w:val="0"/>
-          <w:numId w:val="1002"/>
+          <w:numId w:val="1003"/>
         </w:numPr>
         <w:pStyle w:val="Compact"/>
       </w:pPr>
@@ -2624,288 +3010,6 @@
       </w:r>
       <w:r>
         <w:t xml:space="preserve">.</w:t>
-      </w:r>
-    </w:p>
-    <w:p>
-      <w:pPr>
-        <w:numPr>
-          <w:ilvl w:val="0"/>
-          <w:numId w:val="1002"/>
-        </w:numPr>
-        <w:pStyle w:val="Compact"/>
-      </w:pPr>
-      <w:r>
-        <w:t xml:space="preserve">Reads pending messages from</w:t>
-      </w:r>
-      <w:r>
-        <w:t xml:space="preserve"> </w:t>
-      </w:r>
-      <w:r>
-        <w:rPr>
-          <w:bCs/>
-          <w:b/>
-        </w:rPr>
-        <w:t xml:space="preserve">ZMM_ASRS</w:t>
-      </w:r>
-      <w:r>
-        <w:t xml:space="preserve"> </w:t>
-      </w:r>
-      <w:r>
-        <w:t xml:space="preserve">(</w:t>
-      </w:r>
-      <w:r>
-        <w:rPr>
-          <w:rStyle w:val="VerbatimChar"/>
-        </w:rPr>
-        <w:t xml:space="preserve">trf_status = 'N'</w:t>
-      </w:r>
-      <w:r>
-        <w:t xml:space="preserve">, of the requested transaction type).</w:t>
-      </w:r>
-    </w:p>
-    <w:p>
-      <w:pPr>
-        <w:numPr>
-          <w:ilvl w:val="0"/>
-          <w:numId w:val="1002"/>
-        </w:numPr>
-        <w:pStyle w:val="Compact"/>
-      </w:pPr>
-      <w:r>
-        <w:t xml:space="preserve">Connects to the plant’s external ASRS database.</w:t>
-      </w:r>
-    </w:p>
-    <w:p>
-      <w:pPr>
-        <w:numPr>
-          <w:ilvl w:val="0"/>
-          <w:numId w:val="1002"/>
-        </w:numPr>
-        <w:pStyle w:val="Compact"/>
-      </w:pPr>
-      <w:r>
-        <w:t xml:space="preserve">For each message,</w:t>
-      </w:r>
-      <w:r>
-        <w:t xml:space="preserve"> </w:t>
-      </w:r>
-      <w:r>
-        <w:rPr>
-          <w:bCs/>
-          <w:b/>
-        </w:rPr>
-        <w:t xml:space="preserve">inserts a row into the external</w:t>
-      </w:r>
-      <w:r>
-        <w:rPr>
-          <w:bCs/>
-          <w:b/>
-        </w:rPr>
-        <w:t xml:space="preserve"> </w:t>
-      </w:r>
-      <w:r>
-        <w:rPr>
-          <w:rStyle w:val="VerbatimChar"/>
-          <w:bCs/>
-          <w:b/>
-        </w:rPr>
-        <w:t xml:space="preserve">HOST_TO_WMS</w:t>
-      </w:r>
-      <w:r>
-        <w:t xml:space="preserve"> </w:t>
-      </w:r>
-      <w:r>
-        <w:t xml:space="preserve">table (the WMS inbound queue).</w:t>
-      </w:r>
-    </w:p>
-    <w:p>
-      <w:pPr>
-        <w:numPr>
-          <w:ilvl w:val="0"/>
-          <w:numId w:val="1002"/>
-        </w:numPr>
-        <w:pStyle w:val="Compact"/>
-      </w:pPr>
-      <w:r>
-        <w:t xml:space="preserve">Marks the message as sent (</w:t>
-      </w:r>
-      <w:r>
-        <w:rPr>
-          <w:rStyle w:val="VerbatimChar"/>
-        </w:rPr>
-        <w:t xml:space="preserve">trf_status = 'Y'</w:t>
-      </w:r>
-      <w:r>
-        <w:t xml:space="preserve">) back in</w:t>
-      </w:r>
-      <w:r>
-        <w:t xml:space="preserve"> </w:t>
-      </w:r>
-      <w:r>
-        <w:rPr>
-          <w:bCs/>
-          <w:b/>
-        </w:rPr>
-        <w:t xml:space="preserve">ZMM_ASRS</w:t>
-      </w:r>
-      <w:r>
-        <w:t xml:space="preserve">.</w:t>
-      </w:r>
-    </w:p>
-    <w:bookmarkEnd w:id="24"/>
-    <w:bookmarkStart w:id="25" w:name="sql-statements"/>
-    <w:p>
-      <w:pPr>
-        <w:pStyle w:val="Heading3"/>
-      </w:pPr>
-      <w:r>
-        <w:t xml:space="preserve">3.2 SQL statements</w:t>
-      </w:r>
-    </w:p>
-    <w:p>
-      <w:pPr>
-        <w:pStyle w:val="FirstParagraph"/>
-      </w:pPr>
-      <w:r>
-        <w:rPr>
-          <w:iCs/>
-          <w:i/>
-        </w:rPr>
-        <w:t xml:space="preserve">Keep (Open SQL on SAP tables):</w:t>
-      </w:r>
-    </w:p>
-    <w:p>
-      <w:pPr>
-        <w:pStyle w:val="SourceCode"/>
-      </w:pPr>
-      <w:r>
-        <w:rPr>
-          <w:rStyle w:val="VerbatimChar"/>
-        </w:rPr>
-        <w:t xml:space="preserve">SELECT * FROM zmm_dbcon_asrs INTO TABLE gt_con.                       "connection config</w:t>
-      </w:r>
-      <w:r>
-        <w:br/>
-      </w:r>
-      <w:r>
-        <w:rPr>
-          <w:rStyle w:val="VerbatimChar"/>
-        </w:rPr>
-        <w:t xml:space="preserve">SELECT * FROM zmm_asrs INTO CORRESPONDING FIELDS OF TABLE gt_asrs</w:t>
-      </w:r>
-      <w:r>
-        <w:br/>
-      </w:r>
-      <w:r>
-        <w:rPr>
-          <w:rStyle w:val="VerbatimChar"/>
-        </w:rPr>
-        <w:t xml:space="preserve">        WHERE msg_trans_type IN s_type AND trf_status = 'N'.          "pending messages</w:t>
-      </w:r>
-      <w:r>
-        <w:br/>
-      </w:r>
-      <w:r>
-        <w:rPr>
-          <w:rStyle w:val="VerbatimChar"/>
-        </w:rPr>
-        <w:t xml:space="preserve">MODIFY zmm_asrs FROM TABLE gt_asrs.                                   "write back status 'Y'</w:t>
-      </w:r>
-    </w:p>
-    <w:p>
-      <w:pPr>
-        <w:pStyle w:val="FirstParagraph"/>
-      </w:pPr>
-      <w:r>
-        <w:rPr>
-          <w:iCs/>
-          <w:i/>
-        </w:rPr>
-        <w:t xml:space="preserve">Replace (Native SQL → API C-1):</w:t>
-      </w:r>
-    </w:p>
-    <w:p>
-      <w:pPr>
-        <w:pStyle w:val="SourceCode"/>
-      </w:pPr>
-      <w:r>
-        <w:rPr>
-          <w:rStyle w:val="VerbatimChar"/>
-        </w:rPr>
-        <w:t xml:space="preserve">EXEC SQL. CONNECT TO :gs_con-DBCON      ENDEXEC.   "→ removed (CPI JDBC data-source)</w:t>
-      </w:r>
-      <w:r>
-        <w:br/>
-      </w:r>
-      <w:r>
-        <w:rPr>
-          <w:rStyle w:val="VerbatimChar"/>
-        </w:rPr>
-        <w:t xml:space="preserve">EXEC SQL. SET CONNECTION :gs_con-DBCON  ENDEXEC.   "→ removed</w:t>
-      </w:r>
-      <w:r>
-        <w:br/>
-      </w:r>
-      <w:r>
-        <w:rPr>
-          <w:rStyle w:val="VerbatimChar"/>
-        </w:rPr>
-        <w:t xml:space="preserve">EXEC SQL. GET CONNECTION :CON           ENDEXEC.   "→ removed</w:t>
-      </w:r>
-      <w:r>
-        <w:br/>
-      </w:r>
-      <w:r>
-        <w:rPr>
-          <w:rStyle w:val="VerbatimChar"/>
-        </w:rPr>
-        <w:t xml:space="preserve">EXEC SQL.                                          "→ POST to CPI: ASRS Push Message</w:t>
-      </w:r>
-      <w:r>
-        <w:br/>
-      </w:r>
-      <w:r>
-        <w:rPr>
-          <w:rStyle w:val="VerbatimChar"/>
-        </w:rPr>
-        <w:t xml:space="preserve">  INSERT INTO host_to_wms ( MSG_SRC, MSG_REC_ID, … 29 columns … )</w:t>
-      </w:r>
-      <w:r>
-        <w:br/>
-      </w:r>
-      <w:r>
-        <w:rPr>
-          <w:rStyle w:val="VerbatimChar"/>
-        </w:rPr>
-        <w:t xml:space="preserve">  VALUES ( :gs_asrs-MSG_SRC, :gs_asrs-MSG_REC_ID, … )</w:t>
-      </w:r>
-      <w:r>
-        <w:br/>
-      </w:r>
-      <w:r>
-        <w:rPr>
-          <w:rStyle w:val="VerbatimChar"/>
-        </w:rPr>
-        <w:t xml:space="preserve">ENDEXEC.</w:t>
-      </w:r>
-      <w:r>
-        <w:br/>
-      </w:r>
-      <w:r>
-        <w:rPr>
-          <w:rStyle w:val="VerbatimChar"/>
-        </w:rPr>
-        <w:t xml:space="preserve">EXEC SQL. DISCONNECT :con               ENDEXEC.   "→ removed</w:t>
-      </w:r>
-    </w:p>
-    <w:bookmarkEnd w:id="25"/>
-    <w:bookmarkStart w:id="26" w:name="tables-the-data-comes-from-sap"/>
-    <w:p>
-      <w:pPr>
-        <w:pStyle w:val="Heading3"/>
-      </w:pPr>
-      <w:r>
-        <w:t xml:space="preserve">3.3 Tables the data comes from (SAP)</w:t>
       </w:r>
     </w:p>
     <w:p>
@@ -2917,17 +3021,32 @@
         <w:pStyle w:val="Compact"/>
       </w:pPr>
       <w:r>
+        <w:t xml:space="preserve">Reads pending messages from</w:t>
+      </w:r>
+      <w:r>
+        <w:t xml:space="preserve"> </w:t>
+      </w:r>
+      <w:r>
         <w:rPr>
           <w:bCs/>
           <w:b/>
         </w:rPr>
-        <w:t xml:space="preserve">ZMM_DBCON_ASRS</w:t>
-      </w:r>
-      <w:r>
-        <w:t xml:space="preserve"> </w:t>
-      </w:r>
-      <w:r>
-        <w:t xml:space="preserve">— see §2.1 (+ data).</w:t>
+        <w:t xml:space="preserve">ZMM_ASRS</w:t>
+      </w:r>
+      <w:r>
+        <w:t xml:space="preserve"> </w:t>
+      </w:r>
+      <w:r>
+        <w:t xml:space="preserve">(</w:t>
+      </w:r>
+      <w:r>
+        <w:rPr>
+          <w:rStyle w:val="VerbatimChar"/>
+        </w:rPr>
+        <w:t xml:space="preserve">trf_status = 'N'</w:t>
+      </w:r>
+      <w:r>
+        <w:t xml:space="preserve">, of the requested transaction type).</w:t>
       </w:r>
     </w:p>
     <w:p>
@@ -2935,6 +3054,273 @@
         <w:numPr>
           <w:ilvl w:val="0"/>
           <w:numId w:val="1003"/>
+        </w:numPr>
+        <w:pStyle w:val="Compact"/>
+      </w:pPr>
+      <w:r>
+        <w:t xml:space="preserve">Connects to the plant’s external ASRS database.</w:t>
+      </w:r>
+    </w:p>
+    <w:p>
+      <w:pPr>
+        <w:numPr>
+          <w:ilvl w:val="0"/>
+          <w:numId w:val="1003"/>
+        </w:numPr>
+        <w:pStyle w:val="Compact"/>
+      </w:pPr>
+      <w:r>
+        <w:t xml:space="preserve">For each message,</w:t>
+      </w:r>
+      <w:r>
+        <w:t xml:space="preserve"> </w:t>
+      </w:r>
+      <w:r>
+        <w:rPr>
+          <w:bCs/>
+          <w:b/>
+        </w:rPr>
+        <w:t xml:space="preserve">inserts a row into the external</w:t>
+      </w:r>
+      <w:r>
+        <w:rPr>
+          <w:bCs/>
+          <w:b/>
+        </w:rPr>
+        <w:t xml:space="preserve"> </w:t>
+      </w:r>
+      <w:r>
+        <w:rPr>
+          <w:rStyle w:val="VerbatimChar"/>
+          <w:bCs/>
+          <w:b/>
+        </w:rPr>
+        <w:t xml:space="preserve">HOST_TO_WMS</w:t>
+      </w:r>
+      <w:r>
+        <w:t xml:space="preserve"> </w:t>
+      </w:r>
+      <w:r>
+        <w:t xml:space="preserve">table (the WMS inbound queue).</w:t>
+      </w:r>
+    </w:p>
+    <w:p>
+      <w:pPr>
+        <w:numPr>
+          <w:ilvl w:val="0"/>
+          <w:numId w:val="1003"/>
+        </w:numPr>
+        <w:pStyle w:val="Compact"/>
+      </w:pPr>
+      <w:r>
+        <w:t xml:space="preserve">Marks the message as sent (</w:t>
+      </w:r>
+      <w:r>
+        <w:rPr>
+          <w:rStyle w:val="VerbatimChar"/>
+        </w:rPr>
+        <w:t xml:space="preserve">trf_status = 'Y'</w:t>
+      </w:r>
+      <w:r>
+        <w:t xml:space="preserve">) back in</w:t>
+      </w:r>
+      <w:r>
+        <w:t xml:space="preserve"> </w:t>
+      </w:r>
+      <w:r>
+        <w:rPr>
+          <w:bCs/>
+          <w:b/>
+        </w:rPr>
+        <w:t xml:space="preserve">ZMM_ASRS</w:t>
+      </w:r>
+      <w:r>
+        <w:t xml:space="preserve">.</w:t>
+      </w:r>
+    </w:p>
+    <w:bookmarkEnd w:id="24"/>
+    <w:bookmarkStart w:id="25" w:name="sql-statements"/>
+    <w:p>
+      <w:pPr>
+        <w:pStyle w:val="Heading3"/>
+      </w:pPr>
+      <w:r>
+        <w:t xml:space="preserve">3.2 SQL statements</w:t>
+      </w:r>
+    </w:p>
+    <w:p>
+      <w:pPr>
+        <w:pStyle w:val="FirstParagraph"/>
+      </w:pPr>
+      <w:r>
+        <w:rPr>
+          <w:iCs/>
+          <w:i/>
+        </w:rPr>
+        <w:t xml:space="preserve">Keep (Open SQL on SAP tables):</w:t>
+      </w:r>
+    </w:p>
+    <w:p>
+      <w:pPr>
+        <w:pStyle w:val="SourceCode"/>
+      </w:pPr>
+      <w:r>
+        <w:rPr>
+          <w:rStyle w:val="VerbatimChar"/>
+        </w:rPr>
+        <w:t xml:space="preserve">SELECT * FROM zmm_dbcon_asrs INTO TABLE gt_con.                       "connection config</w:t>
+      </w:r>
+      <w:r>
+        <w:br/>
+      </w:r>
+      <w:r>
+        <w:rPr>
+          <w:rStyle w:val="VerbatimChar"/>
+        </w:rPr>
+        <w:t xml:space="preserve">SELECT * FROM zmm_asrs INTO CORRESPONDING FIELDS OF TABLE gt_asrs</w:t>
+      </w:r>
+      <w:r>
+        <w:br/>
+      </w:r>
+      <w:r>
+        <w:rPr>
+          <w:rStyle w:val="VerbatimChar"/>
+        </w:rPr>
+        <w:t xml:space="preserve">        WHERE msg_trans_type IN s_type AND trf_status = 'N'.          "pending messages</w:t>
+      </w:r>
+      <w:r>
+        <w:br/>
+      </w:r>
+      <w:r>
+        <w:rPr>
+          <w:rStyle w:val="VerbatimChar"/>
+        </w:rPr>
+        <w:t xml:space="preserve">MODIFY zmm_asrs FROM TABLE gt_asrs.                                   "write back status 'Y'</w:t>
+      </w:r>
+    </w:p>
+    <w:p>
+      <w:pPr>
+        <w:pStyle w:val="FirstParagraph"/>
+      </w:pPr>
+      <w:r>
+        <w:rPr>
+          <w:iCs/>
+          <w:i/>
+        </w:rPr>
+        <w:t xml:space="preserve">Replace (Native SQL → API C-1):</w:t>
+      </w:r>
+    </w:p>
+    <w:p>
+      <w:pPr>
+        <w:pStyle w:val="SourceCode"/>
+      </w:pPr>
+      <w:r>
+        <w:rPr>
+          <w:rStyle w:val="VerbatimChar"/>
+        </w:rPr>
+        <w:t xml:space="preserve">EXEC SQL. CONNECT TO :gs_con-DBCON      ENDEXEC.   "→ removed (CPI JDBC data-source)</w:t>
+      </w:r>
+      <w:r>
+        <w:br/>
+      </w:r>
+      <w:r>
+        <w:rPr>
+          <w:rStyle w:val="VerbatimChar"/>
+        </w:rPr>
+        <w:t xml:space="preserve">EXEC SQL. SET CONNECTION :gs_con-DBCON  ENDEXEC.   "→ removed</w:t>
+      </w:r>
+      <w:r>
+        <w:br/>
+      </w:r>
+      <w:r>
+        <w:rPr>
+          <w:rStyle w:val="VerbatimChar"/>
+        </w:rPr>
+        <w:t xml:space="preserve">EXEC SQL. GET CONNECTION :CON           ENDEXEC.   "→ removed</w:t>
+      </w:r>
+      <w:r>
+        <w:br/>
+      </w:r>
+      <w:r>
+        <w:rPr>
+          <w:rStyle w:val="VerbatimChar"/>
+        </w:rPr>
+        <w:t xml:space="preserve">EXEC SQL.                                          "→ POST to CPI: ASRS Push Message</w:t>
+      </w:r>
+      <w:r>
+        <w:br/>
+      </w:r>
+      <w:r>
+        <w:rPr>
+          <w:rStyle w:val="VerbatimChar"/>
+        </w:rPr>
+        <w:t xml:space="preserve">  INSERT INTO host_to_wms ( MSG_SRC, MSG_REC_ID, … 29 columns … )</w:t>
+      </w:r>
+      <w:r>
+        <w:br/>
+      </w:r>
+      <w:r>
+        <w:rPr>
+          <w:rStyle w:val="VerbatimChar"/>
+        </w:rPr>
+        <w:t xml:space="preserve">  VALUES ( :gs_asrs-MSG_SRC, :gs_asrs-MSG_REC_ID, … )</w:t>
+      </w:r>
+      <w:r>
+        <w:br/>
+      </w:r>
+      <w:r>
+        <w:rPr>
+          <w:rStyle w:val="VerbatimChar"/>
+        </w:rPr>
+        <w:t xml:space="preserve">ENDEXEC.</w:t>
+      </w:r>
+      <w:r>
+        <w:br/>
+      </w:r>
+      <w:r>
+        <w:rPr>
+          <w:rStyle w:val="VerbatimChar"/>
+        </w:rPr>
+        <w:t xml:space="preserve">EXEC SQL. DISCONNECT :con               ENDEXEC.   "→ removed</w:t>
+      </w:r>
+    </w:p>
+    <w:bookmarkEnd w:id="25"/>
+    <w:bookmarkStart w:id="26" w:name="tables-the-data-comes-from-sap"/>
+    <w:p>
+      <w:pPr>
+        <w:pStyle w:val="Heading3"/>
+      </w:pPr>
+      <w:r>
+        <w:t xml:space="preserve">3.3 Tables the data comes from (SAP)</w:t>
+      </w:r>
+    </w:p>
+    <w:p>
+      <w:pPr>
+        <w:numPr>
+          <w:ilvl w:val="0"/>
+          <w:numId w:val="1004"/>
+        </w:numPr>
+        <w:pStyle w:val="Compact"/>
+      </w:pPr>
+      <w:r>
+        <w:rPr>
+          <w:bCs/>
+          <w:b/>
+        </w:rPr>
+        <w:t xml:space="preserve">ZMM_DBCON_ASRS</w:t>
+      </w:r>
+      <w:r>
+        <w:t xml:space="preserve"> </w:t>
+      </w:r>
+      <w:r>
+        <w:t xml:space="preserve">— see §2.1 (+ data).</w:t>
+      </w:r>
+    </w:p>
+    <w:p>
+      <w:pPr>
+        <w:numPr>
+          <w:ilvl w:val="0"/>
+          <w:numId w:val="1004"/>
         </w:numPr>
         <w:pStyle w:val="Compact"/>
       </w:pPr>
@@ -5157,7 +5543,7 @@
       <w:pPr>
         <w:numPr>
           <w:ilvl w:val="0"/>
-          <w:numId w:val="1004"/>
+          <w:numId w:val="1005"/>
         </w:numPr>
         <w:pStyle w:val="Compact"/>
       </w:pPr>
@@ -5494,7 +5880,7 @@
       <w:pPr>
         <w:numPr>
           <w:ilvl w:val="0"/>
-          <w:numId w:val="1005"/>
+          <w:numId w:val="1006"/>
         </w:numPr>
         <w:pStyle w:val="Compact"/>
       </w:pPr>
@@ -5513,252 +5899,6 @@
       </w:r>
       <w:r>
         <w:t xml:space="preserve">.</w:t>
-      </w:r>
-    </w:p>
-    <w:p>
-      <w:pPr>
-        <w:numPr>
-          <w:ilvl w:val="0"/>
-          <w:numId w:val="1005"/>
-        </w:numPr>
-        <w:pStyle w:val="Compact"/>
-      </w:pPr>
-      <w:r>
-        <w:t xml:space="preserve">Reads an exclusion parameter (</w:t>
-      </w:r>
-      <w:r>
-        <w:rPr>
-          <w:rStyle w:val="VerbatimChar"/>
-        </w:rPr>
-        <w:t xml:space="preserve">FIELD1</w:t>
-      </w:r>
-      <w:r>
-        <w:t xml:space="preserve"> </w:t>
-      </w:r>
-      <w:r>
-        <w:t xml:space="preserve">for</w:t>
-      </w:r>
-      <w:r>
-        <w:t xml:space="preserve"> </w:t>
-      </w:r>
-      <w:r>
-        <w:rPr>
-          <w:rStyle w:val="VerbatimChar"/>
-        </w:rPr>
-        <w:t xml:space="preserve">PARAM_TYPE = 'ZZ9'</w:t>
-      </w:r>
-      <w:r>
-        <w:t xml:space="preserve">) from</w:t>
-      </w:r>
-      <w:r>
-        <w:t xml:space="preserve"> </w:t>
-      </w:r>
-      <w:r>
-        <w:rPr>
-          <w:bCs/>
-          <w:b/>
-        </w:rPr>
-        <w:t xml:space="preserve">ZMM_PARAM</w:t>
-      </w:r>
-      <w:r>
-        <w:t xml:space="preserve">.</w:t>
-      </w:r>
-    </w:p>
-    <w:p>
-      <w:pPr>
-        <w:numPr>
-          <w:ilvl w:val="0"/>
-          <w:numId w:val="1005"/>
-        </w:numPr>
-        <w:pStyle w:val="Compact"/>
-      </w:pPr>
-      <w:r>
-        <w:t xml:space="preserve">Selects new API materials from</w:t>
-      </w:r>
-      <w:r>
-        <w:t xml:space="preserve"> </w:t>
-      </w:r>
-      <w:r>
-        <w:rPr>
-          <w:bCs/>
-          <w:b/>
-        </w:rPr>
-        <w:t xml:space="preserve">MARA</w:t>
-      </w:r>
-      <w:r>
-        <w:t xml:space="preserve"> </w:t>
-      </w:r>
-      <w:r>
-        <w:t xml:space="preserve">(</w:t>
-      </w:r>
-      <w:r>
-        <w:rPr>
-          <w:rStyle w:val="VerbatimChar"/>
-        </w:rPr>
-        <w:t xml:space="preserve">MTART = 'ZAPI'</w:t>
-      </w:r>
-      <w:r>
-        <w:t xml:space="preserve">, status not excluded, created-date range).</w:t>
-      </w:r>
-    </w:p>
-    <w:p>
-      <w:pPr>
-        <w:numPr>
-          <w:ilvl w:val="0"/>
-          <w:numId w:val="1005"/>
-        </w:numPr>
-        <w:pStyle w:val="Compact"/>
-      </w:pPr>
-      <w:r>
-        <w:t xml:space="preserve">Connects to the TrackWise database and</w:t>
-      </w:r>
-      <w:r>
-        <w:t xml:space="preserve"> </w:t>
-      </w:r>
-      <w:r>
-        <w:rPr>
-          <w:bCs/>
-          <w:b/>
-        </w:rPr>
-        <w:t xml:space="preserve">inserts each material number</w:t>
-      </w:r>
-      <w:r>
-        <w:t xml:space="preserve"> </w:t>
-      </w:r>
-      <w:r>
-        <w:t xml:space="preserve">into the TrackWise-side</w:t>
-      </w:r>
-      <w:r>
-        <w:t xml:space="preserve"> </w:t>
-      </w:r>
-      <w:r>
-        <w:rPr>
-          <w:rStyle w:val="VerbatimChar"/>
-        </w:rPr>
-        <w:t xml:space="preserve">MARA</w:t>
-      </w:r>
-      <w:r>
-        <w:t xml:space="preserve">.</w:t>
-      </w:r>
-    </w:p>
-    <w:bookmarkEnd w:id="34"/>
-    <w:bookmarkStart w:id="35" w:name="sql-statements-2"/>
-    <w:p>
-      <w:pPr>
-        <w:pStyle w:val="Heading3"/>
-      </w:pPr>
-      <w:r>
-        <w:t xml:space="preserve">5.2 SQL statements</w:t>
-      </w:r>
-    </w:p>
-    <w:p>
-      <w:pPr>
-        <w:pStyle w:val="FirstParagraph"/>
-      </w:pPr>
-      <w:r>
-        <w:rPr>
-          <w:iCs/>
-          <w:i/>
-        </w:rPr>
-        <w:t xml:space="preserve">Keep (Open SQL):</w:t>
-      </w:r>
-    </w:p>
-    <w:p>
-      <w:pPr>
-        <w:pStyle w:val="SourceCode"/>
-      </w:pPr>
-      <w:r>
-        <w:rPr>
-          <w:rStyle w:val="VerbatimChar"/>
-        </w:rPr>
-        <w:t xml:space="preserve">SELECT * FROM zcon_mdm CLIENT SPECIFIED INTO TABLE gt_con WHERE mandt = sy-mandt.</w:t>
-      </w:r>
-      <w:r>
-        <w:br/>
-      </w:r>
-      <w:r>
-        <w:rPr>
-          <w:rStyle w:val="VerbatimChar"/>
-        </w:rPr>
-        <w:t xml:space="preserve">SELECT field1 FROM zmm_param CLIENT SPECIFIED UP TO 1 ROWS INTO g_field1</w:t>
-      </w:r>
-      <w:r>
-        <w:br/>
-      </w:r>
-      <w:r>
-        <w:rPr>
-          <w:rStyle w:val="VerbatimChar"/>
-        </w:rPr>
-        <w:t xml:space="preserve">        WHERE mandt = sy-mandt AND param_type = 'ZZ9' ORDER BY srno.</w:t>
-      </w:r>
-      <w:r>
-        <w:br/>
-      </w:r>
-      <w:r>
-        <w:rPr>
-          <w:rStyle w:val="VerbatimChar"/>
-        </w:rPr>
-        <w:t xml:space="preserve">SELECT * FROM mara INTO TABLE gt_mara</w:t>
-      </w:r>
-      <w:r>
-        <w:br/>
-      </w:r>
-      <w:r>
-        <w:rPr>
-          <w:rStyle w:val="VerbatimChar"/>
-        </w:rPr>
-        <w:t xml:space="preserve">        WHERE ersda IN s_ersda AND mtart = 'ZAPI' AND mstae NOT IN (g_field1).</w:t>
-      </w:r>
-    </w:p>
-    <w:p>
-      <w:pPr>
-        <w:pStyle w:val="FirstParagraph"/>
-      </w:pPr>
-      <w:r>
-        <w:rPr>
-          <w:iCs/>
-          <w:i/>
-        </w:rPr>
-        <w:t xml:space="preserve">Replace (Native SQL → API C-3):</w:t>
-      </w:r>
-    </w:p>
-    <w:p>
-      <w:pPr>
-        <w:pStyle w:val="SourceCode"/>
-      </w:pPr>
-      <w:r>
-        <w:rPr>
-          <w:rStyle w:val="VerbatimChar"/>
-        </w:rPr>
-        <w:t xml:space="preserve">EXEC SQL. CONNECT TO / GET / SET CONNECTION :gs_con-DBCON ENDEXEC.  "→ removed</w:t>
-      </w:r>
-      <w:r>
-        <w:br/>
-      </w:r>
-      <w:r>
-        <w:rPr>
-          <w:rStyle w:val="VerbatimChar"/>
-        </w:rPr>
-        <w:t xml:space="preserve">EXEC SQL. INSERT INTO mara (MATNR) VALUES ( :gs_mara-matnr ) ENDEXEC. "→ POST TrackWise Material</w:t>
-      </w:r>
-      <w:r>
-        <w:br/>
-      </w:r>
-      <w:r>
-        <w:rPr>
-          <w:rStyle w:val="VerbatimChar"/>
-        </w:rPr>
-        <w:t xml:space="preserve">EXEC SQL. DISCONNECT :con ENDEXEC.                                  "→ removed</w:t>
-      </w:r>
-    </w:p>
-    <w:bookmarkEnd w:id="35"/>
-    <w:bookmarkStart w:id="36" w:name="tables-the-data-comes-from-sap-2"/>
-    <w:p>
-      <w:pPr>
-        <w:pStyle w:val="Heading3"/>
-      </w:pPr>
-      <w:r>
-        <w:t xml:space="preserve">5.3 Tables the data comes from (SAP)</w:t>
       </w:r>
     </w:p>
     <w:p>
@@ -5770,17 +5910,44 @@
         <w:pStyle w:val="Compact"/>
       </w:pPr>
       <w:r>
+        <w:t xml:space="preserve">Reads an exclusion parameter (</w:t>
+      </w:r>
+      <w:r>
+        <w:rPr>
+          <w:rStyle w:val="VerbatimChar"/>
+        </w:rPr>
+        <w:t xml:space="preserve">FIELD1</w:t>
+      </w:r>
+      <w:r>
+        <w:t xml:space="preserve"> </w:t>
+      </w:r>
+      <w:r>
+        <w:t xml:space="preserve">for</w:t>
+      </w:r>
+      <w:r>
+        <w:t xml:space="preserve"> </w:t>
+      </w:r>
+      <w:r>
+        <w:rPr>
+          <w:rStyle w:val="VerbatimChar"/>
+        </w:rPr>
+        <w:t xml:space="preserve">PARAM_TYPE = 'ZZ9'</w:t>
+      </w:r>
+      <w:r>
+        <w:t xml:space="preserve">) from</w:t>
+      </w:r>
+      <w:r>
+        <w:t xml:space="preserve"> </w:t>
+      </w:r>
+      <w:r>
         <w:rPr>
           <w:bCs/>
           <w:b/>
         </w:rPr>
-        <w:t xml:space="preserve">ZCON_MDM</w:t>
-      </w:r>
-      <w:r>
-        <w:t xml:space="preserve"> </w:t>
-      </w:r>
-      <w:r>
-        <w:t xml:space="preserve">— §2.2 (+ data).</w:t>
+        <w:t xml:space="preserve">ZMM_PARAM</w:t>
+      </w:r>
+      <w:r>
+        <w:t xml:space="preserve">.</w:t>
       </w:r>
     </w:p>
     <w:p>
@@ -5792,6 +5959,12 @@
         <w:pStyle w:val="Compact"/>
       </w:pPr>
       <w:r>
+        <w:t xml:space="preserve">Selects new API materials from</w:t>
+      </w:r>
+      <w:r>
+        <w:t xml:space="preserve"> </w:t>
+      </w:r>
+      <w:r>
         <w:rPr>
           <w:bCs/>
           <w:b/>
@@ -5802,94 +5975,16 @@
         <w:t xml:space="preserve"> </w:t>
       </w:r>
       <w:r>
-        <w:t xml:space="preserve">(standard SAP material master). Fields used:</w:t>
-      </w:r>
-      <w:r>
-        <w:t xml:space="preserve"> </w:t>
+        <w:t xml:space="preserve">(</w:t>
       </w:r>
       <w:r>
         <w:rPr>
           <w:rStyle w:val="VerbatimChar"/>
         </w:rPr>
-        <w:t xml:space="preserve">MATNR</w:t>
-      </w:r>
-      <w:r>
-        <w:t xml:space="preserve">,</w:t>
-      </w:r>
-      <w:r>
-        <w:t xml:space="preserve"> </w:t>
-      </w:r>
-      <w:r>
-        <w:rPr>
-          <w:rStyle w:val="VerbatimChar"/>
-        </w:rPr>
-        <w:t xml:space="preserve">MTART</w:t>
-      </w:r>
-      <w:r>
-        <w:t xml:space="preserve"> </w:t>
-      </w:r>
-      <w:r>
-        <w:t xml:space="preserve">(=</w:t>
-      </w:r>
-      <w:r>
-        <w:t xml:space="preserve"> </w:t>
-      </w:r>
-      <w:r>
-        <w:t xml:space="preserve">‘</w:t>
-      </w:r>
-      <w:r>
-        <w:t xml:space="preserve">ZAPI</w:t>
-      </w:r>
-      <w:r>
-        <w:t xml:space="preserve">’</w:t>
-      </w:r>
-      <w:r>
-        <w:t xml:space="preserve">),</w:t>
-      </w:r>
-      <w:r>
-        <w:t xml:space="preserve"> </w:t>
-      </w:r>
-      <w:r>
-        <w:rPr>
-          <w:rStyle w:val="VerbatimChar"/>
-        </w:rPr>
-        <w:t xml:space="preserve">ERSDA</w:t>
-      </w:r>
-      <w:r>
-        <w:t xml:space="preserve"> </w:t>
-      </w:r>
-      <w:r>
-        <w:t xml:space="preserve">(created date),</w:t>
-      </w:r>
-      <w:r>
-        <w:t xml:space="preserve"> </w:t>
-      </w:r>
-      <w:r>
-        <w:rPr>
-          <w:rStyle w:val="VerbatimChar"/>
-        </w:rPr>
-        <w:t xml:space="preserve">MSTAE</w:t>
-      </w:r>
-      <w:r>
-        <w:t xml:space="preserve"> </w:t>
-      </w:r>
-      <w:r>
-        <w:t xml:space="preserve">(material status). Only</w:t>
-      </w:r>
-      <w:r>
-        <w:t xml:space="preserve"> </w:t>
-      </w:r>
-      <w:r>
-        <w:rPr>
-          <w:rStyle w:val="VerbatimChar"/>
-        </w:rPr>
-        <w:t xml:space="preserve">MATNR</w:t>
-      </w:r>
-      <w:r>
-        <w:t xml:space="preserve"> </w:t>
-      </w:r>
-      <w:r>
-        <w:t xml:space="preserve">is sent onward.</w:t>
+        <w:t xml:space="preserve">MTART = 'ZAPI'</w:t>
+      </w:r>
+      <w:r>
+        <w:t xml:space="preserve">, status not excluded, created-date range).</w:t>
       </w:r>
     </w:p>
     <w:p>
@@ -5897,6 +5992,297 @@
         <w:numPr>
           <w:ilvl w:val="0"/>
           <w:numId w:val="1006"/>
+        </w:numPr>
+        <w:pStyle w:val="Compact"/>
+      </w:pPr>
+      <w:r>
+        <w:t xml:space="preserve">Connects to the TrackWise database and</w:t>
+      </w:r>
+      <w:r>
+        <w:t xml:space="preserve"> </w:t>
+      </w:r>
+      <w:r>
+        <w:rPr>
+          <w:bCs/>
+          <w:b/>
+        </w:rPr>
+        <w:t xml:space="preserve">inserts each material number</w:t>
+      </w:r>
+      <w:r>
+        <w:t xml:space="preserve"> </w:t>
+      </w:r>
+      <w:r>
+        <w:t xml:space="preserve">into the TrackWise-side</w:t>
+      </w:r>
+      <w:r>
+        <w:t xml:space="preserve"> </w:t>
+      </w:r>
+      <w:r>
+        <w:rPr>
+          <w:rStyle w:val="VerbatimChar"/>
+        </w:rPr>
+        <w:t xml:space="preserve">MARA</w:t>
+      </w:r>
+      <w:r>
+        <w:t xml:space="preserve">.</w:t>
+      </w:r>
+    </w:p>
+    <w:bookmarkEnd w:id="34"/>
+    <w:bookmarkStart w:id="35" w:name="sql-statements-2"/>
+    <w:p>
+      <w:pPr>
+        <w:pStyle w:val="Heading3"/>
+      </w:pPr>
+      <w:r>
+        <w:t xml:space="preserve">5.2 SQL statements</w:t>
+      </w:r>
+    </w:p>
+    <w:p>
+      <w:pPr>
+        <w:pStyle w:val="FirstParagraph"/>
+      </w:pPr>
+      <w:r>
+        <w:rPr>
+          <w:iCs/>
+          <w:i/>
+        </w:rPr>
+        <w:t xml:space="preserve">Keep (Open SQL):</w:t>
+      </w:r>
+    </w:p>
+    <w:p>
+      <w:pPr>
+        <w:pStyle w:val="SourceCode"/>
+      </w:pPr>
+      <w:r>
+        <w:rPr>
+          <w:rStyle w:val="VerbatimChar"/>
+        </w:rPr>
+        <w:t xml:space="preserve">SELECT * FROM zcon_mdm CLIENT SPECIFIED INTO TABLE gt_con WHERE mandt = sy-mandt.</w:t>
+      </w:r>
+      <w:r>
+        <w:br/>
+      </w:r>
+      <w:r>
+        <w:rPr>
+          <w:rStyle w:val="VerbatimChar"/>
+        </w:rPr>
+        <w:t xml:space="preserve">SELECT field1 FROM zmm_param CLIENT SPECIFIED UP TO 1 ROWS INTO g_field1</w:t>
+      </w:r>
+      <w:r>
+        <w:br/>
+      </w:r>
+      <w:r>
+        <w:rPr>
+          <w:rStyle w:val="VerbatimChar"/>
+        </w:rPr>
+        <w:t xml:space="preserve">        WHERE mandt = sy-mandt AND param_type = 'ZZ9' ORDER BY srno.</w:t>
+      </w:r>
+      <w:r>
+        <w:br/>
+      </w:r>
+      <w:r>
+        <w:rPr>
+          <w:rStyle w:val="VerbatimChar"/>
+        </w:rPr>
+        <w:t xml:space="preserve">SELECT * FROM mara INTO TABLE gt_mara</w:t>
+      </w:r>
+      <w:r>
+        <w:br/>
+      </w:r>
+      <w:r>
+        <w:rPr>
+          <w:rStyle w:val="VerbatimChar"/>
+        </w:rPr>
+        <w:t xml:space="preserve">        WHERE ersda IN s_ersda AND mtart = 'ZAPI' AND mstae NOT IN (g_field1).</w:t>
+      </w:r>
+    </w:p>
+    <w:p>
+      <w:pPr>
+        <w:pStyle w:val="FirstParagraph"/>
+      </w:pPr>
+      <w:r>
+        <w:rPr>
+          <w:iCs/>
+          <w:i/>
+        </w:rPr>
+        <w:t xml:space="preserve">Replace (Native SQL → API C-3):</w:t>
+      </w:r>
+    </w:p>
+    <w:p>
+      <w:pPr>
+        <w:pStyle w:val="SourceCode"/>
+      </w:pPr>
+      <w:r>
+        <w:rPr>
+          <w:rStyle w:val="VerbatimChar"/>
+        </w:rPr>
+        <w:t xml:space="preserve">EXEC SQL. CONNECT TO / GET / SET CONNECTION :gs_con-DBCON ENDEXEC.  "→ removed</w:t>
+      </w:r>
+      <w:r>
+        <w:br/>
+      </w:r>
+      <w:r>
+        <w:rPr>
+          <w:rStyle w:val="VerbatimChar"/>
+        </w:rPr>
+        <w:t xml:space="preserve">EXEC SQL. INSERT INTO mara (MATNR) VALUES ( :gs_mara-matnr ) ENDEXEC. "→ POST TrackWise Material</w:t>
+      </w:r>
+      <w:r>
+        <w:br/>
+      </w:r>
+      <w:r>
+        <w:rPr>
+          <w:rStyle w:val="VerbatimChar"/>
+        </w:rPr>
+        <w:t xml:space="preserve">EXEC SQL. DISCONNECT :con ENDEXEC.                                  "→ removed</w:t>
+      </w:r>
+    </w:p>
+    <w:bookmarkEnd w:id="35"/>
+    <w:bookmarkStart w:id="36" w:name="tables-the-data-comes-from-sap-2"/>
+    <w:p>
+      <w:pPr>
+        <w:pStyle w:val="Heading3"/>
+      </w:pPr>
+      <w:r>
+        <w:t xml:space="preserve">5.3 Tables the data comes from (SAP)</w:t>
+      </w:r>
+    </w:p>
+    <w:p>
+      <w:pPr>
+        <w:numPr>
+          <w:ilvl w:val="0"/>
+          <w:numId w:val="1007"/>
+        </w:numPr>
+        <w:pStyle w:val="Compact"/>
+      </w:pPr>
+      <w:r>
+        <w:rPr>
+          <w:bCs/>
+          <w:b/>
+        </w:rPr>
+        <w:t xml:space="preserve">ZCON_MDM</w:t>
+      </w:r>
+      <w:r>
+        <w:t xml:space="preserve"> </w:t>
+      </w:r>
+      <w:r>
+        <w:t xml:space="preserve">— §2.2 (+ data).</w:t>
+      </w:r>
+    </w:p>
+    <w:p>
+      <w:pPr>
+        <w:numPr>
+          <w:ilvl w:val="0"/>
+          <w:numId w:val="1007"/>
+        </w:numPr>
+        <w:pStyle w:val="Compact"/>
+      </w:pPr>
+      <w:r>
+        <w:rPr>
+          <w:bCs/>
+          <w:b/>
+        </w:rPr>
+        <w:t xml:space="preserve">MARA</w:t>
+      </w:r>
+      <w:r>
+        <w:t xml:space="preserve"> </w:t>
+      </w:r>
+      <w:r>
+        <w:t xml:space="preserve">(standard SAP material master). Fields used:</w:t>
+      </w:r>
+      <w:r>
+        <w:t xml:space="preserve"> </w:t>
+      </w:r>
+      <w:r>
+        <w:rPr>
+          <w:rStyle w:val="VerbatimChar"/>
+        </w:rPr>
+        <w:t xml:space="preserve">MATNR</w:t>
+      </w:r>
+      <w:r>
+        <w:t xml:space="preserve">,</w:t>
+      </w:r>
+      <w:r>
+        <w:t xml:space="preserve"> </w:t>
+      </w:r>
+      <w:r>
+        <w:rPr>
+          <w:rStyle w:val="VerbatimChar"/>
+        </w:rPr>
+        <w:t xml:space="preserve">MTART</w:t>
+      </w:r>
+      <w:r>
+        <w:t xml:space="preserve"> </w:t>
+      </w:r>
+      <w:r>
+        <w:t xml:space="preserve">(=</w:t>
+      </w:r>
+      <w:r>
+        <w:t xml:space="preserve"> </w:t>
+      </w:r>
+      <w:r>
+        <w:t xml:space="preserve">‘</w:t>
+      </w:r>
+      <w:r>
+        <w:t xml:space="preserve">ZAPI</w:t>
+      </w:r>
+      <w:r>
+        <w:t xml:space="preserve">’</w:t>
+      </w:r>
+      <w:r>
+        <w:t xml:space="preserve">),</w:t>
+      </w:r>
+      <w:r>
+        <w:t xml:space="preserve"> </w:t>
+      </w:r>
+      <w:r>
+        <w:rPr>
+          <w:rStyle w:val="VerbatimChar"/>
+        </w:rPr>
+        <w:t xml:space="preserve">ERSDA</w:t>
+      </w:r>
+      <w:r>
+        <w:t xml:space="preserve"> </w:t>
+      </w:r>
+      <w:r>
+        <w:t xml:space="preserve">(created date),</w:t>
+      </w:r>
+      <w:r>
+        <w:t xml:space="preserve"> </w:t>
+      </w:r>
+      <w:r>
+        <w:rPr>
+          <w:rStyle w:val="VerbatimChar"/>
+        </w:rPr>
+        <w:t xml:space="preserve">MSTAE</w:t>
+      </w:r>
+      <w:r>
+        <w:t xml:space="preserve"> </w:t>
+      </w:r>
+      <w:r>
+        <w:t xml:space="preserve">(material status). Only</w:t>
+      </w:r>
+      <w:r>
+        <w:t xml:space="preserve"> </w:t>
+      </w:r>
+      <w:r>
+        <w:rPr>
+          <w:rStyle w:val="VerbatimChar"/>
+        </w:rPr>
+        <w:t xml:space="preserve">MATNR</w:t>
+      </w:r>
+      <w:r>
+        <w:t xml:space="preserve"> </w:t>
+      </w:r>
+      <w:r>
+        <w:t xml:space="preserve">is sent onward.</w:t>
+      </w:r>
+    </w:p>
+    <w:p>
+      <w:pPr>
+        <w:numPr>
+          <w:ilvl w:val="0"/>
+          <w:numId w:val="1007"/>
         </w:numPr>
         <w:pStyle w:val="Compact"/>
       </w:pPr>
@@ -7181,7 +7567,7 @@
       <w:pPr>
         <w:numPr>
           <w:ilvl w:val="0"/>
-          <w:numId w:val="1007"/>
+          <w:numId w:val="1008"/>
         </w:numPr>
         <w:pStyle w:val="Compact"/>
       </w:pPr>
@@ -7203,7 +7589,7 @@
       <w:pPr>
         <w:numPr>
           <w:ilvl w:val="0"/>
-          <w:numId w:val="1007"/>
+          <w:numId w:val="1008"/>
         </w:numPr>
         <w:pStyle w:val="Compact"/>
       </w:pPr>
@@ -7240,7 +7626,7 @@
       <w:pPr>
         <w:numPr>
           <w:ilvl w:val="0"/>
-          <w:numId w:val="1007"/>
+          <w:numId w:val="1008"/>
         </w:numPr>
         <w:pStyle w:val="Compact"/>
       </w:pPr>
@@ -10022,51 +10408,37 @@
           <w:bCs/>
           <w:b/>
         </w:rPr>
-        <w:t xml:space="preserve">Only open point:</w:t>
-      </w:r>
-      <w:r>
-        <w:t xml:space="preserve"> </w:t>
-      </w:r>
-      <w:r>
-        <w:t xml:space="preserve">confirm the target is S/4HANA</w:t>
-      </w:r>
-      <w:r>
-        <w:t xml:space="preserve"> </w:t>
-      </w:r>
-      <w:r>
-        <w:rPr>
-          <w:bCs/>
-          <w:b/>
-        </w:rPr>
-        <w:t xml:space="preserve">on-premise</w:t>
-      </w:r>
-      <w:r>
-        <w:t xml:space="preserve"> </w:t>
-      </w:r>
-      <w:r>
-        <w:t xml:space="preserve">or</w:t>
-      </w:r>
-      <w:r>
-        <w:t xml:space="preserve"> </w:t>
-      </w:r>
-      <w:r>
-        <w:rPr>
-          <w:bCs/>
-          <w:b/>
-        </w:rPr>
-        <w:t xml:space="preserve">Cloud</w:t>
-      </w:r>
-      <w:r>
-        <w:t xml:space="preserve"> </w:t>
-      </w:r>
-      <w:r>
-        <w:t xml:space="preserve">— this decides the ABAP HTTP</w:t>
-      </w:r>
-      <w:r>
-        <w:t xml:space="preserve"> </w:t>
-      </w:r>
-      <w:r>
-        <w:t xml:space="preserve">client used to call CPI. Everything else in this document is final.</w:t>
+        <w:t xml:space="preserve">Target confirmed: SAP S/4HANA Private Cloud Edition (RISE with SAP).</w:t>
+      </w:r>
+      <w:r>
+        <w:t xml:space="preserve"> </w:t>
+      </w:r>
+      <w:r>
+        <w:t xml:space="preserve">The SAP-side consumer is standard</w:t>
+      </w:r>
+      <w:r>
+        <w:t xml:space="preserve"> </w:t>
+      </w:r>
+      <w:r>
+        <w:t xml:space="preserve">managed ABAP — an HTTPS call to CPI via a destination / Communication Arrangement (recommended</w:t>
+      </w:r>
+      <w:r>
+        <w:t xml:space="preserve"> </w:t>
+      </w:r>
+      <w:r>
+        <w:rPr>
+          <w:rStyle w:val="VerbatimChar"/>
+        </w:rPr>
+        <w:t xml:space="preserve">if_web_http_client</w:t>
+      </w:r>
+      <w:r>
+        <w:t xml:space="preserve">). No open points remain on the SAP side; the CPI team’s remaining task is the SQL Server</w:t>
+      </w:r>
+      <w:r>
+        <w:t xml:space="preserve"> </w:t>
+      </w:r>
+      <w:r>
+        <w:t xml:space="preserve">connectivity (Cloud Connector / on-premise JDBC) and the seven iFlows in §7.</w:t>
       </w:r>
     </w:p>
     <w:bookmarkEnd w:id="44"/>
@@ -10345,6 +10717,9 @@
     <w:abstractNumId w:val="991"/>
   </w:num>
   <w:num w:numId="1002">
+    <w:abstractNumId w:val="991"/>
+  </w:num>
+  <w:num w:numId="1003">
     <w:abstractNumId w:val="99411"/>
     <w:lvlOverride w:ilvl="0">
       <w:startOverride w:val="1"/>
@@ -10374,13 +10749,13 @@
       <w:startOverride w:val="1"/>
     </w:lvlOverride>
   </w:num>
-  <w:num w:numId="1003">
-    <w:abstractNumId w:val="991"/>
-  </w:num>
   <w:num w:numId="1004">
     <w:abstractNumId w:val="991"/>
   </w:num>
   <w:num w:numId="1005">
+    <w:abstractNumId w:val="991"/>
+  </w:num>
+  <w:num w:numId="1006">
     <w:abstractNumId w:val="99411"/>
     <w:lvlOverride w:ilvl="0">
       <w:startOverride w:val="1"/>
@@ -10410,10 +10785,10 @@
       <w:startOverride w:val="1"/>
     </w:lvlOverride>
   </w:num>
-  <w:num w:numId="1006">
+  <w:num w:numId="1007">
     <w:abstractNumId w:val="991"/>
   </w:num>
-  <w:num w:numId="1007">
+  <w:num w:numId="1008">
     <w:abstractNumId w:val="991"/>
   </w:num>
 </w:numbering>

</xml_diff>

<commit_message>
Add API consolidation analysis (merge similar SQL into fewer CPI APIs)
Add section 8: which SQL operations can be merged - 7 push programs already
share one API (identical HOST_TO_WMS insert, transaction type as a field);
plant check+create collapses to one upsert operation; group the rest into two
CPI iFlows by system (ASRS, TrackWise) = 2 APIs / 6 operations instead of 7.
Regenerate the client Word document.

Co-Authored-By: Claude Opus 4.8 <noreply@anthropic.com>
Claude-Session: https://claude.ai/code/session_01Q4LHaHQmBW12fv5735PcEf
</commit_message>
<xml_diff>
--- a/interface/ASRS_TrackWise_Migration_CLEAN.docx
+++ b/interface/ASRS_TrackWise_Migration_CLEAN.docx
@@ -10438,10 +10438,735 @@
         <w:t xml:space="preserve"> </w:t>
       </w:r>
       <w:r>
-        <w:t xml:space="preserve">connectivity (Cloud Connector / on-premise JDBC) and the seven iFlows in §7.</w:t>
+        <w:t xml:space="preserve">connectivity (Cloud Connector / on-premise JDBC) and the interfaces below.</w:t>
       </w:r>
     </w:p>
     <w:bookmarkEnd w:id="44"/>
+    <w:bookmarkStart w:id="45" w:name="Xfdc6c18eb9b50223761c4af43dfba2a85e93bb7"/>
+    <w:p>
+      <w:pPr>
+        <w:pStyle w:val="Heading1"/>
+      </w:pPr>
+      <w:r>
+        <w:t xml:space="preserve">8. Consolidating similar SQL into fewer APIs</w:t>
+      </w:r>
+    </w:p>
+    <w:p>
+      <w:pPr>
+        <w:pStyle w:val="FirstParagraph"/>
+      </w:pPr>
+      <w:r>
+        <w:t xml:space="preserve">Several of the SQL operations are identical or closely related, so they do</w:t>
+      </w:r>
+      <w:r>
+        <w:t xml:space="preserve"> </w:t>
+      </w:r>
+      <w:r>
+        <w:rPr>
+          <w:bCs/>
+          <w:b/>
+        </w:rPr>
+        <w:t xml:space="preserve">not</w:t>
+      </w:r>
+      <w:r>
+        <w:t xml:space="preserve"> </w:t>
+      </w:r>
+      <w:r>
+        <w:t xml:space="preserve">each need a separate API.</w:t>
+      </w:r>
+      <w:r>
+        <w:t xml:space="preserve"> </w:t>
+      </w:r>
+      <w:r>
+        <w:t xml:space="preserve">The seven operations reduce to</w:t>
+      </w:r>
+      <w:r>
+        <w:t xml:space="preserve"> </w:t>
+      </w:r>
+      <w:r>
+        <w:rPr>
+          <w:bCs/>
+          <w:b/>
+        </w:rPr>
+        <w:t xml:space="preserve">two CPI integration flows (one per external system)</w:t>
+      </w:r>
+      <w:r>
+        <w:t xml:space="preserve"> </w:t>
+      </w:r>
+      <w:r>
+        <w:t xml:space="preserve">and two operations</w:t>
+      </w:r>
+      <w:r>
+        <w:t xml:space="preserve"> </w:t>
+      </w:r>
+      <w:r>
+        <w:t xml:space="preserve">genuinely merge into one:</w:t>
+      </w:r>
+    </w:p>
+    <w:p>
+      <w:pPr>
+        <w:pStyle w:val="BodyText"/>
+      </w:pPr>
+      <w:r>
+        <w:rPr>
+          <w:bCs/>
+          <w:b/>
+        </w:rPr>
+        <w:t xml:space="preserve">8.1 Already merged — the 7</w:t>
+      </w:r>
+      <w:r>
+        <w:rPr>
+          <w:bCs/>
+          <w:b/>
+        </w:rPr>
+        <w:t xml:space="preserve"> </w:t>
+      </w:r>
+      <w:r>
+        <w:rPr>
+          <w:bCs/>
+          <w:b/>
+        </w:rPr>
+        <w:t xml:space="preserve">“</w:t>
+      </w:r>
+      <w:r>
+        <w:rPr>
+          <w:bCs/>
+          <w:b/>
+        </w:rPr>
+        <w:t xml:space="preserve">push</w:t>
+      </w:r>
+      <w:r>
+        <w:rPr>
+          <w:bCs/>
+          <w:b/>
+        </w:rPr>
+        <w:t xml:space="preserve">”</w:t>
+      </w:r>
+      <w:r>
+        <w:rPr>
+          <w:bCs/>
+          <w:b/>
+        </w:rPr>
+        <w:t xml:space="preserve"> </w:t>
+      </w:r>
+      <w:r>
+        <w:rPr>
+          <w:bCs/>
+          <w:b/>
+        </w:rPr>
+        <w:t xml:space="preserve">programs → 1 API.</w:t>
+      </w:r>
+      <w:r>
+        <w:t xml:space="preserve"> </w:t>
+      </w:r>
+      <w:r>
+        <w:t xml:space="preserve">All seven</w:t>
+      </w:r>
+      <w:r>
+        <w:t xml:space="preserve"> </w:t>
+      </w:r>
+      <w:r>
+        <w:rPr>
+          <w:rStyle w:val="VerbatimChar"/>
+        </w:rPr>
+        <w:t xml:space="preserve">ZMM_SQL_ASRS_SAP_PUSH*</w:t>
+      </w:r>
+      <w:r>
+        <w:t xml:space="preserve"> </w:t>
+      </w:r>
+      <w:r>
+        <w:t xml:space="preserve">programs run the</w:t>
+      </w:r>
+      <w:r>
+        <w:t xml:space="preserve"> </w:t>
+      </w:r>
+      <w:r>
+        <w:rPr>
+          <w:bCs/>
+          <w:b/>
+        </w:rPr>
+        <w:t xml:space="preserve">identical</w:t>
+      </w:r>
+      <w:r>
+        <w:t xml:space="preserve"> </w:t>
+      </w:r>
+      <w:r>
+        <w:rPr>
+          <w:rStyle w:val="VerbatimChar"/>
+        </w:rPr>
+        <w:t xml:space="preserve">INSERT INTO HOST_TO_WMS</w:t>
+      </w:r>
+      <w:r>
+        <w:t xml:space="preserve">, differing only by</w:t>
+      </w:r>
+      <w:r>
+        <w:t xml:space="preserve"> </w:t>
+      </w:r>
+      <w:r>
+        <w:t xml:space="preserve">the transaction type (</w:t>
+      </w:r>
+      <w:r>
+        <w:rPr>
+          <w:rStyle w:val="VerbatimChar"/>
+        </w:rPr>
+        <w:t xml:space="preserve">COR / DIS / IN / MAT / OUT / PSCR / …</w:t>
+      </w:r>
+      <w:r>
+        <w:t xml:space="preserve">), which is just a</w:t>
+      </w:r>
+      <w:r>
+        <w:t xml:space="preserve"> </w:t>
+      </w:r>
+      <w:r>
+        <w:rPr>
+          <w:bCs/>
+          <w:b/>
+        </w:rPr>
+        <w:t xml:space="preserve">field value</w:t>
+      </w:r>
+      <w:r>
+        <w:t xml:space="preserve">. They</w:t>
+      </w:r>
+      <w:r>
+        <w:t xml:space="preserve"> </w:t>
+      </w:r>
+      <w:r>
+        <w:t xml:space="preserve">therefore call the</w:t>
+      </w:r>
+      <w:r>
+        <w:t xml:space="preserve"> </w:t>
+      </w:r>
+      <w:r>
+        <w:rPr>
+          <w:bCs/>
+          <w:b/>
+        </w:rPr>
+        <w:t xml:space="preserve">same</w:t>
+      </w:r>
+      <w:r>
+        <w:t xml:space="preserve"> </w:t>
+      </w:r>
+      <w:r>
+        <w:t xml:space="preserve">API (C-1); the transaction type travels in the payload.</w:t>
+      </w:r>
+      <w:r>
+        <w:t xml:space="preserve"> </w:t>
+      </w:r>
+      <w:r>
+        <w:rPr>
+          <w:bCs/>
+          <w:b/>
+        </w:rPr>
+        <w:t xml:space="preserve">(7 → 1.)</w:t>
+      </w:r>
+    </w:p>
+    <w:p>
+      <w:pPr>
+        <w:pStyle w:val="BodyText"/>
+      </w:pPr>
+      <w:r>
+        <w:rPr>
+          <w:bCs/>
+          <w:b/>
+        </w:rPr>
+        <w:t xml:space="preserve">8.2 Merge plant</w:t>
+      </w:r>
+      <w:r>
+        <w:rPr>
+          <w:bCs/>
+          <w:b/>
+        </w:rPr>
+        <w:t xml:space="preserve"> </w:t>
+      </w:r>
+      <w:r>
+        <w:rPr>
+          <w:bCs/>
+          <w:b/>
+        </w:rPr>
+        <w:t xml:space="preserve">“</w:t>
+      </w:r>
+      <w:r>
+        <w:rPr>
+          <w:bCs/>
+          <w:b/>
+        </w:rPr>
+        <w:t xml:space="preserve">check + create</w:t>
+      </w:r>
+      <w:r>
+        <w:rPr>
+          <w:bCs/>
+          <w:b/>
+        </w:rPr>
+        <w:t xml:space="preserve">”</w:t>
+      </w:r>
+      <w:r>
+        <w:rPr>
+          <w:bCs/>
+          <w:b/>
+        </w:rPr>
+        <w:t xml:space="preserve"> </w:t>
+      </w:r>
+      <w:r>
+        <w:rPr>
+          <w:bCs/>
+          <w:b/>
+        </w:rPr>
+        <w:t xml:space="preserve">into one upsert call.</w:t>
+      </w:r>
+      <w:r>
+        <w:t xml:space="preserve"> </w:t>
+      </w:r>
+      <w:r>
+        <w:t xml:space="preserve">In</w:t>
+      </w:r>
+      <w:r>
+        <w:t xml:space="preserve"> </w:t>
+      </w:r>
+      <w:r>
+        <w:rPr>
+          <w:rStyle w:val="VerbatimChar"/>
+        </w:rPr>
+        <w:t xml:space="preserve">ZQM_TRACKWISE</w:t>
+      </w:r>
+      <w:r>
+        <w:t xml:space="preserve"> </w:t>
+      </w:r>
+      <w:r>
+        <w:t xml:space="preserve">the plant is handled as check-then-insert:</w:t>
+      </w:r>
+      <w:r>
+        <w:t xml:space="preserve"> </w:t>
+      </w:r>
+      <w:r>
+        <w:rPr>
+          <w:rStyle w:val="VerbatimChar"/>
+        </w:rPr>
+        <w:t xml:space="preserve">SELECT … FROM ZTW_PLNT_DET</w:t>
+      </w:r>
+      <w:r>
+        <w:t xml:space="preserve"> </w:t>
+      </w:r>
+      <w:r>
+        <w:t xml:space="preserve">(C-5) and, if</w:t>
+      </w:r>
+      <w:r>
+        <w:t xml:space="preserve"> </w:t>
+      </w:r>
+      <w:r>
+        <w:t xml:space="preserve">absent,</w:t>
+      </w:r>
+      <w:r>
+        <w:t xml:space="preserve"> </w:t>
+      </w:r>
+      <w:r>
+        <w:rPr>
+          <w:rStyle w:val="VerbatimChar"/>
+        </w:rPr>
+        <w:t xml:space="preserve">INSERT INTO ZTW_PLNT_DET</w:t>
+      </w:r>
+      <w:r>
+        <w:t xml:space="preserve"> </w:t>
+      </w:r>
+      <w:r>
+        <w:t xml:space="preserve">(C-6). CPI can do both in a</w:t>
+      </w:r>
+      <w:r>
+        <w:t xml:space="preserve"> </w:t>
+      </w:r>
+      <w:r>
+        <w:rPr>
+          <w:bCs/>
+          <w:b/>
+        </w:rPr>
+        <w:t xml:space="preserve">single</w:t>
+      </w:r>
+      <w:r>
+        <w:rPr>
+          <w:bCs/>
+          <w:b/>
+        </w:rPr>
+        <w:t xml:space="preserve"> </w:t>
+      </w:r>
+      <w:r>
+        <w:rPr>
+          <w:bCs/>
+          <w:b/>
+        </w:rPr>
+        <w:t xml:space="preserve">“</w:t>
+      </w:r>
+      <w:r>
+        <w:rPr>
+          <w:bCs/>
+          <w:b/>
+        </w:rPr>
+        <w:t xml:space="preserve">Upsert Plant</w:t>
+      </w:r>
+      <w:r>
+        <w:rPr>
+          <w:bCs/>
+          <w:b/>
+        </w:rPr>
+        <w:t xml:space="preserve">”</w:t>
+      </w:r>
+      <w:r>
+        <w:rPr>
+          <w:bCs/>
+          <w:b/>
+        </w:rPr>
+        <w:t xml:space="preserve"> </w:t>
+      </w:r>
+      <w:r>
+        <w:rPr>
+          <w:bCs/>
+          <w:b/>
+        </w:rPr>
+        <w:t xml:space="preserve">operation</w:t>
+      </w:r>
+      <w:r>
+        <w:t xml:space="preserve"> </w:t>
+      </w:r>
+      <w:r>
+        <w:t xml:space="preserve">(existence</w:t>
+      </w:r>
+      <w:r>
+        <w:t xml:space="preserve"> </w:t>
+      </w:r>
+      <w:r>
+        <w:t xml:space="preserve">check + insert, or a SQL</w:t>
+      </w:r>
+      <w:r>
+        <w:t xml:space="preserve"> </w:t>
+      </w:r>
+      <w:r>
+        <w:rPr>
+          <w:rStyle w:val="VerbatimChar"/>
+        </w:rPr>
+        <w:t xml:space="preserve">MERGE</w:t>
+      </w:r>
+      <w:r>
+        <w:t xml:space="preserve">). SAP sends</w:t>
+      </w:r>
+      <w:r>
+        <w:t xml:space="preserve"> </w:t>
+      </w:r>
+      <w:r>
+        <w:rPr>
+          <w:rStyle w:val="VerbatimChar"/>
+        </w:rPr>
+        <w:t xml:space="preserve">{Plant_Code, Plant_Name}</w:t>
+      </w:r>
+      <w:r>
+        <w:t xml:space="preserve"> </w:t>
+      </w:r>
+      <w:r>
+        <w:t xml:space="preserve">once.</w:t>
+      </w:r>
+      <w:r>
+        <w:t xml:space="preserve"> </w:t>
+      </w:r>
+      <w:r>
+        <w:rPr>
+          <w:bCs/>
+          <w:b/>
+        </w:rPr>
+        <w:t xml:space="preserve">(2 → 1.)</w:t>
+      </w:r>
+    </w:p>
+    <w:p>
+      <w:pPr>
+        <w:pStyle w:val="BodyText"/>
+      </w:pPr>
+      <w:r>
+        <w:rPr>
+          <w:bCs/>
+          <w:b/>
+        </w:rPr>
+        <w:t xml:space="preserve">8.3 Group the rest into two APIs, one per system.</w:t>
+      </w:r>
+      <w:r>
+        <w:t xml:space="preserve"> </w:t>
+      </w:r>
+      <w:r>
+        <w:t xml:space="preserve">Instead of seven standalone services, deploy two iFlows — each with one connection/credential set:</w:t>
+      </w:r>
+    </w:p>
+    <w:tbl>
+      <w:tblPr>
+        <w:tblStyle w:val="Table"/>
+        <w:tblW w:type="pct" w:w="5000"/>
+        <w:tblLook w:firstRow="1" w:lastRow="0" w:firstColumn="0" w:lastColumn="0" w:noHBand="0" w:noVBand="0" w:val="0020"/>
+        <w:jc w:val="start"/>
+      </w:tblPr>
+      <w:tblGrid>
+        <w:gridCol w:w="2640"/>
+        <w:gridCol w:w="2640"/>
+        <w:gridCol w:w="2640"/>
+      </w:tblGrid>
+      <w:tr>
+        <w:trPr>
+          <w:tblHeader w:val="true"/>
+        </w:trPr>
+        <w:tc>
+          <w:tcPr/>
+          <w:p>
+            <w:pPr>
+              <w:pStyle w:val="Compact"/>
+              <w:jc w:val="left"/>
+            </w:pPr>
+            <w:r>
+              <w:t xml:space="preserve">CPI API (iFlow)</w:t>
+            </w:r>
+          </w:p>
+        </w:tc>
+        <w:tc>
+          <w:tcPr/>
+          <w:p>
+            <w:pPr>
+              <w:pStyle w:val="Compact"/>
+              <w:jc w:val="left"/>
+            </w:pPr>
+            <w:r>
+              <w:t xml:space="preserve">Operations</w:t>
+            </w:r>
+          </w:p>
+        </w:tc>
+        <w:tc>
+          <w:tcPr/>
+          <w:p>
+            <w:pPr>
+              <w:pStyle w:val="Compact"/>
+              <w:jc w:val="left"/>
+            </w:pPr>
+            <w:r>
+              <w:t xml:space="preserve">External table(s)</w:t>
+            </w:r>
+          </w:p>
+        </w:tc>
+      </w:tr>
+      <w:tr>
+        <w:tc>
+          <w:tcPr/>
+          <w:p>
+            <w:pPr>
+              <w:pStyle w:val="Compact"/>
+              <w:jc w:val="left"/>
+            </w:pPr>
+            <w:r>
+              <w:rPr>
+                <w:bCs/>
+                <w:b/>
+              </w:rPr>
+              <w:t xml:space="preserve">ASRS</w:t>
+            </w:r>
+          </w:p>
+        </w:tc>
+        <w:tc>
+          <w:tcPr/>
+          <w:p>
+            <w:pPr>
+              <w:pStyle w:val="Compact"/>
+              <w:jc w:val="left"/>
+            </w:pPr>
+            <w:r>
+              <w:t xml:space="preserve">POST message · GET message status</w:t>
+            </w:r>
+          </w:p>
+        </w:tc>
+        <w:tc>
+          <w:tcPr/>
+          <w:p>
+            <w:pPr>
+              <w:pStyle w:val="Compact"/>
+              <w:jc w:val="left"/>
+            </w:pPr>
+            <w:r>
+              <w:t xml:space="preserve">HOST_TO_WMS</w:t>
+            </w:r>
+          </w:p>
+        </w:tc>
+      </w:tr>
+      <w:tr>
+        <w:tc>
+          <w:tcPr/>
+          <w:p>
+            <w:pPr>
+              <w:pStyle w:val="Compact"/>
+              <w:jc w:val="left"/>
+            </w:pPr>
+            <w:r>
+              <w:rPr>
+                <w:bCs/>
+                <w:b/>
+              </w:rPr>
+              <w:t xml:space="preserve">TrackWise</w:t>
+            </w:r>
+          </w:p>
+        </w:tc>
+        <w:tc>
+          <w:tcPr/>
+          <w:p>
+            <w:pPr>
+              <w:pStyle w:val="Compact"/>
+              <w:jc w:val="left"/>
+            </w:pPr>
+            <w:r>
+              <w:t xml:space="preserve">POST material · POST material-detail · POST product-detail · Upsert plant</w:t>
+            </w:r>
+          </w:p>
+        </w:tc>
+        <w:tc>
+          <w:tcPr/>
+          <w:p>
+            <w:pPr>
+              <w:pStyle w:val="Compact"/>
+              <w:jc w:val="left"/>
+            </w:pPr>
+            <w:r>
+              <w:t xml:space="preserve">MARA, ZTW_MAT_DET, ZTW_PROD_DET, ZTW_PLNT_DET</w:t>
+            </w:r>
+          </w:p>
+        </w:tc>
+      </w:tr>
+    </w:tbl>
+    <w:p>
+      <w:pPr>
+        <w:pStyle w:val="BodyText"/>
+      </w:pPr>
+      <w:r>
+        <w:t xml:space="preserve">→</w:t>
+      </w:r>
+      <w:r>
+        <w:t xml:space="preserve"> </w:t>
+      </w:r>
+      <w:r>
+        <w:rPr>
+          <w:bCs/>
+          <w:b/>
+        </w:rPr>
+        <w:t xml:space="preserve">2 integration artifacts, 6 operations</w:t>
+      </w:r>
+      <w:r>
+        <w:t xml:space="preserve"> </w:t>
+      </w:r>
+      <w:r>
+        <w:t xml:space="preserve">(down from 7 separate APIs).</w:t>
+      </w:r>
+    </w:p>
+    <w:p>
+      <w:pPr>
+        <w:pStyle w:val="BodyText"/>
+      </w:pPr>
+      <w:r>
+        <w:rPr>
+          <w:bCs/>
+          <w:b/>
+        </w:rPr>
+        <w:t xml:space="preserve">8.4 Optional — material-detail + product-detail.</w:t>
+      </w:r>
+      <w:r>
+        <w:t xml:space="preserve"> </w:t>
+      </w:r>
+      <w:r>
+        <w:t xml:space="preserve">These are two different tables with different fields (20 vs 15), so best kept as</w:t>
+      </w:r>
+      <w:r>
+        <w:t xml:space="preserve"> </w:t>
+      </w:r>
+      <w:r>
+        <w:rPr>
+          <w:bCs/>
+          <w:b/>
+        </w:rPr>
+        <w:t xml:space="preserve">two operations</w:t>
+      </w:r>
+      <w:r>
+        <w:t xml:space="preserve"> </w:t>
+      </w:r>
+      <w:r>
+        <w:t xml:space="preserve">under the</w:t>
+      </w:r>
+      <w:r>
+        <w:t xml:space="preserve"> </w:t>
+      </w:r>
+      <w:r>
+        <w:t xml:space="preserve">TrackWise API for clarity. They</w:t>
+      </w:r>
+      <w:r>
+        <w:t xml:space="preserve"> </w:t>
+      </w:r>
+      <w:r>
+        <w:rPr>
+          <w:iCs/>
+          <w:i/>
+        </w:rPr>
+        <w:t xml:space="preserve">could</w:t>
+      </w:r>
+      <w:r>
+        <w:t xml:space="preserve"> </w:t>
+      </w:r>
+      <w:r>
+        <w:t xml:space="preserve">be merged into one generic</w:t>
+      </w:r>
+      <w:r>
+        <w:t xml:space="preserve"> </w:t>
+      </w:r>
+      <w:r>
+        <w:t xml:space="preserve">“</w:t>
+      </w:r>
+      <w:r>
+        <w:t xml:space="preserve">push detail</w:t>
+      </w:r>
+      <w:r>
+        <w:t xml:space="preserve">”</w:t>
+      </w:r>
+      <w:r>
+        <w:t xml:space="preserve"> </w:t>
+      </w:r>
+      <w:r>
+        <w:t xml:space="preserve">call with an object-type</w:t>
+      </w:r>
+      <w:r>
+        <w:t xml:space="preserve"> </w:t>
+      </w:r>
+      <w:r>
+        <w:t xml:space="preserve">flag and a combined payload, but that reduces readability — not recommended unless the client prefers it.</w:t>
+      </w:r>
+    </w:p>
+    <w:p>
+      <w:pPr>
+        <w:pStyle w:val="BodyText"/>
+      </w:pPr>
+      <w:r>
+        <w:rPr>
+          <w:bCs/>
+          <w:b/>
+        </w:rPr>
+        <w:t xml:space="preserve">Net result:</w:t>
+      </w:r>
+      <w:r>
+        <w:t xml:space="preserve"> </w:t>
+      </w:r>
+      <w:r>
+        <w:rPr>
+          <w:bCs/>
+          <w:b/>
+        </w:rPr>
+        <w:t xml:space="preserve">2 CPI APIs / 6 operations</w:t>
+      </w:r>
+      <w:r>
+        <w:t xml:space="preserve"> </w:t>
+      </w:r>
+      <w:r>
+        <w:t xml:space="preserve">instead of 7 — with the 7 push programs already sharing one API,</w:t>
+      </w:r>
+      <w:r>
+        <w:t xml:space="preserve"> </w:t>
+      </w:r>
+      <w:r>
+        <w:t xml:space="preserve">and the plant check+create genuinely collapsing 2 → 1.</w:t>
+      </w:r>
+    </w:p>
+    <w:bookmarkEnd w:id="45"/>
     <w:sectPr/>
     <w:pgMar w:top="1008" w:right="864" w:bottom="1008" w:left="864" w:header="504" w:footer="504" w:gutter="0"/>
   </w:body>

</xml_diff>

<commit_message>
Clarify shared-interface count and GET/fetch operations in migration doc
Add section 8.5 (how many interfaces are the same: 10 programs -> 6 operations;
only the 7 ASRS push programs share one interface) and section 8.6 (reads vs
pushes: the two GET operations - the real cursor FETCH in ZMM_ASRS_SAP_INTERFACE
that reads message status back, and the plant existence-check SELECT in
ZQM_TRACKWISE; everything else is push-only). Regenerate the Word document.

Co-Authored-By: Claude Opus 4.8 <noreply@anthropic.com>
Claude-Session: https://claude.ai/code/session_01Q4LHaHQmBW12fv5735PcEf
</commit_message>
<xml_diff>
--- a/interface/ASRS_TrackWise_Migration_CLEAN.docx
+++ b/interface/ASRS_TrackWise_Migration_CLEAN.docx
@@ -10442,7 +10442,7 @@
       </w:r>
     </w:p>
     <w:bookmarkEnd w:id="44"/>
-    <w:bookmarkStart w:id="45" w:name="Xfdc6c18eb9b50223761c4af43dfba2a85e93bb7"/>
+    <w:bookmarkStart w:id="47" w:name="Xfdc6c18eb9b50223761c4af43dfba2a85e93bb7"/>
     <w:p>
       <w:pPr>
         <w:pStyle w:val="Heading1"/>
@@ -11166,7 +11166,990 @@
         <w:t xml:space="preserve">and the plant check+create genuinely collapsing 2 → 1.</w:t>
       </w:r>
     </w:p>
+    <w:bookmarkStart w:id="45" w:name="how-many-interfaces-are-the-same"/>
+    <w:p>
+      <w:pPr>
+        <w:pStyle w:val="Heading2"/>
+      </w:pPr>
+      <w:r>
+        <w:t xml:space="preserve">8.5 How many interfaces are the same</w:t>
+      </w:r>
+    </w:p>
+    <w:p>
+      <w:pPr>
+        <w:pStyle w:val="FirstParagraph"/>
+      </w:pPr>
+      <w:r>
+        <w:t xml:space="preserve">The 10 programs need only</w:t>
+      </w:r>
+      <w:r>
+        <w:t xml:space="preserve"> </w:t>
+      </w:r>
+      <w:r>
+        <w:rPr>
+          <w:bCs/>
+          <w:b/>
+        </w:rPr>
+        <w:t xml:space="preserve">6 distinct operations</w:t>
+      </w:r>
+      <w:r>
+        <w:t xml:space="preserve">, because one group of programs is identical:</w:t>
+      </w:r>
+    </w:p>
+    <w:tbl>
+      <w:tblPr>
+        <w:tblStyle w:val="Table"/>
+        <w:tblW w:type="pct" w:w="5000"/>
+        <w:tblLook w:firstRow="1" w:lastRow="0" w:firstColumn="0" w:lastColumn="0" w:noHBand="0" w:noVBand="0" w:val="0020"/>
+        <w:jc w:val="start"/>
+      </w:tblPr>
+      <w:tblGrid>
+        <w:gridCol w:w="1980"/>
+        <w:gridCol w:w="1980"/>
+        <w:gridCol w:w="1980"/>
+        <w:gridCol w:w="1980"/>
+      </w:tblGrid>
+      <w:tr>
+        <w:trPr>
+          <w:tblHeader w:val="true"/>
+        </w:trPr>
+        <w:tc>
+          <w:tcPr/>
+          <w:p>
+            <w:pPr>
+              <w:pStyle w:val="Compact"/>
+              <w:jc w:val="left"/>
+            </w:pPr>
+            <w:r>
+              <w:t xml:space="preserve">Interface (operation)</w:t>
+            </w:r>
+          </w:p>
+        </w:tc>
+        <w:tc>
+          <w:tcPr/>
+          <w:p>
+            <w:pPr>
+              <w:pStyle w:val="Compact"/>
+              <w:jc w:val="left"/>
+            </w:pPr>
+            <w:r>
+              <w:t xml:space="preserve">Direction</w:t>
+            </w:r>
+          </w:p>
+        </w:tc>
+        <w:tc>
+          <w:tcPr/>
+          <w:p>
+            <w:pPr>
+              <w:pStyle w:val="Compact"/>
+              <w:jc w:val="left"/>
+            </w:pPr>
+            <w:r>
+              <w:t xml:space="preserve">Programs that use it</w:t>
+            </w:r>
+          </w:p>
+        </w:tc>
+        <w:tc>
+          <w:tcPr/>
+          <w:p>
+            <w:pPr>
+              <w:pStyle w:val="Compact"/>
+              <w:jc w:val="left"/>
+            </w:pPr>
+            <w:r>
+              <w:t xml:space="preserve"># programs</w:t>
+            </w:r>
+          </w:p>
+        </w:tc>
+      </w:tr>
+      <w:tr>
+        <w:tc>
+          <w:tcPr/>
+          <w:p>
+            <w:pPr>
+              <w:pStyle w:val="Compact"/>
+              <w:jc w:val="left"/>
+            </w:pPr>
+            <w:r>
+              <w:t xml:space="preserve">ASRS Push Message</w:t>
+            </w:r>
+          </w:p>
+        </w:tc>
+        <w:tc>
+          <w:tcPr/>
+          <w:p>
+            <w:pPr>
+              <w:pStyle w:val="Compact"/>
+              <w:jc w:val="left"/>
+            </w:pPr>
+            <w:r>
+              <w:rPr>
+                <w:bCs/>
+                <w:b/>
+              </w:rPr>
+              <w:t xml:space="preserve">push</w:t>
+            </w:r>
+            <w:r>
+              <w:t xml:space="preserve"> </w:t>
+            </w:r>
+            <w:r>
+              <w:t xml:space="preserve">(POST)</w:t>
+            </w:r>
+          </w:p>
+        </w:tc>
+        <w:tc>
+          <w:tcPr/>
+          <w:p>
+            <w:pPr>
+              <w:pStyle w:val="Compact"/>
+              <w:jc w:val="left"/>
+            </w:pPr>
+            <w:r>
+              <w:t xml:space="preserve">7 ×</w:t>
+            </w:r>
+            <w:r>
+              <w:t xml:space="preserve"> </w:t>
+            </w:r>
+            <w:r>
+              <w:rPr>
+                <w:rStyle w:val="VerbatimChar"/>
+              </w:rPr>
+              <w:t xml:space="preserve">ZMM_SQL_ASRS_SAP_PUSH*</w:t>
+            </w:r>
+          </w:p>
+        </w:tc>
+        <w:tc>
+          <w:tcPr/>
+          <w:p>
+            <w:pPr>
+              <w:pStyle w:val="Compact"/>
+              <w:jc w:val="left"/>
+            </w:pPr>
+            <w:r>
+              <w:rPr>
+                <w:bCs/>
+                <w:b/>
+              </w:rPr>
+              <w:t xml:space="preserve">7 (same)</w:t>
+            </w:r>
+          </w:p>
+        </w:tc>
+      </w:tr>
+      <w:tr>
+        <w:tc>
+          <w:tcPr/>
+          <w:p>
+            <w:pPr>
+              <w:pStyle w:val="Compact"/>
+              <w:jc w:val="left"/>
+            </w:pPr>
+            <w:r>
+              <w:t xml:space="preserve">ASRS Get Status</w:t>
+            </w:r>
+          </w:p>
+        </w:tc>
+        <w:tc>
+          <w:tcPr/>
+          <w:p>
+            <w:pPr>
+              <w:pStyle w:val="Compact"/>
+              <w:jc w:val="left"/>
+            </w:pPr>
+            <w:r>
+              <w:rPr>
+                <w:bCs/>
+                <w:b/>
+              </w:rPr>
+              <w:t xml:space="preserve">read</w:t>
+            </w:r>
+            <w:r>
+              <w:t xml:space="preserve"> </w:t>
+            </w:r>
+            <w:r>
+              <w:t xml:space="preserve">(GET)</w:t>
+            </w:r>
+          </w:p>
+        </w:tc>
+        <w:tc>
+          <w:tcPr/>
+          <w:p>
+            <w:pPr>
+              <w:pStyle w:val="Compact"/>
+              <w:jc w:val="left"/>
+            </w:pPr>
+            <w:r>
+              <w:rPr>
+                <w:rStyle w:val="VerbatimChar"/>
+              </w:rPr>
+              <w:t xml:space="preserve">ZMM_ASRS_SAP_INTERFACE</w:t>
+            </w:r>
+          </w:p>
+        </w:tc>
+        <w:tc>
+          <w:tcPr/>
+          <w:p>
+            <w:pPr>
+              <w:pStyle w:val="Compact"/>
+              <w:jc w:val="left"/>
+            </w:pPr>
+            <w:r>
+              <w:t xml:space="preserve">1</w:t>
+            </w:r>
+          </w:p>
+        </w:tc>
+      </w:tr>
+      <w:tr>
+        <w:tc>
+          <w:tcPr/>
+          <w:p>
+            <w:pPr>
+              <w:pStyle w:val="Compact"/>
+              <w:jc w:val="left"/>
+            </w:pPr>
+            <w:r>
+              <w:t xml:space="preserve">TrackWise Push Material</w:t>
+            </w:r>
+          </w:p>
+        </w:tc>
+        <w:tc>
+          <w:tcPr/>
+          <w:p>
+            <w:pPr>
+              <w:pStyle w:val="Compact"/>
+              <w:jc w:val="left"/>
+            </w:pPr>
+            <w:r>
+              <w:rPr>
+                <w:bCs/>
+                <w:b/>
+              </w:rPr>
+              <w:t xml:space="preserve">push</w:t>
+            </w:r>
+            <w:r>
+              <w:t xml:space="preserve"> </w:t>
+            </w:r>
+            <w:r>
+              <w:t xml:space="preserve">(POST)</w:t>
+            </w:r>
+          </w:p>
+        </w:tc>
+        <w:tc>
+          <w:tcPr/>
+          <w:p>
+            <w:pPr>
+              <w:pStyle w:val="Compact"/>
+              <w:jc w:val="left"/>
+            </w:pPr>
+            <w:r>
+              <w:rPr>
+                <w:rStyle w:val="VerbatimChar"/>
+              </w:rPr>
+              <w:t xml:space="preserve">ZMDM_RA_TRACKWISE</w:t>
+            </w:r>
+          </w:p>
+        </w:tc>
+        <w:tc>
+          <w:tcPr/>
+          <w:p>
+            <w:pPr>
+              <w:pStyle w:val="Compact"/>
+              <w:jc w:val="left"/>
+            </w:pPr>
+            <w:r>
+              <w:t xml:space="preserve">1</w:t>
+            </w:r>
+          </w:p>
+        </w:tc>
+      </w:tr>
+      <w:tr>
+        <w:tc>
+          <w:tcPr/>
+          <w:p>
+            <w:pPr>
+              <w:pStyle w:val="Compact"/>
+              <w:jc w:val="left"/>
+            </w:pPr>
+            <w:r>
+              <w:t xml:space="preserve">TrackWise Push Material Detail</w:t>
+            </w:r>
+          </w:p>
+        </w:tc>
+        <w:tc>
+          <w:tcPr/>
+          <w:p>
+            <w:pPr>
+              <w:pStyle w:val="Compact"/>
+              <w:jc w:val="left"/>
+            </w:pPr>
+            <w:r>
+              <w:rPr>
+                <w:bCs/>
+                <w:b/>
+              </w:rPr>
+              <w:t xml:space="preserve">push</w:t>
+            </w:r>
+            <w:r>
+              <w:t xml:space="preserve"> </w:t>
+            </w:r>
+            <w:r>
+              <w:t xml:space="preserve">(POST)</w:t>
+            </w:r>
+          </w:p>
+        </w:tc>
+        <w:tc>
+          <w:tcPr/>
+          <w:p>
+            <w:pPr>
+              <w:pStyle w:val="Compact"/>
+              <w:jc w:val="left"/>
+            </w:pPr>
+            <w:r>
+              <w:rPr>
+                <w:rStyle w:val="VerbatimChar"/>
+              </w:rPr>
+              <w:t xml:space="preserve">ZQM_TRACKWISE</w:t>
+            </w:r>
+          </w:p>
+        </w:tc>
+        <w:tc>
+          <w:tcPr/>
+          <w:p>
+            <w:pPr>
+              <w:pStyle w:val="Compact"/>
+              <w:jc w:val="left"/>
+            </w:pPr>
+            <w:r>
+              <w:t xml:space="preserve">1</w:t>
+            </w:r>
+          </w:p>
+        </w:tc>
+      </w:tr>
+      <w:tr>
+        <w:tc>
+          <w:tcPr/>
+          <w:p>
+            <w:pPr>
+              <w:pStyle w:val="Compact"/>
+              <w:jc w:val="left"/>
+            </w:pPr>
+            <w:r>
+              <w:t xml:space="preserve">TrackWise Push Product Detail</w:t>
+            </w:r>
+          </w:p>
+        </w:tc>
+        <w:tc>
+          <w:tcPr/>
+          <w:p>
+            <w:pPr>
+              <w:pStyle w:val="Compact"/>
+              <w:jc w:val="left"/>
+            </w:pPr>
+            <w:r>
+              <w:rPr>
+                <w:bCs/>
+                <w:b/>
+              </w:rPr>
+              <w:t xml:space="preserve">push</w:t>
+            </w:r>
+            <w:r>
+              <w:t xml:space="preserve"> </w:t>
+            </w:r>
+            <w:r>
+              <w:t xml:space="preserve">(POST)</w:t>
+            </w:r>
+          </w:p>
+        </w:tc>
+        <w:tc>
+          <w:tcPr/>
+          <w:p>
+            <w:pPr>
+              <w:pStyle w:val="Compact"/>
+              <w:jc w:val="left"/>
+            </w:pPr>
+            <w:r>
+              <w:rPr>
+                <w:rStyle w:val="VerbatimChar"/>
+              </w:rPr>
+              <w:t xml:space="preserve">ZQM_TRACKWISE</w:t>
+            </w:r>
+          </w:p>
+        </w:tc>
+        <w:tc>
+          <w:tcPr/>
+          <w:p>
+            <w:pPr>
+              <w:pStyle w:val="Compact"/>
+              <w:jc w:val="left"/>
+            </w:pPr>
+            <w:r>
+              <w:t xml:space="preserve">1</w:t>
+            </w:r>
+          </w:p>
+        </w:tc>
+      </w:tr>
+      <w:tr>
+        <w:tc>
+          <w:tcPr/>
+          <w:p>
+            <w:pPr>
+              <w:pStyle w:val="Compact"/>
+              <w:jc w:val="left"/>
+            </w:pPr>
+            <w:r>
+              <w:t xml:space="preserve">TrackWise Upsert Plant</w:t>
+            </w:r>
+          </w:p>
+        </w:tc>
+        <w:tc>
+          <w:tcPr/>
+          <w:p>
+            <w:pPr>
+              <w:pStyle w:val="Compact"/>
+              <w:jc w:val="left"/>
+            </w:pPr>
+            <w:r>
+              <w:t xml:space="preserve">read + push</w:t>
+            </w:r>
+          </w:p>
+        </w:tc>
+        <w:tc>
+          <w:tcPr/>
+          <w:p>
+            <w:pPr>
+              <w:pStyle w:val="Compact"/>
+              <w:jc w:val="left"/>
+            </w:pPr>
+            <w:r>
+              <w:rPr>
+                <w:rStyle w:val="VerbatimChar"/>
+              </w:rPr>
+              <w:t xml:space="preserve">ZQM_TRACKWISE</w:t>
+            </w:r>
+          </w:p>
+        </w:tc>
+        <w:tc>
+          <w:tcPr/>
+          <w:p>
+            <w:pPr>
+              <w:pStyle w:val="Compact"/>
+              <w:jc w:val="left"/>
+            </w:pPr>
+            <w:r>
+              <w:t xml:space="preserve">1</w:t>
+            </w:r>
+          </w:p>
+        </w:tc>
+      </w:tr>
+    </w:tbl>
+    <w:p>
+      <w:pPr>
+        <w:pStyle w:val="BodyText"/>
+      </w:pPr>
+      <w:r>
+        <w:rPr>
+          <w:bCs/>
+          <w:b/>
+        </w:rPr>
+        <w:t xml:space="preserve">Only one set is truly identical: the 7 ASRS</w:t>
+      </w:r>
+      <w:r>
+        <w:rPr>
+          <w:bCs/>
+          <w:b/>
+        </w:rPr>
+        <w:t xml:space="preserve"> </w:t>
+      </w:r>
+      <w:r>
+        <w:rPr>
+          <w:bCs/>
+          <w:b/>
+        </w:rPr>
+        <w:t xml:space="preserve">“</w:t>
+      </w:r>
+      <w:r>
+        <w:rPr>
+          <w:bCs/>
+          <w:b/>
+        </w:rPr>
+        <w:t xml:space="preserve">push</w:t>
+      </w:r>
+      <w:r>
+        <w:rPr>
+          <w:bCs/>
+          <w:b/>
+        </w:rPr>
+        <w:t xml:space="preserve">”</w:t>
+      </w:r>
+      <w:r>
+        <w:rPr>
+          <w:bCs/>
+          <w:b/>
+        </w:rPr>
+        <w:t xml:space="preserve"> </w:t>
+      </w:r>
+      <w:r>
+        <w:rPr>
+          <w:bCs/>
+          <w:b/>
+        </w:rPr>
+        <w:t xml:space="preserve">programs → 1 interface.</w:t>
+      </w:r>
+      <w:r>
+        <w:t xml:space="preserve"> </w:t>
+      </w:r>
+      <w:r>
+        <w:t xml:space="preserve">The other four programs each</w:t>
+      </w:r>
+      <w:r>
+        <w:t xml:space="preserve"> </w:t>
+      </w:r>
+      <w:r>
+        <w:t xml:space="preserve">have their own operation. So:</w:t>
+      </w:r>
+      <w:r>
+        <w:t xml:space="preserve"> </w:t>
+      </w:r>
+      <w:r>
+        <w:rPr>
+          <w:bCs/>
+          <w:b/>
+        </w:rPr>
+        <w:t xml:space="preserve">10 programs → 6 operations → 2 CPI APIs (ASRS, TrackWise).</w:t>
+      </w:r>
+    </w:p>
     <w:bookmarkEnd w:id="45"/>
+    <w:bookmarkStart w:id="46" w:name="Xdb6fbf04d4d7b3926266f36405a385b968e9a1f"/>
+    <w:p>
+      <w:pPr>
+        <w:pStyle w:val="Heading2"/>
+      </w:pPr>
+      <w:r>
+        <w:t xml:space="preserve">8.6 Reads (GET) vs. pushes (POST) — why a GET is needed, and where the fetch is</w:t>
+      </w:r>
+    </w:p>
+    <w:p>
+      <w:pPr>
+        <w:pStyle w:val="FirstParagraph"/>
+      </w:pPr>
+      <w:r>
+        <w:t xml:space="preserve">Most operations only</w:t>
+      </w:r>
+      <w:r>
+        <w:t xml:space="preserve"> </w:t>
+      </w:r>
+      <w:r>
+        <w:rPr>
+          <w:bCs/>
+          <w:b/>
+        </w:rPr>
+        <w:t xml:space="preserve">send</w:t>
+      </w:r>
+      <w:r>
+        <w:t xml:space="preserve"> </w:t>
+      </w:r>
+      <w:r>
+        <w:t xml:space="preserve">data outward (INSERT → POST).</w:t>
+      </w:r>
+      <w:r>
+        <w:t xml:space="preserve"> </w:t>
+      </w:r>
+      <w:r>
+        <w:rPr>
+          <w:bCs/>
+          <w:b/>
+        </w:rPr>
+        <w:t xml:space="preserve">Two</w:t>
+      </w:r>
+      <w:r>
+        <w:t xml:space="preserve"> </w:t>
+      </w:r>
+      <w:r>
+        <w:t xml:space="preserve">operations</w:t>
+      </w:r>
+      <w:r>
+        <w:t xml:space="preserve"> </w:t>
+      </w:r>
+      <w:r>
+        <w:rPr>
+          <w:bCs/>
+          <w:b/>
+        </w:rPr>
+        <w:t xml:space="preserve">read</w:t>
+      </w:r>
+      <w:r>
+        <w:t xml:space="preserve"> </w:t>
+      </w:r>
+      <w:r>
+        <w:t xml:space="preserve">from the external</w:t>
+      </w:r>
+      <w:r>
+        <w:t xml:space="preserve"> </w:t>
+      </w:r>
+      <w:r>
+        <w:t xml:space="preserve">system, which is why a GET is required (data flows external → SAP):</w:t>
+      </w:r>
+    </w:p>
+    <w:p>
+      <w:pPr>
+        <w:pStyle w:val="BodyText"/>
+      </w:pPr>
+      <w:r>
+        <w:rPr>
+          <w:bCs/>
+          <w:b/>
+        </w:rPr>
+        <w:t xml:space="preserve">(1)</w:t>
+      </w:r>
+      <w:r>
+        <w:rPr>
+          <w:bCs/>
+          <w:b/>
+        </w:rPr>
+        <w:t xml:space="preserve"> </w:t>
+      </w:r>
+      <w:r>
+        <w:rPr>
+          <w:rStyle w:val="VerbatimChar"/>
+          <w:bCs/>
+          <w:b/>
+        </w:rPr>
+        <w:t xml:space="preserve">ZMM_ASRS_SAP_INTERFACE</w:t>
+      </w:r>
+      <w:r>
+        <w:rPr>
+          <w:bCs/>
+          <w:b/>
+        </w:rPr>
+        <w:t xml:space="preserve"> </w:t>
+      </w:r>
+      <w:r>
+        <w:rPr>
+          <w:bCs/>
+          <w:b/>
+        </w:rPr>
+        <w:t xml:space="preserve">— this program contains an actual fetch.</w:t>
+      </w:r>
+      <w:r>
+        <w:t xml:space="preserve"> </w:t>
+      </w:r>
+      <w:r>
+        <w:t xml:space="preserve">It is a status-monitor report: after</w:t>
+      </w:r>
+      <w:r>
+        <w:t xml:space="preserve"> </w:t>
+      </w:r>
+      <w:r>
+        <w:t xml:space="preserve">messages are pushed, it opens a cursor and</w:t>
+      </w:r>
+      <w:r>
+        <w:t xml:space="preserve"> </w:t>
+      </w:r>
+      <w:r>
+        <w:rPr>
+          <w:bCs/>
+          <w:b/>
+        </w:rPr>
+        <w:t xml:space="preserve">fetches the result back</w:t>
+      </w:r>
+      <w:r>
+        <w:t xml:space="preserve"> </w:t>
+      </w:r>
+      <w:r>
+        <w:t xml:space="preserve">from the ASRS database:</w:t>
+      </w:r>
+    </w:p>
+    <w:p>
+      <w:pPr>
+        <w:pStyle w:val="SourceCode"/>
+      </w:pPr>
+      <w:r>
+        <w:rPr>
+          <w:rStyle w:val="VerbatimChar"/>
+        </w:rPr>
+        <w:t xml:space="preserve">EXEC SQL. OPEN dbcur FOR</w:t>
+      </w:r>
+      <w:r>
+        <w:br/>
+      </w:r>
+      <w:r>
+        <w:rPr>
+          <w:rStyle w:val="VerbatimChar"/>
+        </w:rPr>
+        <w:t xml:space="preserve">  SELECT MSG_ERR, MSG_STAT FROM host_to_wms WHERE MSG_REC_ID = :ls_asrs-MSG_REC_ID</w:t>
+      </w:r>
+      <w:r>
+        <w:br/>
+      </w:r>
+      <w:r>
+        <w:rPr>
+          <w:rStyle w:val="VerbatimChar"/>
+        </w:rPr>
+        <w:t xml:space="preserve">ENDEXEC.</w:t>
+      </w:r>
+      <w:r>
+        <w:br/>
+      </w:r>
+      <w:r>
+        <w:rPr>
+          <w:rStyle w:val="VerbatimChar"/>
+        </w:rPr>
+        <w:t xml:space="preserve">EXEC SQL. FETCH NEXT dbcur INTO :ls_asrs-MSG_ERR, :ls_asrs-MSG_STAT ENDEXEC.   "← the fetch</w:t>
+      </w:r>
+      <w:r>
+        <w:br/>
+      </w:r>
+      <w:r>
+        <w:rPr>
+          <w:rStyle w:val="VerbatimChar"/>
+        </w:rPr>
+        <w:t xml:space="preserve">EXEC SQL. CLOSE dbcur ENDEXEC.</w:t>
+      </w:r>
+    </w:p>
+    <w:p>
+      <w:pPr>
+        <w:pStyle w:val="FirstParagraph"/>
+      </w:pPr>
+      <w:r>
+        <w:t xml:space="preserve">The</w:t>
+      </w:r>
+      <w:r>
+        <w:t xml:space="preserve"> </w:t>
+      </w:r>
+      <w:r>
+        <w:rPr>
+          <w:rStyle w:val="VerbatimChar"/>
+        </w:rPr>
+        <w:t xml:space="preserve">FETCH NEXT … INTO …</w:t>
+      </w:r>
+      <w:r>
+        <w:t xml:space="preserve"> </w:t>
+      </w:r>
+      <w:r>
+        <w:t xml:space="preserve">reads the processing status (</w:t>
+      </w:r>
+      <w:r>
+        <w:rPr>
+          <w:rStyle w:val="VerbatimChar"/>
+        </w:rPr>
+        <w:t xml:space="preserve">MSG_ERR</w:t>
+      </w:r>
+      <w:r>
+        <w:t xml:space="preserve">,</w:t>
+      </w:r>
+      <w:r>
+        <w:t xml:space="preserve"> </w:t>
+      </w:r>
+      <w:r>
+        <w:rPr>
+          <w:rStyle w:val="VerbatimChar"/>
+        </w:rPr>
+        <w:t xml:space="preserve">MSG_STAT</w:t>
+      </w:r>
+      <w:r>
+        <w:t xml:space="preserve">) back so the ALV monitor can show</w:t>
+      </w:r>
+      <w:r>
+        <w:t xml:space="preserve"> </w:t>
+      </w:r>
+      <w:r>
+        <w:t xml:space="preserve">“</w:t>
+      </w:r>
+      <w:r>
+        <w:t xml:space="preserve">received / processed</w:t>
+      </w:r>
+      <w:r>
+        <w:t xml:space="preserve">”</w:t>
+      </w:r>
+      <w:r>
+        <w:t xml:space="preserve"> </w:t>
+      </w:r>
+      <w:r>
+        <w:t xml:space="preserve">per message. → replaced by the</w:t>
+      </w:r>
+      <w:r>
+        <w:t xml:space="preserve"> </w:t>
+      </w:r>
+      <w:r>
+        <w:rPr>
+          <w:bCs/>
+          <w:b/>
+        </w:rPr>
+        <w:t xml:space="preserve">GET</w:t>
+      </w:r>
+      <w:r>
+        <w:t xml:space="preserve"> </w:t>
+      </w:r>
+      <w:r>
+        <w:rPr>
+          <w:iCs/>
+          <w:i/>
+        </w:rPr>
+        <w:t xml:space="preserve">ASRS Get Status</w:t>
+      </w:r>
+      <w:r>
+        <w:t xml:space="preserve"> </w:t>
+      </w:r>
+      <w:r>
+        <w:t xml:space="preserve">(§4).</w:t>
+      </w:r>
+    </w:p>
+    <w:p>
+      <w:pPr>
+        <w:pStyle w:val="BodyText"/>
+      </w:pPr>
+      <w:r>
+        <w:rPr>
+          <w:bCs/>
+          <w:b/>
+        </w:rPr>
+        <w:t xml:space="preserve">(2)</w:t>
+      </w:r>
+      <w:r>
+        <w:rPr>
+          <w:bCs/>
+          <w:b/>
+        </w:rPr>
+        <w:t xml:space="preserve"> </w:t>
+      </w:r>
+      <w:r>
+        <w:rPr>
+          <w:rStyle w:val="VerbatimChar"/>
+          <w:bCs/>
+          <w:b/>
+        </w:rPr>
+        <w:t xml:space="preserve">ZQM_TRACKWISE</w:t>
+      </w:r>
+      <w:r>
+        <w:rPr>
+          <w:bCs/>
+          <w:b/>
+        </w:rPr>
+        <w:t xml:space="preserve"> </w:t>
+      </w:r>
+      <w:r>
+        <w:rPr>
+          <w:bCs/>
+          <w:b/>
+        </w:rPr>
+        <w:t xml:space="preserve">— plant existence check (a single-row read):</w:t>
+      </w:r>
+    </w:p>
+    <w:p>
+      <w:pPr>
+        <w:pStyle w:val="SourceCode"/>
+      </w:pPr>
+      <w:r>
+        <w:rPr>
+          <w:rStyle w:val="VerbatimChar"/>
+        </w:rPr>
+        <w:t xml:space="preserve">EXEC SQL. SELECT Plant_Code, Plant_Name INTO :wa_plant</w:t>
+      </w:r>
+      <w:r>
+        <w:br/>
+      </w:r>
+      <w:r>
+        <w:rPr>
+          <w:rStyle w:val="VerbatimChar"/>
+        </w:rPr>
+        <w:t xml:space="preserve">  FROM ztw_plnt_det WHERE Plant_Code = :gv_plant ENDEXEC.</w:t>
+      </w:r>
+    </w:p>
+    <w:p>
+      <w:pPr>
+        <w:pStyle w:val="FirstParagraph"/>
+      </w:pPr>
+      <w:r>
+        <w:t xml:space="preserve">This reads one row to decide whether the plant already exists before inserting it → the</w:t>
+      </w:r>
+      <w:r>
+        <w:t xml:space="preserve"> </w:t>
+      </w:r>
+      <w:r>
+        <w:rPr>
+          <w:bCs/>
+          <w:b/>
+        </w:rPr>
+        <w:t xml:space="preserve">read half of the</w:t>
+      </w:r>
+      <w:r>
+        <w:rPr>
+          <w:bCs/>
+          <w:b/>
+        </w:rPr>
+        <w:t xml:space="preserve"> </w:t>
+      </w:r>
+      <w:r>
+        <w:rPr>
+          <w:bCs/>
+          <w:b/>
+        </w:rPr>
+        <w:t xml:space="preserve">Upsert Plant</w:t>
+      </w:r>
+      <w:r>
+        <w:t xml:space="preserve"> </w:t>
+      </w:r>
+      <w:r>
+        <w:t xml:space="preserve">operation (§6).</w:t>
+      </w:r>
+    </w:p>
+    <w:p>
+      <w:pPr>
+        <w:pStyle w:val="BodyText"/>
+      </w:pPr>
+      <w:r>
+        <w:rPr>
+          <w:bCs/>
+          <w:b/>
+        </w:rPr>
+        <w:t xml:space="preserve">Everything else is push-only</w:t>
+      </w:r>
+      <w:r>
+        <w:t xml:space="preserve"> </w:t>
+      </w:r>
+      <w:r>
+        <w:t xml:space="preserve">— there is no other fetch anywhere in the 10 programs. So of the 6 operations:</w:t>
+      </w:r>
+      <w:r>
+        <w:t xml:space="preserve"> </w:t>
+      </w:r>
+      <w:r>
+        <w:rPr>
+          <w:bCs/>
+          <w:b/>
+        </w:rPr>
+        <w:t xml:space="preserve">4 are push (POST)</w:t>
+      </w:r>
+      <w:r>
+        <w:t xml:space="preserve"> </w:t>
+      </w:r>
+      <w:r>
+        <w:t xml:space="preserve">and</w:t>
+      </w:r>
+      <w:r>
+        <w:t xml:space="preserve"> </w:t>
+      </w:r>
+      <w:r>
+        <w:rPr>
+          <w:bCs/>
+          <w:b/>
+        </w:rPr>
+        <w:t xml:space="preserve">2 involve a read (GET)</w:t>
+      </w:r>
+      <w:r>
+        <w:t xml:space="preserve"> </w:t>
+      </w:r>
+      <w:r>
+        <w:t xml:space="preserve">— one true cursor fetch (status monitor) and one</w:t>
+      </w:r>
+      <w:r>
+        <w:t xml:space="preserve"> </w:t>
+      </w:r>
+      <w:r>
+        <w:t xml:space="preserve">existence check (plant upsert).</w:t>
+      </w:r>
+    </w:p>
+    <w:bookmarkEnd w:id="46"/>
+    <w:bookmarkEnd w:id="47"/>
     <w:sectPr/>
     <w:pgMar w:top="1008" w:right="864" w:bottom="1008" w:left="864" w:header="504" w:footer="504" w:gutter="0"/>
   </w:body>

</xml_diff>

<commit_message>
Add Appendix A: program-wise SQL inventory (which program has which query)
List every query per program with Keep/Replace and the target interface, for
all 10 programs: the 7 ASRS push programs (verified identical query set -> C-1),
ZMM_ASRS_SAP_INTERFACE, ZMDM_RA_TRACKWISE, and ZQM_TRACKWISE. Regenerate the
Word document.

Co-Authored-By: Claude Opus 4.8 <noreply@anthropic.com>
Claude-Session: https://claude.ai/code/session_01Q4LHaHQmBW12fv5735PcEf
</commit_message>
<xml_diff>
--- a/interface/ASRS_TrackWise_Migration_CLEAN.docx
+++ b/interface/ASRS_TrackWise_Migration_CLEAN.docx
@@ -12150,6 +12150,2053 @@
     </w:p>
     <w:bookmarkEnd w:id="46"/>
     <w:bookmarkEnd w:id="47"/>
+    <w:bookmarkStart w:id="52" w:name="X14c55b8bb16e5b78371ed70df6f2b3ecea27c47"/>
+    <w:p>
+      <w:pPr>
+        <w:pStyle w:val="Heading1"/>
+      </w:pPr>
+      <w:r>
+        <w:t xml:space="preserve">Appendix A — Program-wise SQL inventory (which program has which query)</w:t>
+      </w:r>
+    </w:p>
+    <w:p>
+      <w:pPr>
+        <w:pStyle w:val="FirstParagraph"/>
+      </w:pPr>
+      <w:r>
+        <w:t xml:space="preserve">Every query, listed per program.</w:t>
+      </w:r>
+      <w:r>
+        <w:t xml:space="preserve"> </w:t>
+      </w:r>
+      <w:r>
+        <w:rPr>
+          <w:bCs/>
+          <w:b/>
+        </w:rPr>
+        <w:t xml:space="preserve">Keep</w:t>
+      </w:r>
+      <w:r>
+        <w:t xml:space="preserve"> </w:t>
+      </w:r>
+      <w:r>
+        <w:t xml:space="preserve">= Open SQL on SAP tables (no change).</w:t>
+      </w:r>
+      <w:r>
+        <w:t xml:space="preserve"> </w:t>
+      </w:r>
+      <w:r>
+        <w:rPr>
+          <w:bCs/>
+          <w:b/>
+        </w:rPr>
+        <w:t xml:space="preserve">Replace</w:t>
+      </w:r>
+      <w:r>
+        <w:t xml:space="preserve"> </w:t>
+      </w:r>
+      <w:r>
+        <w:t xml:space="preserve">= Native</w:t>
+      </w:r>
+      <w:r>
+        <w:t xml:space="preserve"> </w:t>
+      </w:r>
+      <w:r>
+        <w:rPr>
+          <w:rStyle w:val="VerbatimChar"/>
+        </w:rPr>
+        <w:t xml:space="preserve">EXEC SQL</w:t>
+      </w:r>
+      <w:r>
+        <w:t xml:space="preserve"> </w:t>
+      </w:r>
+      <w:r>
+        <w:t xml:space="preserve">on the external SQL Server DB → CPI interface.</w:t>
+      </w:r>
+    </w:p>
+    <w:bookmarkStart w:id="48" w:name="X5c94848ddcbe68d95585e94beb2ad8b144c6458"/>
+    <w:p>
+      <w:pPr>
+        <w:pStyle w:val="Heading2"/>
+      </w:pPr>
+      <w:r>
+        <w:t xml:space="preserve">A.1 The 7 ASRS push programs — identical queries</w:t>
+      </w:r>
+    </w:p>
+    <w:p>
+      <w:pPr>
+        <w:pStyle w:val="FirstParagraph"/>
+      </w:pPr>
+      <w:r>
+        <w:t xml:space="preserve">These seven programs have the</w:t>
+      </w:r>
+      <w:r>
+        <w:t xml:space="preserve"> </w:t>
+      </w:r>
+      <w:r>
+        <w:rPr>
+          <w:bCs/>
+          <w:b/>
+        </w:rPr>
+        <w:t xml:space="preserve">exact same SQL</w:t>
+      </w:r>
+      <w:r>
+        <w:t xml:space="preserve"> </w:t>
+      </w:r>
+      <w:r>
+        <w:t xml:space="preserve">(verified in code: same</w:t>
+      </w:r>
+      <w:r>
+        <w:t xml:space="preserve"> </w:t>
+      </w:r>
+      <w:r>
+        <w:rPr>
+          <w:rStyle w:val="VerbatimChar"/>
+        </w:rPr>
+        <w:t xml:space="preserve">SELECT-OPTIONS s_type</w:t>
+      </w:r>
+      <w:r>
+        <w:t xml:space="preserve">, same</w:t>
+      </w:r>
+      <w:r>
+        <w:t xml:space="preserve"> </w:t>
+      </w:r>
+      <w:r>
+        <w:rPr>
+          <w:rStyle w:val="VerbatimChar"/>
+        </w:rPr>
+        <w:t xml:space="preserve">WHERE msg_trans_type IN s_type AND trf_status = 'N'</w:t>
+      </w:r>
+      <w:r>
+        <w:t xml:space="preserve">, same</w:t>
+      </w:r>
+      <w:r>
+        <w:t xml:space="preserve"> </w:t>
+      </w:r>
+      <w:r>
+        <w:rPr>
+          <w:rStyle w:val="VerbatimChar"/>
+        </w:rPr>
+        <w:t xml:space="preserve">INSERT INTO host_to_wms</w:t>
+      </w:r>
+      <w:r>
+        <w:t xml:space="preserve">, same</w:t>
+      </w:r>
+      <w:r>
+        <w:t xml:space="preserve"> </w:t>
+      </w:r>
+      <w:r>
+        <w:rPr>
+          <w:rStyle w:val="VerbatimChar"/>
+        </w:rPr>
+        <w:t xml:space="preserve">MODIFY</w:t>
+      </w:r>
+      <w:r>
+        <w:t xml:space="preserve">). They</w:t>
+      </w:r>
+      <w:r>
+        <w:t xml:space="preserve"> </w:t>
+      </w:r>
+      <w:r>
+        <w:t xml:space="preserve">differ only by the transaction type chosen at run time (indicated by the program name).</w:t>
+      </w:r>
+      <w:r>
+        <w:t xml:space="preserve"> </w:t>
+      </w:r>
+      <w:r>
+        <w:rPr>
+          <w:bCs/>
+          <w:b/>
+        </w:rPr>
+        <w:t xml:space="preserve">All 7 → interface C-1.</w:t>
+      </w:r>
+    </w:p>
+    <w:p>
+      <w:pPr>
+        <w:pStyle w:val="BodyText"/>
+      </w:pPr>
+      <w:r>
+        <w:t xml:space="preserve">Programs:</w:t>
+      </w:r>
+      <w:r>
+        <w:t xml:space="preserve"> </w:t>
+      </w:r>
+      <w:r>
+        <w:rPr>
+          <w:rStyle w:val="VerbatimChar"/>
+        </w:rPr>
+        <w:t xml:space="preserve">ZMM_SQL_ASRS_SAP_PUSH</w:t>
+      </w:r>
+      <w:r>
+        <w:t xml:space="preserve"> </w:t>
+      </w:r>
+      <w:r>
+        <w:t xml:space="preserve">·</w:t>
+      </w:r>
+      <w:r>
+        <w:t xml:space="preserve"> </w:t>
+      </w:r>
+      <w:r>
+        <w:rPr>
+          <w:rStyle w:val="VerbatimChar"/>
+        </w:rPr>
+        <w:t xml:space="preserve">…_COR</w:t>
+      </w:r>
+      <w:r>
+        <w:t xml:space="preserve"> </w:t>
+      </w:r>
+      <w:r>
+        <w:t xml:space="preserve">·</w:t>
+      </w:r>
+      <w:r>
+        <w:t xml:space="preserve"> </w:t>
+      </w:r>
+      <w:r>
+        <w:rPr>
+          <w:rStyle w:val="VerbatimChar"/>
+        </w:rPr>
+        <w:t xml:space="preserve">…_DISPENSE</w:t>
+      </w:r>
+      <w:r>
+        <w:t xml:space="preserve"> </w:t>
+      </w:r>
+      <w:r>
+        <w:t xml:space="preserve">·</w:t>
+      </w:r>
+      <w:r>
+        <w:t xml:space="preserve"> </w:t>
+      </w:r>
+      <w:r>
+        <w:rPr>
+          <w:rStyle w:val="VerbatimChar"/>
+        </w:rPr>
+        <w:t xml:space="preserve">…_IN</w:t>
+      </w:r>
+      <w:r>
+        <w:t xml:space="preserve"> </w:t>
+      </w:r>
+      <w:r>
+        <w:t xml:space="preserve">·</w:t>
+      </w:r>
+      <w:r>
+        <w:t xml:space="preserve"> </w:t>
+      </w:r>
+      <w:r>
+        <w:rPr>
+          <w:rStyle w:val="VerbatimChar"/>
+        </w:rPr>
+        <w:t xml:space="preserve">…_MAT</w:t>
+      </w:r>
+      <w:r>
+        <w:t xml:space="preserve"> </w:t>
+      </w:r>
+      <w:r>
+        <w:t xml:space="preserve">·</w:t>
+      </w:r>
+      <w:r>
+        <w:t xml:space="preserve"> </w:t>
+      </w:r>
+      <w:r>
+        <w:rPr>
+          <w:rStyle w:val="VerbatimChar"/>
+        </w:rPr>
+        <w:t xml:space="preserve">…_OUT</w:t>
+      </w:r>
+      <w:r>
+        <w:t xml:space="preserve"> </w:t>
+      </w:r>
+      <w:r>
+        <w:t xml:space="preserve">·</w:t>
+      </w:r>
+      <w:r>
+        <w:t xml:space="preserve"> </w:t>
+      </w:r>
+      <w:r>
+        <w:rPr>
+          <w:rStyle w:val="VerbatimChar"/>
+        </w:rPr>
+        <w:t xml:space="preserve">…_PARFULL</w:t>
+      </w:r>
+      <w:r>
+        <w:t xml:space="preserve"> </w:t>
+      </w:r>
+      <w:r>
+        <w:t xml:space="preserve">(intended for the</w:t>
+      </w:r>
+      <w:r>
+        <w:t xml:space="preserve"> </w:t>
+      </w:r>
+      <w:r>
+        <w:rPr>
+          <w:rStyle w:val="VerbatimChar"/>
+        </w:rPr>
+        <w:t xml:space="preserve">COR / DIS / IN / MAT / OUT / PSCR…</w:t>
+      </w:r>
+      <w:r>
+        <w:t xml:space="preserve"> </w:t>
+      </w:r>
+      <w:r>
+        <w:t xml:space="preserve">transaction types respectively).</w:t>
+      </w:r>
+    </w:p>
+    <w:tbl>
+      <w:tblPr>
+        <w:tblStyle w:val="Table"/>
+        <w:tblW w:type="pct" w:w="5000"/>
+        <w:tblLook w:firstRow="1" w:lastRow="0" w:firstColumn="0" w:lastColumn="0" w:noHBand="0" w:noVBand="0" w:val="0020"/>
+        <w:jc w:val="start"/>
+      </w:tblPr>
+      <w:tblGrid>
+        <w:gridCol w:w="1980"/>
+        <w:gridCol w:w="1980"/>
+        <w:gridCol w:w="1980"/>
+        <w:gridCol w:w="1980"/>
+      </w:tblGrid>
+      <w:tr>
+        <w:trPr>
+          <w:tblHeader w:val="true"/>
+        </w:trPr>
+        <w:tc>
+          <w:tcPr/>
+          <w:p>
+            <w:pPr>
+              <w:pStyle w:val="Compact"/>
+              <w:jc w:val="left"/>
+            </w:pPr>
+            <w:r>
+              <w:t xml:space="preserve">#</w:t>
+            </w:r>
+          </w:p>
+        </w:tc>
+        <w:tc>
+          <w:tcPr/>
+          <w:p>
+            <w:pPr>
+              <w:pStyle w:val="Compact"/>
+              <w:jc w:val="left"/>
+            </w:pPr>
+            <w:r>
+              <w:t xml:space="preserve">SQL statement (each of the 7 programs)</w:t>
+            </w:r>
+          </w:p>
+        </w:tc>
+        <w:tc>
+          <w:tcPr/>
+          <w:p>
+            <w:pPr>
+              <w:pStyle w:val="Compact"/>
+              <w:jc w:val="left"/>
+            </w:pPr>
+            <w:r>
+              <w:t xml:space="preserve">Action</w:t>
+            </w:r>
+          </w:p>
+        </w:tc>
+        <w:tc>
+          <w:tcPr/>
+          <w:p>
+            <w:pPr>
+              <w:pStyle w:val="Compact"/>
+              <w:jc w:val="left"/>
+            </w:pPr>
+            <w:r>
+              <w:t xml:space="preserve">Interface</w:t>
+            </w:r>
+          </w:p>
+        </w:tc>
+      </w:tr>
+      <w:tr>
+        <w:tc>
+          <w:tcPr/>
+          <w:p>
+            <w:pPr>
+              <w:pStyle w:val="Compact"/>
+              <w:jc w:val="left"/>
+            </w:pPr>
+            <w:r>
+              <w:t xml:space="preserve">1</w:t>
+            </w:r>
+          </w:p>
+        </w:tc>
+        <w:tc>
+          <w:tcPr/>
+          <w:p>
+            <w:pPr>
+              <w:pStyle w:val="Compact"/>
+              <w:jc w:val="left"/>
+            </w:pPr>
+            <w:r>
+              <w:rPr>
+                <w:rStyle w:val="VerbatimChar"/>
+              </w:rPr>
+              <w:t xml:space="preserve">SELECT * FROM zmm_dbcon_asrs INTO TABLE gt_con</w:t>
+            </w:r>
+          </w:p>
+        </w:tc>
+        <w:tc>
+          <w:tcPr/>
+          <w:p>
+            <w:pPr>
+              <w:pStyle w:val="Compact"/>
+              <w:jc w:val="left"/>
+            </w:pPr>
+            <w:r>
+              <w:t xml:space="preserve">Keep</w:t>
+            </w:r>
+          </w:p>
+        </w:tc>
+        <w:tc>
+          <w:tcPr/>
+          <w:p>
+            <w:pPr>
+              <w:pStyle w:val="Compact"/>
+              <w:jc w:val="left"/>
+            </w:pPr>
+            <w:r>
+              <w:t xml:space="preserve">—</w:t>
+            </w:r>
+          </w:p>
+        </w:tc>
+      </w:tr>
+      <w:tr>
+        <w:tc>
+          <w:tcPr/>
+          <w:p>
+            <w:pPr>
+              <w:pStyle w:val="Compact"/>
+              <w:jc w:val="left"/>
+            </w:pPr>
+            <w:r>
+              <w:t xml:space="preserve">2</w:t>
+            </w:r>
+          </w:p>
+        </w:tc>
+        <w:tc>
+          <w:tcPr/>
+          <w:p>
+            <w:pPr>
+              <w:pStyle w:val="Compact"/>
+              <w:jc w:val="left"/>
+            </w:pPr>
+            <w:r>
+              <w:rPr>
+                <w:rStyle w:val="VerbatimChar"/>
+              </w:rPr>
+              <w:t xml:space="preserve">SELECT * FROM zmm_asrs … WHERE msg_trans_type IN s_type AND trf_status = 'N'</w:t>
+            </w:r>
+          </w:p>
+        </w:tc>
+        <w:tc>
+          <w:tcPr/>
+          <w:p>
+            <w:pPr>
+              <w:pStyle w:val="Compact"/>
+              <w:jc w:val="left"/>
+            </w:pPr>
+            <w:r>
+              <w:t xml:space="preserve">Keep</w:t>
+            </w:r>
+          </w:p>
+        </w:tc>
+        <w:tc>
+          <w:tcPr/>
+          <w:p>
+            <w:pPr>
+              <w:pStyle w:val="Compact"/>
+              <w:jc w:val="left"/>
+            </w:pPr>
+            <w:r>
+              <w:t xml:space="preserve">—</w:t>
+            </w:r>
+          </w:p>
+        </w:tc>
+      </w:tr>
+      <w:tr>
+        <w:tc>
+          <w:tcPr/>
+          <w:p>
+            <w:pPr>
+              <w:pStyle w:val="Compact"/>
+              <w:jc w:val="left"/>
+            </w:pPr>
+            <w:r>
+              <w:t xml:space="preserve">3</w:t>
+            </w:r>
+          </w:p>
+        </w:tc>
+        <w:tc>
+          <w:tcPr/>
+          <w:p>
+            <w:pPr>
+              <w:pStyle w:val="Compact"/>
+              <w:jc w:val="left"/>
+            </w:pPr>
+            <w:r>
+              <w:rPr>
+                <w:rStyle w:val="VerbatimChar"/>
+              </w:rPr>
+              <w:t xml:space="preserve">EXEC SQL CONNECT / SET / GET / DISCONNECT :dbcon</w:t>
+            </w:r>
+          </w:p>
+        </w:tc>
+        <w:tc>
+          <w:tcPr/>
+          <w:p>
+            <w:pPr>
+              <w:pStyle w:val="Compact"/>
+              <w:jc w:val="left"/>
+            </w:pPr>
+            <w:r>
+              <w:t xml:space="preserve">Replace</w:t>
+            </w:r>
+          </w:p>
+        </w:tc>
+        <w:tc>
+          <w:tcPr/>
+          <w:p>
+            <w:pPr>
+              <w:pStyle w:val="Compact"/>
+              <w:jc w:val="left"/>
+            </w:pPr>
+            <w:r>
+              <w:t xml:space="preserve">(destination)</w:t>
+            </w:r>
+          </w:p>
+        </w:tc>
+      </w:tr>
+      <w:tr>
+        <w:tc>
+          <w:tcPr/>
+          <w:p>
+            <w:pPr>
+              <w:pStyle w:val="Compact"/>
+              <w:jc w:val="left"/>
+            </w:pPr>
+            <w:r>
+              <w:t xml:space="preserve">4</w:t>
+            </w:r>
+          </w:p>
+        </w:tc>
+        <w:tc>
+          <w:tcPr/>
+          <w:p>
+            <w:pPr>
+              <w:pStyle w:val="Compact"/>
+              <w:jc w:val="left"/>
+            </w:pPr>
+            <w:r>
+              <w:rPr>
+                <w:rStyle w:val="VerbatimChar"/>
+              </w:rPr>
+              <w:t xml:space="preserve">EXEC SQL INSERT INTO host_to_wms ( 29 cols )</w:t>
+            </w:r>
+          </w:p>
+        </w:tc>
+        <w:tc>
+          <w:tcPr/>
+          <w:p>
+            <w:pPr>
+              <w:pStyle w:val="Compact"/>
+              <w:jc w:val="left"/>
+            </w:pPr>
+            <w:r>
+              <w:rPr>
+                <w:bCs/>
+                <w:b/>
+              </w:rPr>
+              <w:t xml:space="preserve">Replace</w:t>
+            </w:r>
+          </w:p>
+        </w:tc>
+        <w:tc>
+          <w:tcPr/>
+          <w:p>
+            <w:pPr>
+              <w:pStyle w:val="Compact"/>
+              <w:jc w:val="left"/>
+            </w:pPr>
+            <w:r>
+              <w:rPr>
+                <w:bCs/>
+                <w:b/>
+              </w:rPr>
+              <w:t xml:space="preserve">C-1</w:t>
+            </w:r>
+            <w:r>
+              <w:t xml:space="preserve"> </w:t>
+            </w:r>
+            <w:r>
+              <w:t xml:space="preserve">Push Message (POST)</w:t>
+            </w:r>
+          </w:p>
+        </w:tc>
+      </w:tr>
+      <w:tr>
+        <w:tc>
+          <w:tcPr/>
+          <w:p>
+            <w:pPr>
+              <w:pStyle w:val="Compact"/>
+              <w:jc w:val="left"/>
+            </w:pPr>
+            <w:r>
+              <w:t xml:space="preserve">5</w:t>
+            </w:r>
+          </w:p>
+        </w:tc>
+        <w:tc>
+          <w:tcPr/>
+          <w:p>
+            <w:pPr>
+              <w:pStyle w:val="Compact"/>
+              <w:jc w:val="left"/>
+            </w:pPr>
+            <w:r>
+              <w:rPr>
+                <w:rStyle w:val="VerbatimChar"/>
+              </w:rPr>
+              <w:t xml:space="preserve">MODIFY zmm_asrs FROM TABLE gt_asrs</w:t>
+            </w:r>
+            <w:r>
+              <w:t xml:space="preserve"> </w:t>
+            </w:r>
+            <w:r>
+              <w:t xml:space="preserve">(trf_status =</w:t>
+            </w:r>
+            <w:r>
+              <w:t xml:space="preserve"> </w:t>
+            </w:r>
+            <w:r>
+              <w:t xml:space="preserve">‘</w:t>
+            </w:r>
+            <w:r>
+              <w:t xml:space="preserve">Y</w:t>
+            </w:r>
+            <w:r>
+              <w:t xml:space="preserve">’</w:t>
+            </w:r>
+            <w:r>
+              <w:t xml:space="preserve">)</w:t>
+            </w:r>
+          </w:p>
+        </w:tc>
+        <w:tc>
+          <w:tcPr/>
+          <w:p>
+            <w:pPr>
+              <w:pStyle w:val="Compact"/>
+              <w:jc w:val="left"/>
+            </w:pPr>
+            <w:r>
+              <w:t xml:space="preserve">Keep</w:t>
+            </w:r>
+          </w:p>
+        </w:tc>
+        <w:tc>
+          <w:tcPr/>
+          <w:p>
+            <w:pPr>
+              <w:pStyle w:val="Compact"/>
+              <w:jc w:val="left"/>
+            </w:pPr>
+            <w:r>
+              <w:t xml:space="preserve">—</w:t>
+            </w:r>
+          </w:p>
+        </w:tc>
+      </w:tr>
+    </w:tbl>
+    <w:bookmarkEnd w:id="48"/>
+    <w:bookmarkStart w:id="49" w:name="a.2-zmm_asrs_sap_interface"/>
+    <w:p>
+      <w:pPr>
+        <w:pStyle w:val="Heading2"/>
+      </w:pPr>
+      <w:r>
+        <w:t xml:space="preserve">A.2 ZMM_ASRS_SAP_INTERFACE</w:t>
+      </w:r>
+    </w:p>
+    <w:tbl>
+      <w:tblPr>
+        <w:tblStyle w:val="Table"/>
+        <w:tblW w:type="pct" w:w="5000"/>
+        <w:tblLook w:firstRow="1" w:lastRow="0" w:firstColumn="0" w:lastColumn="0" w:noHBand="0" w:noVBand="0" w:val="0020"/>
+        <w:jc w:val="start"/>
+      </w:tblPr>
+      <w:tblGrid>
+        <w:gridCol w:w="1980"/>
+        <w:gridCol w:w="1980"/>
+        <w:gridCol w:w="1980"/>
+        <w:gridCol w:w="1980"/>
+      </w:tblGrid>
+      <w:tr>
+        <w:trPr>
+          <w:tblHeader w:val="true"/>
+        </w:trPr>
+        <w:tc>
+          <w:tcPr/>
+          <w:p>
+            <w:pPr>
+              <w:pStyle w:val="Compact"/>
+              <w:jc w:val="left"/>
+            </w:pPr>
+            <w:r>
+              <w:t xml:space="preserve">#</w:t>
+            </w:r>
+          </w:p>
+        </w:tc>
+        <w:tc>
+          <w:tcPr/>
+          <w:p>
+            <w:pPr>
+              <w:pStyle w:val="Compact"/>
+              <w:jc w:val="left"/>
+            </w:pPr>
+            <w:r>
+              <w:t xml:space="preserve">SQL statement</w:t>
+            </w:r>
+          </w:p>
+        </w:tc>
+        <w:tc>
+          <w:tcPr/>
+          <w:p>
+            <w:pPr>
+              <w:pStyle w:val="Compact"/>
+              <w:jc w:val="left"/>
+            </w:pPr>
+            <w:r>
+              <w:t xml:space="preserve">Action</w:t>
+            </w:r>
+          </w:p>
+        </w:tc>
+        <w:tc>
+          <w:tcPr/>
+          <w:p>
+            <w:pPr>
+              <w:pStyle w:val="Compact"/>
+              <w:jc w:val="left"/>
+            </w:pPr>
+            <w:r>
+              <w:t xml:space="preserve">Interface</w:t>
+            </w:r>
+          </w:p>
+        </w:tc>
+      </w:tr>
+      <w:tr>
+        <w:tc>
+          <w:tcPr/>
+          <w:p>
+            <w:pPr>
+              <w:pStyle w:val="Compact"/>
+              <w:jc w:val="left"/>
+            </w:pPr>
+            <w:r>
+              <w:t xml:space="preserve">1</w:t>
+            </w:r>
+          </w:p>
+        </w:tc>
+        <w:tc>
+          <w:tcPr/>
+          <w:p>
+            <w:pPr>
+              <w:pStyle w:val="Compact"/>
+              <w:jc w:val="left"/>
+            </w:pPr>
+            <w:r>
+              <w:rPr>
+                <w:rStyle w:val="VerbatimChar"/>
+              </w:rPr>
+              <w:t xml:space="preserve">SELECT … FROM zmm_asrs … WHERE msg_dt_def IN p_date AND plant = s_werks</w:t>
+            </w:r>
+          </w:p>
+        </w:tc>
+        <w:tc>
+          <w:tcPr/>
+          <w:p>
+            <w:pPr>
+              <w:pStyle w:val="Compact"/>
+              <w:jc w:val="left"/>
+            </w:pPr>
+            <w:r>
+              <w:t xml:space="preserve">Keep</w:t>
+            </w:r>
+          </w:p>
+        </w:tc>
+        <w:tc>
+          <w:tcPr/>
+          <w:p>
+            <w:pPr>
+              <w:pStyle w:val="Compact"/>
+              <w:jc w:val="left"/>
+            </w:pPr>
+            <w:r>
+              <w:t xml:space="preserve">—</w:t>
+            </w:r>
+          </w:p>
+        </w:tc>
+      </w:tr>
+      <w:tr>
+        <w:tc>
+          <w:tcPr/>
+          <w:p>
+            <w:pPr>
+              <w:pStyle w:val="Compact"/>
+              <w:jc w:val="left"/>
+            </w:pPr>
+            <w:r>
+              <w:t xml:space="preserve">2</w:t>
+            </w:r>
+          </w:p>
+        </w:tc>
+        <w:tc>
+          <w:tcPr/>
+          <w:p>
+            <w:pPr>
+              <w:pStyle w:val="Compact"/>
+              <w:jc w:val="left"/>
+            </w:pPr>
+            <w:r>
+              <w:rPr>
+                <w:rStyle w:val="VerbatimChar"/>
+              </w:rPr>
+              <w:t xml:space="preserve">SELECT * FROM zmm_dbcon_asrs WHERE werks = s_werks</w:t>
+            </w:r>
+          </w:p>
+        </w:tc>
+        <w:tc>
+          <w:tcPr/>
+          <w:p>
+            <w:pPr>
+              <w:pStyle w:val="Compact"/>
+              <w:jc w:val="left"/>
+            </w:pPr>
+            <w:r>
+              <w:t xml:space="preserve">Keep</w:t>
+            </w:r>
+          </w:p>
+        </w:tc>
+        <w:tc>
+          <w:tcPr/>
+          <w:p>
+            <w:pPr>
+              <w:pStyle w:val="Compact"/>
+              <w:jc w:val="left"/>
+            </w:pPr>
+            <w:r>
+              <w:t xml:space="preserve">—</w:t>
+            </w:r>
+          </w:p>
+        </w:tc>
+      </w:tr>
+      <w:tr>
+        <w:tc>
+          <w:tcPr/>
+          <w:p>
+            <w:pPr>
+              <w:pStyle w:val="Compact"/>
+              <w:jc w:val="left"/>
+            </w:pPr>
+            <w:r>
+              <w:t xml:space="preserve">3</w:t>
+            </w:r>
+          </w:p>
+        </w:tc>
+        <w:tc>
+          <w:tcPr/>
+          <w:p>
+            <w:pPr>
+              <w:pStyle w:val="Compact"/>
+              <w:jc w:val="left"/>
+            </w:pPr>
+            <w:r>
+              <w:rPr>
+                <w:rStyle w:val="VerbatimChar"/>
+              </w:rPr>
+              <w:t xml:space="preserve">EXEC SQL CONNECT / SET / DISCONNECT :dbcon</w:t>
+            </w:r>
+          </w:p>
+        </w:tc>
+        <w:tc>
+          <w:tcPr/>
+          <w:p>
+            <w:pPr>
+              <w:pStyle w:val="Compact"/>
+              <w:jc w:val="left"/>
+            </w:pPr>
+            <w:r>
+              <w:t xml:space="preserve">Replace</w:t>
+            </w:r>
+          </w:p>
+        </w:tc>
+        <w:tc>
+          <w:tcPr/>
+          <w:p>
+            <w:pPr>
+              <w:pStyle w:val="Compact"/>
+              <w:jc w:val="left"/>
+            </w:pPr>
+            <w:r>
+              <w:t xml:space="preserve">(destination)</w:t>
+            </w:r>
+          </w:p>
+        </w:tc>
+      </w:tr>
+      <w:tr>
+        <w:tc>
+          <w:tcPr/>
+          <w:p>
+            <w:pPr>
+              <w:pStyle w:val="Compact"/>
+              <w:jc w:val="left"/>
+            </w:pPr>
+            <w:r>
+              <w:t xml:space="preserve">4</w:t>
+            </w:r>
+          </w:p>
+        </w:tc>
+        <w:tc>
+          <w:tcPr/>
+          <w:p>
+            <w:pPr>
+              <w:pStyle w:val="Compact"/>
+              <w:jc w:val="left"/>
+            </w:pPr>
+            <w:r>
+              <w:rPr>
+                <w:rStyle w:val="VerbatimChar"/>
+              </w:rPr>
+              <w:t xml:space="preserve">EXEC SQL OPEN dbcur FOR SELECT MSG_ERR, MSG_STAT FROM host_to_wms …</w:t>
+            </w:r>
+            <w:r>
+              <w:t xml:space="preserve"> </w:t>
+            </w:r>
+            <w:r>
+              <w:t xml:space="preserve">→</w:t>
+            </w:r>
+            <w:r>
+              <w:t xml:space="preserve"> </w:t>
+            </w:r>
+            <w:r>
+              <w:rPr>
+                <w:rStyle w:val="VerbatimChar"/>
+              </w:rPr>
+              <w:t xml:space="preserve">FETCH</w:t>
+            </w:r>
+            <w:r>
+              <w:t xml:space="preserve"> </w:t>
+            </w:r>
+            <w:r>
+              <w:t xml:space="preserve">→</w:t>
+            </w:r>
+            <w:r>
+              <w:t xml:space="preserve"> </w:t>
+            </w:r>
+            <w:r>
+              <w:rPr>
+                <w:rStyle w:val="VerbatimChar"/>
+              </w:rPr>
+              <w:t xml:space="preserve">CLOSE</w:t>
+            </w:r>
+          </w:p>
+        </w:tc>
+        <w:tc>
+          <w:tcPr/>
+          <w:p>
+            <w:pPr>
+              <w:pStyle w:val="Compact"/>
+              <w:jc w:val="left"/>
+            </w:pPr>
+            <w:r>
+              <w:rPr>
+                <w:bCs/>
+                <w:b/>
+              </w:rPr>
+              <w:t xml:space="preserve">Replace</w:t>
+            </w:r>
+          </w:p>
+        </w:tc>
+        <w:tc>
+          <w:tcPr/>
+          <w:p>
+            <w:pPr>
+              <w:pStyle w:val="Compact"/>
+              <w:jc w:val="left"/>
+            </w:pPr>
+            <w:r>
+              <w:rPr>
+                <w:bCs/>
+                <w:b/>
+              </w:rPr>
+              <w:t xml:space="preserve">C-2</w:t>
+            </w:r>
+            <w:r>
+              <w:t xml:space="preserve"> </w:t>
+            </w:r>
+            <w:r>
+              <w:t xml:space="preserve">Get Status (GET)</w:t>
+            </w:r>
+          </w:p>
+        </w:tc>
+      </w:tr>
+    </w:tbl>
+    <w:bookmarkEnd w:id="49"/>
+    <w:bookmarkStart w:id="50" w:name="a.3-zmdm_ra_trackwise"/>
+    <w:p>
+      <w:pPr>
+        <w:pStyle w:val="Heading2"/>
+      </w:pPr>
+      <w:r>
+        <w:t xml:space="preserve">A.3 ZMDM_RA_TRACKWISE</w:t>
+      </w:r>
+    </w:p>
+    <w:tbl>
+      <w:tblPr>
+        <w:tblStyle w:val="Table"/>
+        <w:tblW w:type="pct" w:w="5000"/>
+        <w:tblLook w:firstRow="1" w:lastRow="0" w:firstColumn="0" w:lastColumn="0" w:noHBand="0" w:noVBand="0" w:val="0020"/>
+        <w:jc w:val="start"/>
+      </w:tblPr>
+      <w:tblGrid>
+        <w:gridCol w:w="1980"/>
+        <w:gridCol w:w="1980"/>
+        <w:gridCol w:w="1980"/>
+        <w:gridCol w:w="1980"/>
+      </w:tblGrid>
+      <w:tr>
+        <w:trPr>
+          <w:tblHeader w:val="true"/>
+        </w:trPr>
+        <w:tc>
+          <w:tcPr/>
+          <w:p>
+            <w:pPr>
+              <w:pStyle w:val="Compact"/>
+              <w:jc w:val="left"/>
+            </w:pPr>
+            <w:r>
+              <w:t xml:space="preserve">#</w:t>
+            </w:r>
+          </w:p>
+        </w:tc>
+        <w:tc>
+          <w:tcPr/>
+          <w:p>
+            <w:pPr>
+              <w:pStyle w:val="Compact"/>
+              <w:jc w:val="left"/>
+            </w:pPr>
+            <w:r>
+              <w:t xml:space="preserve">SQL statement</w:t>
+            </w:r>
+          </w:p>
+        </w:tc>
+        <w:tc>
+          <w:tcPr/>
+          <w:p>
+            <w:pPr>
+              <w:pStyle w:val="Compact"/>
+              <w:jc w:val="left"/>
+            </w:pPr>
+            <w:r>
+              <w:t xml:space="preserve">Action</w:t>
+            </w:r>
+          </w:p>
+        </w:tc>
+        <w:tc>
+          <w:tcPr/>
+          <w:p>
+            <w:pPr>
+              <w:pStyle w:val="Compact"/>
+              <w:jc w:val="left"/>
+            </w:pPr>
+            <w:r>
+              <w:t xml:space="preserve">Interface</w:t>
+            </w:r>
+          </w:p>
+        </w:tc>
+      </w:tr>
+      <w:tr>
+        <w:tc>
+          <w:tcPr/>
+          <w:p>
+            <w:pPr>
+              <w:pStyle w:val="Compact"/>
+              <w:jc w:val="left"/>
+            </w:pPr>
+            <w:r>
+              <w:t xml:space="preserve">1</w:t>
+            </w:r>
+          </w:p>
+        </w:tc>
+        <w:tc>
+          <w:tcPr/>
+          <w:p>
+            <w:pPr>
+              <w:pStyle w:val="Compact"/>
+              <w:jc w:val="left"/>
+            </w:pPr>
+            <w:r>
+              <w:rPr>
+                <w:rStyle w:val="VerbatimChar"/>
+              </w:rPr>
+              <w:t xml:space="preserve">SELECT * FROM zcon_mdm … WHERE mandt = sy-mandt</w:t>
+            </w:r>
+          </w:p>
+        </w:tc>
+        <w:tc>
+          <w:tcPr/>
+          <w:p>
+            <w:pPr>
+              <w:pStyle w:val="Compact"/>
+              <w:jc w:val="left"/>
+            </w:pPr>
+            <w:r>
+              <w:t xml:space="preserve">Keep</w:t>
+            </w:r>
+          </w:p>
+        </w:tc>
+        <w:tc>
+          <w:tcPr/>
+          <w:p>
+            <w:pPr>
+              <w:pStyle w:val="Compact"/>
+              <w:jc w:val="left"/>
+            </w:pPr>
+            <w:r>
+              <w:t xml:space="preserve">—</w:t>
+            </w:r>
+          </w:p>
+        </w:tc>
+      </w:tr>
+      <w:tr>
+        <w:tc>
+          <w:tcPr/>
+          <w:p>
+            <w:pPr>
+              <w:pStyle w:val="Compact"/>
+              <w:jc w:val="left"/>
+            </w:pPr>
+            <w:r>
+              <w:t xml:space="preserve">2</w:t>
+            </w:r>
+          </w:p>
+        </w:tc>
+        <w:tc>
+          <w:tcPr/>
+          <w:p>
+            <w:pPr>
+              <w:pStyle w:val="Compact"/>
+              <w:jc w:val="left"/>
+            </w:pPr>
+            <w:r>
+              <w:rPr>
+                <w:rStyle w:val="VerbatimChar"/>
+              </w:rPr>
+              <w:t xml:space="preserve">SELECT field1 FROM zmm_param … WHERE param_type = 'ZZ9'</w:t>
+            </w:r>
+          </w:p>
+        </w:tc>
+        <w:tc>
+          <w:tcPr/>
+          <w:p>
+            <w:pPr>
+              <w:pStyle w:val="Compact"/>
+              <w:jc w:val="left"/>
+            </w:pPr>
+            <w:r>
+              <w:t xml:space="preserve">Keep</w:t>
+            </w:r>
+          </w:p>
+        </w:tc>
+        <w:tc>
+          <w:tcPr/>
+          <w:p>
+            <w:pPr>
+              <w:pStyle w:val="Compact"/>
+              <w:jc w:val="left"/>
+            </w:pPr>
+            <w:r>
+              <w:t xml:space="preserve">—</w:t>
+            </w:r>
+          </w:p>
+        </w:tc>
+      </w:tr>
+      <w:tr>
+        <w:tc>
+          <w:tcPr/>
+          <w:p>
+            <w:pPr>
+              <w:pStyle w:val="Compact"/>
+              <w:jc w:val="left"/>
+            </w:pPr>
+            <w:r>
+              <w:t xml:space="preserve">3</w:t>
+            </w:r>
+          </w:p>
+        </w:tc>
+        <w:tc>
+          <w:tcPr/>
+          <w:p>
+            <w:pPr>
+              <w:pStyle w:val="Compact"/>
+              <w:jc w:val="left"/>
+            </w:pPr>
+            <w:r>
+              <w:rPr>
+                <w:rStyle w:val="VerbatimChar"/>
+              </w:rPr>
+              <w:t xml:space="preserve">SELECT * FROM mara WHERE ersda IN s_ersda AND mtart = 'ZAPI' AND mstae NOT IN (g_field1)</w:t>
+            </w:r>
+          </w:p>
+        </w:tc>
+        <w:tc>
+          <w:tcPr/>
+          <w:p>
+            <w:pPr>
+              <w:pStyle w:val="Compact"/>
+              <w:jc w:val="left"/>
+            </w:pPr>
+            <w:r>
+              <w:t xml:space="preserve">Keep</w:t>
+            </w:r>
+          </w:p>
+        </w:tc>
+        <w:tc>
+          <w:tcPr/>
+          <w:p>
+            <w:pPr>
+              <w:pStyle w:val="Compact"/>
+              <w:jc w:val="left"/>
+            </w:pPr>
+            <w:r>
+              <w:t xml:space="preserve">—</w:t>
+            </w:r>
+          </w:p>
+        </w:tc>
+      </w:tr>
+      <w:tr>
+        <w:tc>
+          <w:tcPr/>
+          <w:p>
+            <w:pPr>
+              <w:pStyle w:val="Compact"/>
+              <w:jc w:val="left"/>
+            </w:pPr>
+            <w:r>
+              <w:t xml:space="preserve">4</w:t>
+            </w:r>
+          </w:p>
+        </w:tc>
+        <w:tc>
+          <w:tcPr/>
+          <w:p>
+            <w:pPr>
+              <w:pStyle w:val="Compact"/>
+              <w:jc w:val="left"/>
+            </w:pPr>
+            <w:r>
+              <w:rPr>
+                <w:rStyle w:val="VerbatimChar"/>
+              </w:rPr>
+              <w:t xml:space="preserve">EXEC SQL CONNECT / GET / SET / DISCONNECT :dbcon</w:t>
+            </w:r>
+          </w:p>
+        </w:tc>
+        <w:tc>
+          <w:tcPr/>
+          <w:p>
+            <w:pPr>
+              <w:pStyle w:val="Compact"/>
+              <w:jc w:val="left"/>
+            </w:pPr>
+            <w:r>
+              <w:t xml:space="preserve">Replace</w:t>
+            </w:r>
+          </w:p>
+        </w:tc>
+        <w:tc>
+          <w:tcPr/>
+          <w:p>
+            <w:pPr>
+              <w:pStyle w:val="Compact"/>
+              <w:jc w:val="left"/>
+            </w:pPr>
+            <w:r>
+              <w:t xml:space="preserve">(destination)</w:t>
+            </w:r>
+          </w:p>
+        </w:tc>
+      </w:tr>
+      <w:tr>
+        <w:tc>
+          <w:tcPr/>
+          <w:p>
+            <w:pPr>
+              <w:pStyle w:val="Compact"/>
+              <w:jc w:val="left"/>
+            </w:pPr>
+            <w:r>
+              <w:t xml:space="preserve">5</w:t>
+            </w:r>
+          </w:p>
+        </w:tc>
+        <w:tc>
+          <w:tcPr/>
+          <w:p>
+            <w:pPr>
+              <w:pStyle w:val="Compact"/>
+              <w:jc w:val="left"/>
+            </w:pPr>
+            <w:r>
+              <w:rPr>
+                <w:rStyle w:val="VerbatimChar"/>
+              </w:rPr>
+              <w:t xml:space="preserve">EXEC SQL INSERT INTO mara (MATNR)</w:t>
+            </w:r>
+          </w:p>
+        </w:tc>
+        <w:tc>
+          <w:tcPr/>
+          <w:p>
+            <w:pPr>
+              <w:pStyle w:val="Compact"/>
+              <w:jc w:val="left"/>
+            </w:pPr>
+            <w:r>
+              <w:rPr>
+                <w:bCs/>
+                <w:b/>
+              </w:rPr>
+              <w:t xml:space="preserve">Replace</w:t>
+            </w:r>
+          </w:p>
+        </w:tc>
+        <w:tc>
+          <w:tcPr/>
+          <w:p>
+            <w:pPr>
+              <w:pStyle w:val="Compact"/>
+              <w:jc w:val="left"/>
+            </w:pPr>
+            <w:r>
+              <w:rPr>
+                <w:bCs/>
+                <w:b/>
+              </w:rPr>
+              <w:t xml:space="preserve">C-3</w:t>
+            </w:r>
+            <w:r>
+              <w:t xml:space="preserve"> </w:t>
+            </w:r>
+            <w:r>
+              <w:t xml:space="preserve">Push Material (POST)</w:t>
+            </w:r>
+          </w:p>
+        </w:tc>
+      </w:tr>
+    </w:tbl>
+    <w:bookmarkEnd w:id="50"/>
+    <w:bookmarkStart w:id="51" w:name="a.4-zqm_trackwise"/>
+    <w:p>
+      <w:pPr>
+        <w:pStyle w:val="Heading2"/>
+      </w:pPr>
+      <w:r>
+        <w:t xml:space="preserve">A.4 ZQM_TRACKWISE</w:t>
+      </w:r>
+    </w:p>
+    <w:tbl>
+      <w:tblPr>
+        <w:tblStyle w:val="Table"/>
+        <w:tblW w:type="pct" w:w="5000"/>
+        <w:tblLook w:firstRow="1" w:lastRow="0" w:firstColumn="0" w:lastColumn="0" w:noHBand="0" w:noVBand="0" w:val="0020"/>
+        <w:jc w:val="start"/>
+      </w:tblPr>
+      <w:tblGrid>
+        <w:gridCol w:w="1980"/>
+        <w:gridCol w:w="1980"/>
+        <w:gridCol w:w="1980"/>
+        <w:gridCol w:w="1980"/>
+      </w:tblGrid>
+      <w:tr>
+        <w:trPr>
+          <w:tblHeader w:val="true"/>
+        </w:trPr>
+        <w:tc>
+          <w:tcPr/>
+          <w:p>
+            <w:pPr>
+              <w:pStyle w:val="Compact"/>
+              <w:jc w:val="left"/>
+            </w:pPr>
+            <w:r>
+              <w:t xml:space="preserve">#</w:t>
+            </w:r>
+          </w:p>
+        </w:tc>
+        <w:tc>
+          <w:tcPr/>
+          <w:p>
+            <w:pPr>
+              <w:pStyle w:val="Compact"/>
+              <w:jc w:val="left"/>
+            </w:pPr>
+            <w:r>
+              <w:t xml:space="preserve">SQL statement</w:t>
+            </w:r>
+          </w:p>
+        </w:tc>
+        <w:tc>
+          <w:tcPr/>
+          <w:p>
+            <w:pPr>
+              <w:pStyle w:val="Compact"/>
+              <w:jc w:val="left"/>
+            </w:pPr>
+            <w:r>
+              <w:t xml:space="preserve">Action</w:t>
+            </w:r>
+          </w:p>
+        </w:tc>
+        <w:tc>
+          <w:tcPr/>
+          <w:p>
+            <w:pPr>
+              <w:pStyle w:val="Compact"/>
+              <w:jc w:val="left"/>
+            </w:pPr>
+            <w:r>
+              <w:t xml:space="preserve">Interface</w:t>
+            </w:r>
+          </w:p>
+        </w:tc>
+      </w:tr>
+      <w:tr>
+        <w:tc>
+          <w:tcPr/>
+          <w:p>
+            <w:pPr>
+              <w:pStyle w:val="Compact"/>
+              <w:jc w:val="left"/>
+            </w:pPr>
+            <w:r>
+              <w:t xml:space="preserve">1</w:t>
+            </w:r>
+          </w:p>
+        </w:tc>
+        <w:tc>
+          <w:tcPr/>
+          <w:p>
+            <w:pPr>
+              <w:pStyle w:val="Compact"/>
+              <w:jc w:val="left"/>
+            </w:pPr>
+            <w:r>
+              <w:rPr>
+                <w:rStyle w:val="VerbatimChar"/>
+              </w:rPr>
+              <w:t xml:space="preserve">SELECT * FROM zcon_mdm …</w:t>
+            </w:r>
+            <w:r>
+              <w:t xml:space="preserve"> </w:t>
+            </w:r>
+            <w:r>
+              <w:t xml:space="preserve">(twice, L71 &amp; L266)</w:t>
+            </w:r>
+          </w:p>
+        </w:tc>
+        <w:tc>
+          <w:tcPr/>
+          <w:p>
+            <w:pPr>
+              <w:pStyle w:val="Compact"/>
+              <w:jc w:val="left"/>
+            </w:pPr>
+            <w:r>
+              <w:t xml:space="preserve">Keep</w:t>
+            </w:r>
+          </w:p>
+        </w:tc>
+        <w:tc>
+          <w:tcPr/>
+          <w:p>
+            <w:pPr>
+              <w:pStyle w:val="Compact"/>
+              <w:jc w:val="left"/>
+            </w:pPr>
+            <w:r>
+              <w:t xml:space="preserve">—</w:t>
+            </w:r>
+          </w:p>
+        </w:tc>
+      </w:tr>
+      <w:tr>
+        <w:tc>
+          <w:tcPr/>
+          <w:p>
+            <w:pPr>
+              <w:pStyle w:val="Compact"/>
+              <w:jc w:val="left"/>
+            </w:pPr>
+            <w:r>
+              <w:t xml:space="preserve">2</w:t>
+            </w:r>
+          </w:p>
+        </w:tc>
+        <w:tc>
+          <w:tcPr/>
+          <w:p>
+            <w:pPr>
+              <w:pStyle w:val="Compact"/>
+              <w:jc w:val="left"/>
+            </w:pPr>
+            <w:r>
+              <w:rPr>
+                <w:rStyle w:val="VerbatimChar"/>
+              </w:rPr>
+              <w:t xml:space="preserve">SELECT SINGLE name1 FROM t001w WHERE werks = …</w:t>
+            </w:r>
+          </w:p>
+        </w:tc>
+        <w:tc>
+          <w:tcPr/>
+          <w:p>
+            <w:pPr>
+              <w:pStyle w:val="Compact"/>
+              <w:jc w:val="left"/>
+            </w:pPr>
+            <w:r>
+              <w:t xml:space="preserve">Keep</w:t>
+            </w:r>
+          </w:p>
+        </w:tc>
+        <w:tc>
+          <w:tcPr/>
+          <w:p>
+            <w:pPr>
+              <w:pStyle w:val="Compact"/>
+              <w:jc w:val="left"/>
+            </w:pPr>
+            <w:r>
+              <w:t xml:space="preserve">—</w:t>
+            </w:r>
+          </w:p>
+        </w:tc>
+      </w:tr>
+      <w:tr>
+        <w:tc>
+          <w:tcPr/>
+          <w:p>
+            <w:pPr>
+              <w:pStyle w:val="Compact"/>
+              <w:jc w:val="left"/>
+            </w:pPr>
+            <w:r>
+              <w:t xml:space="preserve">3</w:t>
+            </w:r>
+          </w:p>
+        </w:tc>
+        <w:tc>
+          <w:tcPr/>
+          <w:p>
+            <w:pPr>
+              <w:pStyle w:val="Compact"/>
+              <w:jc w:val="left"/>
+            </w:pPr>
+            <w:r>
+              <w:rPr>
+                <w:rStyle w:val="VerbatimChar"/>
+              </w:rPr>
+              <w:t xml:space="preserve">INSERT ztw_prod_det FROM TABLE gt_prod_det</w:t>
+            </w:r>
+            <w:r>
+              <w:t xml:space="preserve"> </w:t>
+            </w:r>
+            <w:r>
+              <w:t xml:space="preserve">(SAP mirror)</w:t>
+            </w:r>
+          </w:p>
+        </w:tc>
+        <w:tc>
+          <w:tcPr/>
+          <w:p>
+            <w:pPr>
+              <w:pStyle w:val="Compact"/>
+              <w:jc w:val="left"/>
+            </w:pPr>
+            <w:r>
+              <w:t xml:space="preserve">Keep</w:t>
+            </w:r>
+          </w:p>
+        </w:tc>
+        <w:tc>
+          <w:tcPr/>
+          <w:p>
+            <w:pPr>
+              <w:pStyle w:val="Compact"/>
+              <w:jc w:val="left"/>
+            </w:pPr>
+            <w:r>
+              <w:t xml:space="preserve">—</w:t>
+            </w:r>
+          </w:p>
+        </w:tc>
+      </w:tr>
+      <w:tr>
+        <w:tc>
+          <w:tcPr/>
+          <w:p>
+            <w:pPr>
+              <w:pStyle w:val="Compact"/>
+              <w:jc w:val="left"/>
+            </w:pPr>
+            <w:r>
+              <w:t xml:space="preserve">4</w:t>
+            </w:r>
+          </w:p>
+        </w:tc>
+        <w:tc>
+          <w:tcPr/>
+          <w:p>
+            <w:pPr>
+              <w:pStyle w:val="Compact"/>
+              <w:jc w:val="left"/>
+            </w:pPr>
+            <w:r>
+              <w:rPr>
+                <w:rStyle w:val="VerbatimChar"/>
+              </w:rPr>
+              <w:t xml:space="preserve">INSERT ztw_mat_det FROM TABLE gt_mat_det</w:t>
+            </w:r>
+            <w:r>
+              <w:t xml:space="preserve"> </w:t>
+            </w:r>
+            <w:r>
+              <w:t xml:space="preserve">(SAP mirror)</w:t>
+            </w:r>
+          </w:p>
+        </w:tc>
+        <w:tc>
+          <w:tcPr/>
+          <w:p>
+            <w:pPr>
+              <w:pStyle w:val="Compact"/>
+              <w:jc w:val="left"/>
+            </w:pPr>
+            <w:r>
+              <w:t xml:space="preserve">Keep</w:t>
+            </w:r>
+          </w:p>
+        </w:tc>
+        <w:tc>
+          <w:tcPr/>
+          <w:p>
+            <w:pPr>
+              <w:pStyle w:val="Compact"/>
+              <w:jc w:val="left"/>
+            </w:pPr>
+            <w:r>
+              <w:t xml:space="preserve">—</w:t>
+            </w:r>
+          </w:p>
+        </w:tc>
+      </w:tr>
+      <w:tr>
+        <w:tc>
+          <w:tcPr/>
+          <w:p>
+            <w:pPr>
+              <w:pStyle w:val="Compact"/>
+              <w:jc w:val="left"/>
+            </w:pPr>
+            <w:r>
+              <w:t xml:space="preserve">5</w:t>
+            </w:r>
+          </w:p>
+        </w:tc>
+        <w:tc>
+          <w:tcPr/>
+          <w:p>
+            <w:pPr>
+              <w:pStyle w:val="Compact"/>
+              <w:jc w:val="left"/>
+            </w:pPr>
+            <w:r>
+              <w:rPr>
+                <w:rStyle w:val="VerbatimChar"/>
+              </w:rPr>
+              <w:t xml:space="preserve">EXEC SQL CONNECT / SET / GET / DISCONNECT :dbcon</w:t>
+            </w:r>
+            <w:r>
+              <w:t xml:space="preserve"> </w:t>
+            </w:r>
+            <w:r>
+              <w:t xml:space="preserve">(15 ops)</w:t>
+            </w:r>
+          </w:p>
+        </w:tc>
+        <w:tc>
+          <w:tcPr/>
+          <w:p>
+            <w:pPr>
+              <w:pStyle w:val="Compact"/>
+              <w:jc w:val="left"/>
+            </w:pPr>
+            <w:r>
+              <w:t xml:space="preserve">Replace</w:t>
+            </w:r>
+          </w:p>
+        </w:tc>
+        <w:tc>
+          <w:tcPr/>
+          <w:p>
+            <w:pPr>
+              <w:pStyle w:val="Compact"/>
+              <w:jc w:val="left"/>
+            </w:pPr>
+            <w:r>
+              <w:t xml:space="preserve">(destination)</w:t>
+            </w:r>
+          </w:p>
+        </w:tc>
+      </w:tr>
+      <w:tr>
+        <w:tc>
+          <w:tcPr/>
+          <w:p>
+            <w:pPr>
+              <w:pStyle w:val="Compact"/>
+              <w:jc w:val="left"/>
+            </w:pPr>
+            <w:r>
+              <w:t xml:space="preserve">6</w:t>
+            </w:r>
+          </w:p>
+        </w:tc>
+        <w:tc>
+          <w:tcPr/>
+          <w:p>
+            <w:pPr>
+              <w:pStyle w:val="Compact"/>
+              <w:jc w:val="left"/>
+            </w:pPr>
+            <w:r>
+              <w:rPr>
+                <w:rStyle w:val="VerbatimChar"/>
+              </w:rPr>
+              <w:t xml:space="preserve">EXEC SQL INSERT INTO ZTW_MAT_DET ( 20 cols )</w:t>
+            </w:r>
+            <w:r>
+              <w:t xml:space="preserve"> </w:t>
+            </w:r>
+            <w:r>
+              <w:t xml:space="preserve">(twice, L132 &amp; L183)</w:t>
+            </w:r>
+          </w:p>
+        </w:tc>
+        <w:tc>
+          <w:tcPr/>
+          <w:p>
+            <w:pPr>
+              <w:pStyle w:val="Compact"/>
+              <w:jc w:val="left"/>
+            </w:pPr>
+            <w:r>
+              <w:rPr>
+                <w:bCs/>
+                <w:b/>
+              </w:rPr>
+              <w:t xml:space="preserve">Replace</w:t>
+            </w:r>
+          </w:p>
+        </w:tc>
+        <w:tc>
+          <w:tcPr/>
+          <w:p>
+            <w:pPr>
+              <w:pStyle w:val="Compact"/>
+              <w:jc w:val="left"/>
+            </w:pPr>
+            <w:r>
+              <w:rPr>
+                <w:bCs/>
+                <w:b/>
+              </w:rPr>
+              <w:t xml:space="preserve">C-4</w:t>
+            </w:r>
+            <w:r>
+              <w:t xml:space="preserve"> </w:t>
+            </w:r>
+            <w:r>
+              <w:t xml:space="preserve">Push Material Detail (POST)</w:t>
+            </w:r>
+          </w:p>
+        </w:tc>
+      </w:tr>
+      <w:tr>
+        <w:tc>
+          <w:tcPr/>
+          <w:p>
+            <w:pPr>
+              <w:pStyle w:val="Compact"/>
+              <w:jc w:val="left"/>
+            </w:pPr>
+            <w:r>
+              <w:t xml:space="preserve">7</w:t>
+            </w:r>
+          </w:p>
+        </w:tc>
+        <w:tc>
+          <w:tcPr/>
+          <w:p>
+            <w:pPr>
+              <w:pStyle w:val="Compact"/>
+              <w:jc w:val="left"/>
+            </w:pPr>
+            <w:r>
+              <w:rPr>
+                <w:rStyle w:val="VerbatimChar"/>
+              </w:rPr>
+              <w:t xml:space="preserve">EXEC SQL SELECT Plant_Code, Plant_Name FROM ZTW_PLNT_DET WHERE Plant_Code = :gv_plant</w:t>
+            </w:r>
+          </w:p>
+        </w:tc>
+        <w:tc>
+          <w:tcPr/>
+          <w:p>
+            <w:pPr>
+              <w:pStyle w:val="Compact"/>
+              <w:jc w:val="left"/>
+            </w:pPr>
+            <w:r>
+              <w:rPr>
+                <w:bCs/>
+                <w:b/>
+              </w:rPr>
+              <w:t xml:space="preserve">Replace</w:t>
+            </w:r>
+          </w:p>
+        </w:tc>
+        <w:tc>
+          <w:tcPr/>
+          <w:p>
+            <w:pPr>
+              <w:pStyle w:val="Compact"/>
+              <w:jc w:val="left"/>
+            </w:pPr>
+            <w:r>
+              <w:rPr>
+                <w:bCs/>
+                <w:b/>
+              </w:rPr>
+              <w:t xml:space="preserve">C-5</w:t>
+            </w:r>
+            <w:r>
+              <w:t xml:space="preserve"> </w:t>
+            </w:r>
+            <w:r>
+              <w:t xml:space="preserve">Check Plant (GET)</w:t>
+            </w:r>
+          </w:p>
+        </w:tc>
+      </w:tr>
+      <w:tr>
+        <w:tc>
+          <w:tcPr/>
+          <w:p>
+            <w:pPr>
+              <w:pStyle w:val="Compact"/>
+              <w:jc w:val="left"/>
+            </w:pPr>
+            <w:r>
+              <w:t xml:space="preserve">8</w:t>
+            </w:r>
+          </w:p>
+        </w:tc>
+        <w:tc>
+          <w:tcPr/>
+          <w:p>
+            <w:pPr>
+              <w:pStyle w:val="Compact"/>
+              <w:jc w:val="left"/>
+            </w:pPr>
+            <w:r>
+              <w:rPr>
+                <w:rStyle w:val="VerbatimChar"/>
+              </w:rPr>
+              <w:t xml:space="preserve">EXEC SQL INSERT INTO ZTW_PLNT_DET (Plant_Code, Plant_Name)</w:t>
+            </w:r>
+          </w:p>
+        </w:tc>
+        <w:tc>
+          <w:tcPr/>
+          <w:p>
+            <w:pPr>
+              <w:pStyle w:val="Compact"/>
+              <w:jc w:val="left"/>
+            </w:pPr>
+            <w:r>
+              <w:rPr>
+                <w:bCs/>
+                <w:b/>
+              </w:rPr>
+              <w:t xml:space="preserve">Replace</w:t>
+            </w:r>
+          </w:p>
+        </w:tc>
+        <w:tc>
+          <w:tcPr/>
+          <w:p>
+            <w:pPr>
+              <w:pStyle w:val="Compact"/>
+              <w:jc w:val="left"/>
+            </w:pPr>
+            <w:r>
+              <w:rPr>
+                <w:bCs/>
+                <w:b/>
+              </w:rPr>
+              <w:t xml:space="preserve">C-6</w:t>
+            </w:r>
+            <w:r>
+              <w:t xml:space="preserve"> </w:t>
+            </w:r>
+            <w:r>
+              <w:t xml:space="preserve">Push Plant (POST)</w:t>
+            </w:r>
+          </w:p>
+        </w:tc>
+      </w:tr>
+      <w:tr>
+        <w:tc>
+          <w:tcPr/>
+          <w:p>
+            <w:pPr>
+              <w:pStyle w:val="Compact"/>
+              <w:jc w:val="left"/>
+            </w:pPr>
+            <w:r>
+              <w:t xml:space="preserve">9</w:t>
+            </w:r>
+          </w:p>
+        </w:tc>
+        <w:tc>
+          <w:tcPr/>
+          <w:p>
+            <w:pPr>
+              <w:pStyle w:val="Compact"/>
+              <w:jc w:val="left"/>
+            </w:pPr>
+            <w:r>
+              <w:rPr>
+                <w:rStyle w:val="VerbatimChar"/>
+              </w:rPr>
+              <w:t xml:space="preserve">EXEC SQL INSERT INTO ZTW_PROD_DET ( 15 cols )</w:t>
+            </w:r>
+            <w:r>
+              <w:t xml:space="preserve"> </w:t>
+            </w:r>
+            <w:r>
+              <w:t xml:space="preserve">(8 times, L411–L684)</w:t>
+            </w:r>
+          </w:p>
+        </w:tc>
+        <w:tc>
+          <w:tcPr/>
+          <w:p>
+            <w:pPr>
+              <w:pStyle w:val="Compact"/>
+              <w:jc w:val="left"/>
+            </w:pPr>
+            <w:r>
+              <w:rPr>
+                <w:bCs/>
+                <w:b/>
+              </w:rPr>
+              <w:t xml:space="preserve">Replace</w:t>
+            </w:r>
+          </w:p>
+        </w:tc>
+        <w:tc>
+          <w:tcPr/>
+          <w:p>
+            <w:pPr>
+              <w:pStyle w:val="Compact"/>
+              <w:jc w:val="left"/>
+            </w:pPr>
+            <w:r>
+              <w:rPr>
+                <w:bCs/>
+                <w:b/>
+              </w:rPr>
+              <w:t xml:space="preserve">C-7</w:t>
+            </w:r>
+            <w:r>
+              <w:t xml:space="preserve"> </w:t>
+            </w:r>
+            <w:r>
+              <w:t xml:space="preserve">Push Product Detail (POST)</w:t>
+            </w:r>
+          </w:p>
+        </w:tc>
+      </w:tr>
+    </w:tbl>
+    <w:p>
+      <w:pPr>
+        <w:pStyle w:val="BodyText"/>
+      </w:pPr>
+      <w:r>
+        <w:rPr>
+          <w:iCs/>
+          <w:i/>
+        </w:rPr>
+        <w:t xml:space="preserve">(C-5 + C-6 together = the single</w:t>
+      </w:r>
+      <w:r>
+        <w:rPr>
+          <w:iCs/>
+          <w:i/>
+        </w:rPr>
+        <w:t xml:space="preserve"> </w:t>
+      </w:r>
+      <w:r>
+        <w:rPr>
+          <w:iCs/>
+          <w:i/>
+        </w:rPr>
+        <w:t xml:space="preserve">“</w:t>
+      </w:r>
+      <w:r>
+        <w:rPr>
+          <w:iCs/>
+          <w:i/>
+        </w:rPr>
+        <w:t xml:space="preserve">Upsert Plant</w:t>
+      </w:r>
+      <w:r>
+        <w:rPr>
+          <w:iCs/>
+          <w:i/>
+        </w:rPr>
+        <w:t xml:space="preserve">”</w:t>
+      </w:r>
+      <w:r>
+        <w:rPr>
+          <w:iCs/>
+          <w:i/>
+        </w:rPr>
+        <w:t xml:space="preserve"> </w:t>
+      </w:r>
+      <w:r>
+        <w:rPr>
+          <w:iCs/>
+          <w:i/>
+        </w:rPr>
+        <w:t xml:space="preserve">operation from §8.2.)</w:t>
+      </w:r>
+    </w:p>
+    <w:bookmarkEnd w:id="51"/>
+    <w:bookmarkEnd w:id="52"/>
     <w:sectPr/>
     <w:pgMar w:top="1008" w:right="864" w:bottom="1008" w:left="864" w:header="504" w:footer="504" w:gutter="0"/>
   </w:body>

</xml_diff>